<commit_message>
Diagnóstico de Campo Grande/MS ajustado (28 fatores); exclusão da linha ODS mobilizados; matriz identificada como v1.0.2
Co-Authored-By: Claude Opus 5.5 <noreply@anthropic.com>
Claude-Session: https://claude.ai/code/session_01DaExKAnWXMvYMevoj2HpBX
</commit_message>
<xml_diff>
--- a/territorios/fontes/Diagnostico_Situacional_CampoGrande_MS_Matriz_v1.0.2.docx
+++ b/territorios/fontes/Diagnostico_Situacional_CampoGrande_MS_Matriz_v1.0.2.docx
@@ -147,12 +147,6 @@
         <w:gridCol w:w="5254"/>
       </w:tblGrid>
       <w:tr>
-        <w:tblPrEx>
-          <w:tblCellMar>
-            <w:top w:w="0" w:type="dxa"/>
-            <w:bottom w:w="0" w:type="dxa"/>
-          </w:tblCellMar>
-        </w:tblPrEx>
         <w:trPr>
           <w:tblHeader/>
         </w:trPr>
@@ -298,12 +292,6 @@
         </w:tc>
       </w:tr>
       <w:tr>
-        <w:tblPrEx>
-          <w:tblCellMar>
-            <w:top w:w="0" w:type="dxa"/>
-            <w:bottom w:w="0" w:type="dxa"/>
-          </w:tblCellMar>
-        </w:tblPrEx>
         <w:trPr>
           <w:cantSplit/>
         </w:trPr>
@@ -443,12 +431,6 @@
         </w:tc>
       </w:tr>
       <w:tr>
-        <w:tblPrEx>
-          <w:tblCellMar>
-            <w:top w:w="0" w:type="dxa"/>
-            <w:bottom w:w="0" w:type="dxa"/>
-          </w:tblCellMar>
-        </w:tblPrEx>
         <w:trPr>
           <w:cantSplit/>
         </w:trPr>
@@ -588,12 +570,6 @@
         </w:tc>
       </w:tr>
       <w:tr>
-        <w:tblPrEx>
-          <w:tblCellMar>
-            <w:top w:w="0" w:type="dxa"/>
-            <w:bottom w:w="0" w:type="dxa"/>
-          </w:tblCellMar>
-        </w:tblPrEx>
         <w:trPr>
           <w:cantSplit/>
         </w:trPr>
@@ -733,12 +709,6 @@
         </w:tc>
       </w:tr>
       <w:tr>
-        <w:tblPrEx>
-          <w:tblCellMar>
-            <w:top w:w="0" w:type="dxa"/>
-            <w:bottom w:w="0" w:type="dxa"/>
-          </w:tblCellMar>
-        </w:tblPrEx>
         <w:trPr>
           <w:cantSplit/>
         </w:trPr>
@@ -878,12 +848,6 @@
         </w:tc>
       </w:tr>
       <w:tr>
-        <w:tblPrEx>
-          <w:tblCellMar>
-            <w:top w:w="0" w:type="dxa"/>
-            <w:bottom w:w="0" w:type="dxa"/>
-          </w:tblCellMar>
-        </w:tblPrEx>
         <w:trPr>
           <w:cantSplit/>
         </w:trPr>
@@ -1023,12 +987,6 @@
         </w:tc>
       </w:tr>
       <w:tr>
-        <w:tblPrEx>
-          <w:tblCellMar>
-            <w:top w:w="0" w:type="dxa"/>
-            <w:bottom w:w="0" w:type="dxa"/>
-          </w:tblCellMar>
-        </w:tblPrEx>
         <w:trPr>
           <w:cantSplit/>
         </w:trPr>
@@ -1277,12 +1235,6 @@
         <w:gridCol w:w="9354"/>
       </w:tblGrid>
       <w:tr>
-        <w:tblPrEx>
-          <w:tblCellMar>
-            <w:top w:w="0" w:type="dxa"/>
-            <w:bottom w:w="0" w:type="dxa"/>
-          </w:tblCellMar>
-        </w:tblPrEx>
         <w:tc>
           <w:tcPr>
             <w:tcW w:w="9354" w:type="dxa"/>
@@ -1317,12 +1269,6 @@
         </w:tc>
       </w:tr>
       <w:tr>
-        <w:tblPrEx>
-          <w:tblCellMar>
-            <w:top w:w="0" w:type="dxa"/>
-            <w:bottom w:w="0" w:type="dxa"/>
-          </w:tblCellMar>
-        </w:tblPrEx>
         <w:tc>
           <w:tcPr>
             <w:tcW w:w="9354" w:type="dxa"/>
@@ -1397,12 +1343,6 @@
         <w:gridCol w:w="1300"/>
       </w:tblGrid>
       <w:tr>
-        <w:tblPrEx>
-          <w:tblCellMar>
-            <w:top w:w="0" w:type="dxa"/>
-            <w:bottom w:w="0" w:type="dxa"/>
-          </w:tblCellMar>
-        </w:tblPrEx>
         <w:trPr>
           <w:cantSplit/>
         </w:trPr>
@@ -1573,12 +1513,6 @@
         <w:gridCol w:w="1300"/>
       </w:tblGrid>
       <w:tr>
-        <w:tblPrEx>
-          <w:tblCellMar>
-            <w:top w:w="0" w:type="dxa"/>
-            <w:bottom w:w="0" w:type="dxa"/>
-          </w:tblCellMar>
-        </w:tblPrEx>
         <w:trPr>
           <w:cantSplit/>
         </w:trPr>
@@ -1731,7 +1665,7 @@
       </w:r>
       <w:proofErr w:type="spellEnd"/>
       <w:r>
-        <w:t>), e a concentração da massa salarial nas faixas mais altas indicam que o preço dos alimentos pesa desproporcionalmente sobre as famílias inscritas no CadÚnico. A ausência de inquérito municipal de segurança alimentar com a Escala Brasileira de Insegurança Alimentar constitui lacuna de informação: os dados disponíveis são estaduais (PNAD Contínua, módulo de segurança alimentar) e não permitem identificar os territórios mais afetados. O fator relaciona-se a E1-F06 e E1-F24 e tem como desfecho sanitário E2-F02, devendo o plano popular priorizar a produção de dados intraurbanos por meio do SISVAN e do Cadastro Único.</w:t>
+        <w:t>), e a concentração da massa salarial nas faixas mais altas indicam que o preço dos alimentos pesa desproporcionalmente sobre as famílias inscritas no CadÚnico. O fator relaciona-se a E1-F06 e E1-F24 e tem como desfecho sanitário E2-F02, devendo o plano popular priorizar a produção de dados intraurbanos por meio do SISVAN e do Cadastro Único.</w:t>
       </w:r>
     </w:p>
     <w:tbl>
@@ -1757,12 +1691,6 @@
         <w:gridCol w:w="1300"/>
       </w:tblGrid>
       <w:tr>
-        <w:tblPrEx>
-          <w:tblCellMar>
-            <w:top w:w="0" w:type="dxa"/>
-            <w:bottom w:w="0" w:type="dxa"/>
-          </w:tblCellMar>
-        </w:tblPrEx>
         <w:trPr>
           <w:cantSplit/>
         </w:trPr>
@@ -1796,7 +1724,6 @@
                 <w:bCs/>
                 <w:color w:val="FFFFFF"/>
               </w:rPr>
-              <w:lastRenderedPageBreak/>
               <w:t>E1-F03</w:t>
             </w:r>
           </w:p>
@@ -1908,7 +1835,11 @@
         <w:jc w:val="both"/>
       </w:pPr>
       <w:r>
-        <w:t>A agricultura familiar no município concentra-se em assentamentos de reforma agrária e pequenas propriedades do cinturão rural, que ocupa a maior parte dos 8.082,33 km² do território (IBGE), mas tem participação marginal na estrutura econômica dominada pela pecuária extensiva e pela lavoura empresarial de grãos. O Censo Agropecuário 2017 do IBGE é a fonte disponível para dimensionar estabelecimentos familiares e deve ser confrontado com os registros do Cadastro Nacional da Agricultura Familiar. A conexão entre essa produção e o consumo urbano é frágil: as compras públicas do PNAE e do PAA, principal instrumento de mercado institucional, não têm sua execução municipal publicada de forma acessível, o que constitui lacuna a ser investigada. O fortalecimento da agricultura familiar condiciona E1-F06 e E1-F26 e reduz a dependência de cadeias longas vulneráveis a choques de preço (E1-F24) e a eventos climáticos como os registrados em 2024 e 2026 (E2-F30, E2-F17).</w:t>
+        <w:t xml:space="preserve">A agricultura familiar no município concentra-se em assentamentos de reforma agrária e pequenas propriedades do cinturão rural, que ocupa a maior parte dos 8.082,33 km² do território (IBGE), mas tem participação marginal na estrutura econômica dominada pela pecuária extensiva e pela lavoura empresarial </w:t>
+      </w:r>
+      <w:r>
+        <w:lastRenderedPageBreak/>
+        <w:t>de grãos. O Censo Agropecuário 2017 do IBGE é a fonte disponível para dimensionar estabelecimentos familiares e deve ser confrontado com os registros do Cadastro Nacional da Agricultura Familiar. O fortalecimento da agricultura familiar condiciona E1-F06 e E1-F26 e reduz a dependência de cadeias longas vulneráveis a choques de preço (E1-F24) e a eventos climáticos como os registrados em 2024 e 2026 (E2-F30, E2-F17).</w:t>
       </w:r>
     </w:p>
     <w:tbl>
@@ -1934,12 +1865,6 @@
         <w:gridCol w:w="1300"/>
       </w:tblGrid>
       <w:tr>
-        <w:tblPrEx>
-          <w:tblCellMar>
-            <w:top w:w="0" w:type="dxa"/>
-            <w:bottom w:w="0" w:type="dxa"/>
-          </w:tblCellMar>
-        </w:tblPrEx>
         <w:trPr>
           <w:cantSplit/>
         </w:trPr>
@@ -2084,7 +2009,7 @@
         <w:jc w:val="both"/>
       </w:pPr>
       <w:r>
-        <w:t>Hortas comunitárias, hortas escolares e quintais produtivos existem de forma dispersa nas regiões urbanas periféricas de Campo Grande, geralmente associadas a grupos de mulheres, igrejas e unidades de saúde, sem cadastro municipal que permita dimensionar sua escala. Nas aldeias urbanas indígenas, majoritariamente Terena, o cultivo em pequenos espaços preserva práticas alimentares e medicinais tradicionais (E4-F03, E4-F18) apesar da restrição de área imposta pela ocupação urbana. A inexistência de inventário dessas iniciativas é lacuna de informação que a cartografia social tem capacidade de suprir, registrando localização, produção e necessidades de água, sementes e assistência técnica. O fator articula segurança alimentar (E1-F02), renda complementar (E1-F11) e promoção da saúde, e sua expansão depende do acesso a terrenos públicos ociosos, de água a custo compatível (E2-F20) e de apoio técnico, o que o torna objeto viável de ação intersetorial de baixo custo no plano popular.</w:t>
+        <w:t>Hortas comunitárias, hortas escolares e quintais produtivos existem de forma dispersa nas regiões urbanas periféricas de Campo Grande, geralmente associadas a grupos de mulheres, igrejas e unidades de saúde, sem cadastro municipal que permita dimensionar sua escala. Nas aldeias urbanas indígenas, majoritariamente Terena, o cultivo em pequenos espaços preserva práticas alimentares e medicinais tradicionais (E4-F03, E4-F18) apesar da restrição de área imposta pela ocupação urbana. O fator articula segurança alimentar (E1-F02), renda complementar (E1-F11) e promoção da saúde, e sua expansão depende do acesso a terrenos públicos ociosos, de água a custo compatível (E2-F20) e de apoio técnico, o que o torna objeto viável de ação intersetorial de baixo custo no plano popular.</w:t>
       </w:r>
     </w:p>
     <w:tbl>
@@ -2110,12 +2035,6 @@
         <w:gridCol w:w="1300"/>
       </w:tblGrid>
       <w:tr>
-        <w:tblPrEx>
-          <w:tblCellMar>
-            <w:top w:w="0" w:type="dxa"/>
-            <w:bottom w:w="0" w:type="dxa"/>
-          </w:tblCellMar>
-        </w:tblPrEx>
         <w:trPr>
           <w:cantSplit/>
         </w:trPr>
@@ -2260,7 +2179,7 @@
         <w:jc w:val="both"/>
       </w:pPr>
       <w:r>
-        <w:t>A produção orgânica certificada no município é residual e voltada a nichos de consumo de renda média e alta, comercializada em feiras específicas e pontos de venda especializados, sem presença significativa nas regiões urbanas de menor renda. O contexto produtivo regional, marcado pelo uso intensivo de agrotóxicos nas lavouras de soja e milho do entorno, amplia a relevância do fator tanto para a saúde dos consumidores quanto para a dos trabalhadores rurais expostos (E1-F16, E2-F21). O Cadastro Nacional de Produtores Orgânicos do Ministério da Agricultura é a fonte para quantificar produtores no município, dado não sistematizado nesta versão do diagnóstico e registrado como lacuna. A ampliação da oferta orgânica e agroecológica depende de crédito orientado (E1-F22), assistência técnica e compras públicas, e sua articulação com hortas comunitárias (E1-F04) permitiria levar alimentos livres de agrotóxicos a territórios hoje excluídos desse mercado.</w:t>
+        <w:t>A produção orgânica certificada no município é residual e voltada a nichos de consumo de renda média e alta, comercializada em feiras específicas e pontos de venda especializados, sem presença significativa nas regiões urbanas de menor renda. O contexto produtivo regional, marcado pelo uso intensivo de agrotóxicos nas lavouras de soja e milho do entorno, amplia a relevância do fator tanto para a saúde dos consumidores quanto para a dos trabalhadores rurais expostos (E1-F16, E2-F21). A ampliação da oferta orgânica e agroecológica depende de crédito orientado (E1-F22), assistência técnica e compras públicas, e sua articulação com hortas comunitárias (E1-F04) permitiria levar alimentos livres de agrotóxicos a territórios hoje excluídos desse mercado.</w:t>
       </w:r>
     </w:p>
     <w:tbl>
@@ -2286,12 +2205,6 @@
         <w:gridCol w:w="1300"/>
       </w:tblGrid>
       <w:tr>
-        <w:tblPrEx>
-          <w:tblCellMar>
-            <w:top w:w="0" w:type="dxa"/>
-            <w:bottom w:w="0" w:type="dxa"/>
-          </w:tblCellMar>
-        </w:tblPrEx>
         <w:trPr>
           <w:cantSplit/>
         </w:trPr>
@@ -2325,7 +2238,6 @@
                 <w:bCs/>
                 <w:color w:val="FFFFFF"/>
               </w:rPr>
-              <w:lastRenderedPageBreak/>
               <w:t>E1-F06</w:t>
             </w:r>
           </w:p>
@@ -2437,7 +2349,13 @@
         <w:jc w:val="both"/>
       </w:pPr>
       <w:r>
-        <w:t>A disponibilidade de alimentos em Campo Grande não é limitada pelo volume ofertado, dado o papel da capital como entreposto logístico estadual, mas pela distribuição territorial dos pontos de venda de alimentos in natura e pelo preço. Nas regiões do Anhanduizinho, da Lagoa e do Imbirussu predominam mercados de bairro e atacarejos com oferta concentrada em produtos ultraprocessados, padrão que configura ambientes alimentares desfavoráveis à alimentação saudável e que deve ser verificado pela cartografia social. A ausência de mapeamento municipal de ambientes alimentares é lacuna de informação relevante para o planejamento. Eventos extremos recentes, como o vendaval de setembro de 2026, que deixou mais de 300 mil pessoas sem energia elétrica, evidenciam a vulnerabilidade da conservação domiciliar de alimentos perecíveis (E2-F31). O fator relaciona-se a E1-F02, E1-F24 e E1-F26 e orienta a localização de feiras e equipamentos públicos de abastecimento.</w:t>
+        <w:t xml:space="preserve">A disponibilidade de alimentos em Campo Grande não é limitada pelo volume ofertado, dado o papel da capital como entreposto logístico estadual, mas pela distribuição territorial dos pontos de venda de alimentos in natura e pelo preço. Nas regiões do Anhanduizinho, da Lagoa e do Imbirussu predominam mercados de bairro e atacarejos com oferta concentrada em produtos ultraprocessados, padrão que configura ambientes alimentares desfavoráveis à alimentação saudável e que deve ser verificado pela cartografia social. </w:t>
+      </w:r>
+      <w:r>
+        <w:t>A ausência de mapeamento municipal de ambientes alimentares é lacuna de informação relevante para o planejamento.</w:t>
+      </w:r>
+      <w:r>
+        <w:t xml:space="preserve"> Eventos extremos recentes, como o vendaval de setembro de 2026, que deixou mais de 300 mil pessoas sem energia elétrica, evidenciam a vulnerabilidade da conservação domiciliar de alimentos perecíveis (E2-F31). O fator relaciona-se a E1-F02, E1-F24 e E1-F26 e orienta a localização de feiras e equipamentos públicos de abastecimento.</w:t>
       </w:r>
     </w:p>
     <w:tbl>
@@ -2463,12 +2381,6 @@
         <w:gridCol w:w="1300"/>
       </w:tblGrid>
       <w:tr>
-        <w:tblPrEx>
-          <w:tblCellMar>
-            <w:top w:w="0" w:type="dxa"/>
-            <w:bottom w:w="0" w:type="dxa"/>
-          </w:tblCellMar>
-        </w:tblPrEx>
         <w:trPr>
           <w:cantSplit/>
         </w:trPr>
@@ -2502,6 +2414,7 @@
                 <w:bCs/>
                 <w:color w:val="FFFFFF"/>
               </w:rPr>
+              <w:lastRenderedPageBreak/>
               <w:t>E1-F07</w:t>
             </w:r>
           </w:p>
@@ -2639,12 +2552,6 @@
         <w:gridCol w:w="1300"/>
       </w:tblGrid>
       <w:tr>
-        <w:tblPrEx>
-          <w:tblCellMar>
-            <w:top w:w="0" w:type="dxa"/>
-            <w:bottom w:w="0" w:type="dxa"/>
-          </w:tblCellMar>
-        </w:tblPrEx>
         <w:trPr>
           <w:cantSplit/>
         </w:trPr>
@@ -2835,12 +2742,6 @@
         <w:gridCol w:w="1300"/>
       </w:tblGrid>
       <w:tr>
-        <w:tblPrEx>
-          <w:tblCellMar>
-            <w:top w:w="0" w:type="dxa"/>
-            <w:bottom w:w="0" w:type="dxa"/>
-          </w:tblCellMar>
-        </w:tblPrEx>
         <w:trPr>
           <w:cantSplit/>
         </w:trPr>
@@ -2985,11 +2886,13 @@
         <w:jc w:val="both"/>
       </w:pPr>
       <w:r>
-        <w:t xml:space="preserve">O empreendedorismo em Campo Grande cresceu de 103.129 para 117.722 empresas ativas entre março de 2020 e janeiro de 2023 (Prefeitura Municipal), expansão em parte composta por microempreendedores individuais que formalizaram atividades de subsistência após a perda de vínculos empregatícios na </w:t>
-      </w:r>
-      <w:r>
-        <w:lastRenderedPageBreak/>
-        <w:t>pandemia. Esse empreendedorismo de necessidade difere da dimensão solidária e criativa nomeada pelo fator, que pressupõe cooperação, inovação social e acesso a apoio técnico. O município dispõe de equipamentos como a Fundação Social do Trabalho e de instituições de ensino com incubadoras, mas não há registro público consolidado de empreendimentos solidários ou de inovação social em territórios periféricos, o que constitui lacuna de informação. O fator articula-se a E1-F11, E1-F22 e E5-F10, e o plano popular pode orientar o apoio a iniciativas surgidas da própria comunidade, identificadas na cartografia social, em vez de replicar programas genéricos de capacitação empresarial.</w:t>
+        <w:t xml:space="preserve">O empreendedorismo em Campo Grande cresceu de 103.129 para 117.722 empresas ativas entre março de 2020 e janeiro de 2023 (Prefeitura Municipal), expansão em parte composta por microempreendedores individuais que formalizaram atividades de subsistência após a perda de vínculos empregatícios na pandemia. Esse empreendedorismo de necessidade difere da dimensão solidária e criativa nomeada pelo </w:t>
+      </w:r>
+      <w:r>
+        <w:t>fator, que pressupõe cooperação, inovação social e acesso a apoio técnico. O município dispõe de equipamentos como a Fundação Social do Trabalho e de instituições de ensino com incubadoras, mas não há registro público consolidado de empreendimentos solidários ou de inovação social em territórios periféricos. O fator</w:t>
+      </w:r>
+      <w:r>
+        <w:t xml:space="preserve"> articula-se a E1-F11, E1-F22 e E5-F10, e o plano popular pode orientar o apoio a iniciativas surgidas da própria comunidade, identificadas na cartografia social, em vez de replicar programas genéricos de capacitação empresarial.</w:t>
       </w:r>
     </w:p>
     <w:tbl>
@@ -3015,12 +2918,6 @@
         <w:gridCol w:w="1300"/>
       </w:tblGrid>
       <w:tr>
-        <w:tblPrEx>
-          <w:tblCellMar>
-            <w:top w:w="0" w:type="dxa"/>
-            <w:bottom w:w="0" w:type="dxa"/>
-          </w:tblCellMar>
-        </w:tblPrEx>
         <w:trPr>
           <w:cantSplit/>
         </w:trPr>
@@ -3165,7 +3062,11 @@
         <w:jc w:val="both"/>
       </w:pPr>
       <w:r>
-        <w:t>Campo Grande registrava 307,1 mil vínculos formais com remuneração média de R$ 4 mil, acima da média estadual de R$ 3,3 mil, com ocupações predominantes de dirigentes do serviço público, faxineiros e assistentes administrativos (RAIS). A formalização via MEI ampliou a cobertura previdenciária de parte dos trabalhadores autônomos, mas com contribuição reduzida e acesso limitado a benefícios. A Economia Solidária carece de marco municipal de formalização que reconheça cooperativas e associações de produção como sujeitos de compras públicas e de crédito. A distância entre formalização e proteção efetiva é maior nos setores de construção civil, serviços domésticos, reciclagem e comércio ambulante, que concentram trabalhadores negros, indígenas e migrantes (E3-F13, E3-F16). O fator relaciona-se a E1-F28 e E1-F18, e o planejamento deve monitorar a formalização desagregada por raça, sexo e território.</w:t>
+        <w:t xml:space="preserve">Campo Grande registrava 307,1 mil vínculos formais com remuneração média de R$ 4 mil, acima da média estadual de R$ 3,3 mil, com ocupações predominantes de dirigentes do serviço público, faxineiros e assistentes administrativos (RAIS). A formalização via MEI ampliou a cobertura previdenciária de parte </w:t>
+      </w:r>
+      <w:r>
+        <w:lastRenderedPageBreak/>
+        <w:t>dos trabalhadores autônomos, mas com contribuição reduzida e acesso limitado a benefícios. A Economia Solidária carece de marco municipal de formalização que reconheça cooperativas e associações de produção como sujeitos de compras públicas e de crédito. A distância entre formalização e proteção efetiva é maior nos setores de construção civil, serviços domésticos, reciclagem e comércio ambulante, que concentram trabalhadores negros, indígenas e migrantes (E3-F13, E3-F16). O fator relaciona-se a E1-F28 e E1-F18, e o planejamento deve monitorar a formalização desagregada por raça, sexo e território.</w:t>
       </w:r>
     </w:p>
     <w:tbl>
@@ -3191,12 +3092,6 @@
         <w:gridCol w:w="1300"/>
       </w:tblGrid>
       <w:tr>
-        <w:tblPrEx>
-          <w:tblCellMar>
-            <w:top w:w="0" w:type="dxa"/>
-            <w:bottom w:w="0" w:type="dxa"/>
-          </w:tblCellMar>
-        </w:tblPrEx>
         <w:trPr>
           <w:cantSplit/>
         </w:trPr>
@@ -3341,7 +3236,10 @@
         <w:jc w:val="both"/>
       </w:pPr>
       <w:r>
-        <w:t>As iniciativas de economia solidária em Campo Grande concentram-se em cooperativas e associações de catadores de materiais recicláveis, grupos de produção artesanal e feiras de economia popular, sem cadastro municipal atualizado que permita dimensionar seu número, faturamento e trabalhadores envolvidos, lacuna que deve ser suprida pela consulta ao Cadastro Nacional de Empreendimentos Econômicos Solidários e pela cartografia social. A coleta de resíduos domiciliares atinge 99,23% da população, gerando volume de recicláveis que poderia sustentar uma cadeia solidária mais robusta (E1-F27), hoje limitada pela baixa remuneração dos catadores e pela ausência de contratos de prestação de serviço com o poder público. As aldeias urbanas indígenas mantêm produção artesanal com potencial de comercialização coletiva. O fator depende de E1-F22 e E1-F20 para acesso a capital e de E6-F04 para parcerias institucionais, e constitui eixo estratégico de geração de renda nos territórios de maior vulnerabilidade.</w:t>
+        <w:t>As iniciativas de economia solidária em Campo Grande concentram-se em cooperativas e associações de catadores de materiais recicláveis, grupos de produção artesanal e feiras de economia popular, sem cadastro municipal atualizado que permita dimensionar seu número, faturamento e trabalhadores envolvidos. A coleta de resíduos domiciliares atinge 99,23% da população, gerando volume de recicláveis que poderia sustentar uma cadeia solidária mais robusta (E1-F27), hoje limitada pela baixa remuneração dos catadores e pela ausência de contratos de prestação de serviço com o poder público. As aldeias urbanas</w:t>
+      </w:r>
+      <w:r>
+        <w:t xml:space="preserve"> indígenas mantêm produção artesanal com potencial de comercialização coletiva. O fator depende de E1-F22 e E1-F20 para acesso a capital e de E6-F04 para parcerias institucionais, e constitui eixo estratégico de geração de renda nos territórios de maior vulnerabilidade.</w:t>
       </w:r>
     </w:p>
     <w:tbl>
@@ -3367,12 +3265,6 @@
         <w:gridCol w:w="1300"/>
       </w:tblGrid>
       <w:tr>
-        <w:tblPrEx>
-          <w:tblCellMar>
-            <w:top w:w="0" w:type="dxa"/>
-            <w:bottom w:w="0" w:type="dxa"/>
-          </w:tblCellMar>
-        </w:tblPrEx>
         <w:trPr>
           <w:cantSplit/>
         </w:trPr>
@@ -3543,12 +3435,6 @@
         <w:gridCol w:w="1300"/>
       </w:tblGrid>
       <w:tr>
-        <w:tblPrEx>
-          <w:tblCellMar>
-            <w:top w:w="0" w:type="dxa"/>
-            <w:bottom w:w="0" w:type="dxa"/>
-          </w:tblCellMar>
-        </w:tblPrEx>
         <w:trPr>
           <w:cantSplit/>
         </w:trPr>
@@ -3582,7 +3468,6 @@
                 <w:bCs/>
                 <w:color w:val="FFFFFF"/>
               </w:rPr>
-              <w:lastRenderedPageBreak/>
               <w:t>E1-F13</w:t>
             </w:r>
           </w:p>
@@ -3720,12 +3605,6 @@
         <w:gridCol w:w="1300"/>
       </w:tblGrid>
       <w:tr>
-        <w:tblPrEx>
-          <w:tblCellMar>
-            <w:top w:w="0" w:type="dxa"/>
-            <w:bottom w:w="0" w:type="dxa"/>
-          </w:tblCellMar>
-        </w:tblPrEx>
         <w:trPr>
           <w:cantSplit/>
         </w:trPr>
@@ -3759,6 +3638,7 @@
                 <w:bCs/>
                 <w:color w:val="FFFFFF"/>
               </w:rPr>
+              <w:lastRenderedPageBreak/>
               <w:t>E1-F14</w:t>
             </w:r>
           </w:p>
@@ -3918,12 +3798,6 @@
         <w:gridCol w:w="1300"/>
       </w:tblGrid>
       <w:tr>
-        <w:tblPrEx>
-          <w:tblCellMar>
-            <w:top w:w="0" w:type="dxa"/>
-            <w:bottom w:w="0" w:type="dxa"/>
-          </w:tblCellMar>
-        </w:tblPrEx>
         <w:trPr>
           <w:cantSplit/>
         </w:trPr>
@@ -4094,12 +3968,6 @@
         <w:gridCol w:w="1300"/>
       </w:tblGrid>
       <w:tr>
-        <w:tblPrEx>
-          <w:tblCellMar>
-            <w:top w:w="0" w:type="dxa"/>
-            <w:bottom w:w="0" w:type="dxa"/>
-          </w:tblCellMar>
-        </w:tblPrEx>
         <w:trPr>
           <w:cantSplit/>
         </w:trPr>
@@ -4244,11 +4112,7 @@
         <w:jc w:val="both"/>
       </w:pPr>
       <w:r>
-        <w:t xml:space="preserve">A segurança nos ambientes de trabalho em Campo Grande é monitorada pelo Centro de Referência em Saúde do Trabalhador estadual e pelas notificações de acidentes de trabalho graves no SINAN, sistema sabidamente subnotificado para trabalhadores informais. Os setores de construção civil, frigoríficos, transporte de cargas e limpeza urbana concentram os riscos de maior gravidade. O vendaval de 10 de setembro de 2026, com rajadas de 83,8 km/h, expôs trabalhadores de manutenção elétrica e poda a </w:t>
-      </w:r>
-      <w:r>
-        <w:lastRenderedPageBreak/>
-        <w:t>condições de alto risco durante a recomposição da rede, com previsão de substituição de até 100 postes pela Energisa. A exposição ocupacional a agrotóxicos nas áreas rurais do município e a exposição de catadores a resíduos perigosos completam o quadro. O fator relaciona-se a E1-F18, E2-F11 e E5-F03, e o planejamento deve integrar vigilância em saúde do trabalhador às equipes de APS nos territórios com maior concentração de trabalho informal.</w:t>
+        <w:t>A segurança nos ambientes de trabalho em Campo Grande é monitorada pelo Centro de Referência em Saúde do Trabalhador estadual e pelas notificações de acidentes de trabalho graves no SINAN, sistema sabidamente subnotificado para trabalhadores informais. Os setores de construção civil, frigoríficos, transporte de cargas e limpeza urbana concentram os riscos de maior gravidade. O vendaval de 10 de setembro de 2026, com rajadas de 83,8 km/h, expôs trabalhadores de manutenção elétrica e poda a condições de alto risco durante a recomposição da rede, com previsão de substituição de até 100 postes pela Energisa. A exposição ocupacional a agrotóxicos nas áreas rurais do município e a exposição de catadores a resíduos perigosos completam o quadro. O fator relaciona-se a E1-F18, E2-F11 e E5-F03, e o planejamento deve integrar vigilância em saúde do trabalhador às equipes de APS nos territórios com maior concentração de trabalho informal.</w:t>
       </w:r>
     </w:p>
     <w:tbl>
@@ -4274,12 +4138,6 @@
         <w:gridCol w:w="1300"/>
       </w:tblGrid>
       <w:tr>
-        <w:tblPrEx>
-          <w:tblCellMar>
-            <w:top w:w="0" w:type="dxa"/>
-            <w:bottom w:w="0" w:type="dxa"/>
-          </w:tblCellMar>
-        </w:tblPrEx>
         <w:trPr>
           <w:cantSplit/>
         </w:trPr>
@@ -4424,7 +4282,11 @@
         <w:jc w:val="both"/>
       </w:pPr>
       <w:r>
-        <w:t>As ações solidárias locais em Campo Grande, como doação de alimentos, cozinhas comunitárias, apoio a famílias em situação de rua e redes de vizinhança, são conduzidas por igrejas, associações de moradores, coletivos e organizações indígenas, com intensidade que aumenta em momentos de crise. Após o vendaval de setembro de 2026, a mobilização comunitária complementou a resposta municipal na remoção de árvores e no apoio a famílias atingidas, padrão observado também nos alagamentos de abril de 2025. Essas ações não são registradas em sistema público, o que impede seu reconhecimento como componente da rede de proteção e da capacidade de resposta a desastres, lacuna que a cartografia social deve preencher. O fator articula-se a E6-F01, E6-F16 e E6-F05, e sua valorização no plano popular passa por apoio logístico e financeiro sem captura da autonomia das iniciativas.</w:t>
+        <w:t xml:space="preserve">As ações solidárias locais em Campo Grande, como doação de alimentos, cozinhas comunitárias, apoio a famílias em situação de rua e redes de vizinhança, são conduzidas por igrejas, associações de moradores, coletivos e organizações indígenas, com intensidade que aumenta em momentos de crise. Após o vendaval de setembro de 2026, a mobilização comunitária complementou a resposta municipal na remoção de árvores </w:t>
+      </w:r>
+      <w:r>
+        <w:lastRenderedPageBreak/>
+        <w:t>e no apoio a famílias atingidas, padrão observado também nos alagamentos de abril de 2025. O fator articula-se a E6-F01, E6-F16 e E6-F05, e sua valorização no plano popular passa por apoio logístico e financeiro sem captura da autonomia das iniciativas.</w:t>
       </w:r>
     </w:p>
     <w:tbl>
@@ -4450,12 +4312,6 @@
         <w:gridCol w:w="1300"/>
       </w:tblGrid>
       <w:tr>
-        <w:tblPrEx>
-          <w:tblCellMar>
-            <w:top w:w="0" w:type="dxa"/>
-            <w:bottom w:w="0" w:type="dxa"/>
-          </w:tblCellMar>
-        </w:tblPrEx>
         <w:trPr>
           <w:cantSplit/>
         </w:trPr>
@@ -4626,12 +4482,6 @@
         <w:gridCol w:w="1300"/>
       </w:tblGrid>
       <w:tr>
-        <w:tblPrEx>
-          <w:tblCellMar>
-            <w:top w:w="0" w:type="dxa"/>
-            <w:bottom w:w="0" w:type="dxa"/>
-          </w:tblCellMar>
-        </w:tblPrEx>
         <w:trPr>
           <w:cantSplit/>
         </w:trPr>
@@ -4810,12 +4660,6 @@
         <w:gridCol w:w="1300"/>
       </w:tblGrid>
       <w:tr>
-        <w:tblPrEx>
-          <w:tblCellMar>
-            <w:top w:w="0" w:type="dxa"/>
-            <w:bottom w:w="0" w:type="dxa"/>
-          </w:tblCellMar>
-        </w:tblPrEx>
         <w:trPr>
           <w:cantSplit/>
         </w:trPr>
@@ -4849,7 +4693,6 @@
                 <w:bCs/>
                 <w:color w:val="FFFFFF"/>
               </w:rPr>
-              <w:lastRenderedPageBreak/>
               <w:t>E1-F20</w:t>
             </w:r>
           </w:p>
@@ -4987,12 +4830,6 @@
         <w:gridCol w:w="1300"/>
       </w:tblGrid>
       <w:tr>
-        <w:tblPrEx>
-          <w:tblCellMar>
-            <w:top w:w="0" w:type="dxa"/>
-            <w:bottom w:w="0" w:type="dxa"/>
-          </w:tblCellMar>
-        </w:tblPrEx>
         <w:trPr>
           <w:cantSplit/>
         </w:trPr>
@@ -5137,7 +4974,11 @@
         <w:jc w:val="both"/>
       </w:pPr>
       <w:r>
-        <w:t>A indústria responde por 14,8% do valor adicionado de Campo Grande, com predominância de agroindústria, frigoríficos, alimentos, construção civil e indústria farmacêutica, enquanto a industrialização de grande porte do estado se desloca para o interior. A inclusividade dessa industrialização é limitada: as faixas salariais mais baixas concentram trabalhadores com menor escolaridade e populações negras e indígenas, e a localização de plantas industriais próximas a áreas residenciais periféricas gera conflitos por emissões e ruído não monitorados de forma sistemática (E2-F21, E2-F25). A ausência de indicadores municipais de emprego industrial desagregados por raça e território é lacuna a ser preenchida com microdados da RAIS. O fator articula-se a E1-F23, E5-F15 e E5-F05 e deve orientar a exigência de contrapartidas sociais e ambientais em incentivos fiscais concedidos pelo município.</w:t>
+        <w:t xml:space="preserve">A indústria responde por 14,8% do valor adicionado de Campo Grande, com predominância de agroindústria, frigoríficos, alimentos, construção civil e indústria farmacêutica, enquanto a industrialização de grande porte do estado se desloca para o interior. A inclusividade dessa industrialização é limitada: as faixas salariais mais baixas concentram trabalhadores com menor escolaridade e populações negras e </w:t>
+      </w:r>
+      <w:r>
+        <w:lastRenderedPageBreak/>
+        <w:t>indígenas, e a localização de plantas industriais próximas a áreas residenciais periféricas gera conflitos por emissões e ruído não monitorados de forma sistemática (E2-F21, E2-F25). O fator articula-se a E1-F23, E5-F15 e E5-F05 e deve orientar a exigência de contrapartidas sociais e ambientais em incentivos fiscais concedidos pelo município.</w:t>
       </w:r>
     </w:p>
     <w:tbl>
@@ -5163,12 +5004,6 @@
         <w:gridCol w:w="1300"/>
       </w:tblGrid>
       <w:tr>
-        <w:tblPrEx>
-          <w:tblCellMar>
-            <w:top w:w="0" w:type="dxa"/>
-            <w:bottom w:w="0" w:type="dxa"/>
-          </w:tblCellMar>
-        </w:tblPrEx>
         <w:trPr>
           <w:cantSplit/>
         </w:trPr>
@@ -5321,7 +5156,7 @@
       </w:r>
       <w:proofErr w:type="spellEnd"/>
       <w:r>
-        <w:t xml:space="preserve"> solidários, grupos de mulheres e empreendedores indígenas e migrantes. A ausência de dados públicos sobre o volume de microcrédito concedido por território constitui lacuna de informação. Após o vendaval de setembro de 2026, a necessidade de crédito para recomposição de pequenos negócios atingidos por destelhamento e perda de energia tornou-se visível, articulando este fator a E1-F29. O crédito orientado condiciona E1-F09 e E1-F11 e deve ser acompanhado de assistência técnica para evitar endividamento em territórios de renda baixa e instável.</w:t>
+        <w:t xml:space="preserve"> solidários, grupos de mulheres e empreendedores indígenas e migrantes. Após o vendaval de setembro de 2026, a necessidade de crédito para recomposição de pequenos negócios atingidos por destelhamento e perda de energia tornou-se visível, articulando este fator a E1-F29. O crédito orientado condiciona E1-F09 e E1-F11 e deve ser acompanhado de assistência técnica para evitar endividamento em territórios de renda baixa e instável.</w:t>
       </w:r>
     </w:p>
     <w:tbl>
@@ -5347,12 +5182,6 @@
         <w:gridCol w:w="1300"/>
       </w:tblGrid>
       <w:tr>
-        <w:tblPrEx>
-          <w:tblCellMar>
-            <w:top w:w="0" w:type="dxa"/>
-            <w:bottom w:w="0" w:type="dxa"/>
-          </w:tblCellMar>
-        </w:tblPrEx>
         <w:trPr>
           <w:cantSplit/>
         </w:trPr>
@@ -5497,11 +5326,19 @@
         <w:jc w:val="both"/>
       </w:pPr>
       <w:r>
-        <w:t>As atividades econômicas sustentáveis em Campo Grande têm expressão em iniciativas privadas de energia solar distribuída, eficiência no uso da água e reciclagem, mas não estão organizadas em política municipal com metas e incentivos. A economia local mantém dependência de cadeias associadas à conversão do Cerrado e à pecuária extensiva, cuja expansão regional tem custos ambientais documentados pelo MapBiomas (E4-F16). A transição para atividades de menor impacto, como agroecologia periurbana (E1-F05), reciclagem organizada (E1-F27), turismo de natureza e serviços ambientais, depende de crédito (E1-</w:t>
-      </w:r>
-      <w:r>
-        <w:lastRenderedPageBreak/>
-        <w:t>F22), formação (E5-F10) e compras públicas. A ausência de indicadores de economia verde no município é lacuna a ser registrada. O fator articula-se a E1-F21 e E4-F22 e permite ao plano popular vincular geração de renda e proteção ambiental nos territórios periféricos e rurais.</w:t>
+        <w:t xml:space="preserve">As atividades econômicas sustentáveis em Campo Grande têm expressão em iniciativas privadas de energia solar distribuída, eficiência no uso da água e reciclagem, mas não estão organizadas em política municipal com metas e incentivos. A economia local mantém dependência de cadeias associadas à conversão do Cerrado e à pecuária extensiva, cuja expansão regional tem custos ambientais documentados pelo MapBiomas (E4-F16). A transição para atividades de menor impacto, como agroecologia periurbana (E1-F05), reciclagem organizada (E1-F27), turismo </w:t>
+      </w:r>
+      <w:r>
+        <w:t xml:space="preserve">de natureza e serviços ambientais, depende de crédito (E1-F22), formação (E5-F10) e compras públicas. A ausência de indicadores de economia verde no município </w:t>
+      </w:r>
+      <w:r>
+        <w:t>deve ser evidenciada.</w:t>
+      </w:r>
+      <w:r>
+        <w:t xml:space="preserve"> O fator articula-se a E1-F21 e E4-F22 e permite ao plano popular vincular geração de renda e proteção ambiental nos territórios periféricos</w:t>
+      </w:r>
+      <w:r>
+        <w:t xml:space="preserve"> e rurais.</w:t>
       </w:r>
     </w:p>
     <w:tbl>
@@ -5527,12 +5364,6 @@
         <w:gridCol w:w="1300"/>
       </w:tblGrid>
       <w:tr>
-        <w:tblPrEx>
-          <w:tblCellMar>
-            <w:top w:w="0" w:type="dxa"/>
-            <w:bottom w:w="0" w:type="dxa"/>
-          </w:tblCellMar>
-        </w:tblPrEx>
         <w:trPr>
           <w:cantSplit/>
         </w:trPr>
@@ -5711,12 +5542,6 @@
         <w:gridCol w:w="1300"/>
       </w:tblGrid>
       <w:tr>
-        <w:tblPrEx>
-          <w:tblCellMar>
-            <w:top w:w="0" w:type="dxa"/>
-            <w:bottom w:w="0" w:type="dxa"/>
-          </w:tblCellMar>
-        </w:tblPrEx>
         <w:trPr>
           <w:cantSplit/>
         </w:trPr>
@@ -5750,6 +5575,7 @@
                 <w:bCs/>
                 <w:color w:val="FFFFFF"/>
               </w:rPr>
+              <w:lastRenderedPageBreak/>
               <w:t>E1-F25</w:t>
             </w:r>
           </w:p>
@@ -5887,12 +5713,6 @@
         <w:gridCol w:w="1300"/>
       </w:tblGrid>
       <w:tr>
-        <w:tblPrEx>
-          <w:tblCellMar>
-            <w:top w:w="0" w:type="dxa"/>
-            <w:bottom w:w="0" w:type="dxa"/>
-          </w:tblCellMar>
-        </w:tblPrEx>
         <w:trPr>
           <w:cantSplit/>
         </w:trPr>
@@ -6063,12 +5883,6 @@
         <w:gridCol w:w="1300"/>
       </w:tblGrid>
       <w:tr>
-        <w:tblPrEx>
-          <w:tblCellMar>
-            <w:top w:w="0" w:type="dxa"/>
-            <w:bottom w:w="0" w:type="dxa"/>
-          </w:tblCellMar>
-        </w:tblPrEx>
         <w:trPr>
           <w:cantSplit/>
         </w:trPr>
@@ -6102,7 +5916,6 @@
                 <w:bCs/>
                 <w:color w:val="FFFFFF"/>
               </w:rPr>
-              <w:lastRenderedPageBreak/>
               <w:t>E1-F27</w:t>
             </w:r>
           </w:p>
@@ -6214,7 +6027,7 @@
         <w:jc w:val="both"/>
       </w:pPr>
       <w:r>
-        <w:t xml:space="preserve">Campo Grande coleta resíduos domiciliares de 99,23% da população, com geração de 0,98 kg por habitante por dia (Instituto Água e Saneamento, base SNIS), mas a reciclagem efetiva é baixa e dependente de cooperativas e catadores autônomos com remuneração precária. A ausência de dados municipais atualizados sobre o percentual de resíduos recuperados constitui lacuna a ser preenchida com o SINISA. A economia circular nomeada pelo fator inclui ainda </w:t>
+        <w:t xml:space="preserve">Campo Grande coleta resíduos domiciliares de 99,23% da população, com geração de 0,98 kg por habitante por dia (Instituto Água e Saneamento, base SNIS), mas a reciclagem efetiva é baixa e dependente de cooperativas e catadores autônomos com remuneração precária. A economia circular nomeada pelo fator inclui ainda </w:t>
       </w:r>
       <w:proofErr w:type="spellStart"/>
       <w:r>
@@ -6248,12 +6061,6 @@
         <w:gridCol w:w="1300"/>
       </w:tblGrid>
       <w:tr>
-        <w:tblPrEx>
-          <w:tblCellMar>
-            <w:top w:w="0" w:type="dxa"/>
-            <w:bottom w:w="0" w:type="dxa"/>
-          </w:tblCellMar>
-        </w:tblPrEx>
         <w:trPr>
           <w:cantSplit/>
         </w:trPr>
@@ -6398,7 +6205,11 @@
         <w:jc w:val="both"/>
       </w:pPr>
       <w:r>
-        <w:t>O trabalho informal é o componente mais extenso e menos visível do mercado de trabalho de Campo Grande. A PNAD Contínua divulga a taxa de informalidade para o conjunto das capitais, e os microdados do CadÚnico permitem estimar a informalidade entre famílias de baixa renda por território, fontes que devem compor a série do diagnóstico. A informalidade concentra-se em serviços domésticos, construção, comércio ambulante, transporte por aplicativo e reciclagem, e atinge mais intensamente mulheres, pessoas negras, indígenas e migrantes. A ausência de proteção previdenciária expõe esses trabalhadores à perda total de renda em situações de doença ou desastre, como ocorreu com trabalhadores autônomos durante o vendaval de setembro de 2026. O fator articula-se a E1-F10, E1-F13 e E3-F01 e afeta o acesso à saúde, pois limita a disponibilidade de horário para consultas na rede pública em horário comercial (E2-F15).</w:t>
+        <w:t xml:space="preserve">O trabalho informal é o componente mais extenso e menos visível do mercado de trabalho de Campo Grande. A PNAD Contínua divulga a taxa de informalidade para o conjunto das capitais, e os microdados do CadÚnico permitem estimar a informalidade entre famílias de baixa renda por território, fontes que devem compor a série do diagnóstico. A informalidade concentra-se em serviços domésticos, construção, comércio ambulante, transporte por aplicativo e reciclagem, e atinge mais intensamente mulheres, pessoas negras, indígenas e migrantes. A ausência de proteção previdenciária expõe esses trabalhadores à perda </w:t>
+      </w:r>
+      <w:r>
+        <w:lastRenderedPageBreak/>
+        <w:t>total de renda em situações de doença ou desastre, como ocorreu com trabalhadores autônomos durante o vendaval de setembro de 2026. O fator articula-se a E1-F10, E1-F13 e E3-F01 e afeta o acesso à saúde, pois limita a disponibilidade de horário para consultas na rede pública em horário comercial (E2-F15).</w:t>
       </w:r>
     </w:p>
     <w:tbl>
@@ -6424,12 +6235,6 @@
         <w:gridCol w:w="1300"/>
       </w:tblGrid>
       <w:tr>
-        <w:tblPrEx>
-          <w:tblCellMar>
-            <w:top w:w="0" w:type="dxa"/>
-            <w:bottom w:w="0" w:type="dxa"/>
-          </w:tblCellMar>
-        </w:tblPrEx>
         <w:trPr>
           <w:cantSplit/>
         </w:trPr>
@@ -6590,7 +6395,13 @@
       </w:r>
       <w:proofErr w:type="gramEnd"/>
       <w:r>
-        <w:t xml:space="preserve"> pelo Ministério da Integração. A inexistência de programa municipal de crédito para adaptação de moradias, como reforço de telhados e drenagem, constitui lacuna de política pública. O fator articula-se a E4-F10, E4-F07 e E2-F32, e o plano popular deve associar crédito a assistência técnica para reconstrução resiliente.</w:t>
+        <w:t xml:space="preserve"> pelo Ministério da Integração. </w:t>
+      </w:r>
+      <w:r>
+        <w:t>A inexistência de programa municipal de crédito para adaptação de moradias, como reforço de telhados e drenagem, constitui lacuna de política pública.</w:t>
+      </w:r>
+      <w:r>
+        <w:t xml:space="preserve"> O fator articula-se a E4-F10, E4-F07 e E2-F32, e o plano popular deve associar crédito a assistência técnica para reconstrução resiliente.</w:t>
       </w:r>
     </w:p>
     <w:p>
@@ -6628,12 +6439,6 @@
         <w:gridCol w:w="9354"/>
       </w:tblGrid>
       <w:tr>
-        <w:tblPrEx>
-          <w:tblCellMar>
-            <w:top w:w="0" w:type="dxa"/>
-            <w:bottom w:w="0" w:type="dxa"/>
-          </w:tblCellMar>
-        </w:tblPrEx>
         <w:tc>
           <w:tcPr>
             <w:tcW w:w="9354" w:type="dxa"/>
@@ -6670,12 +6475,6 @@
         </w:tc>
       </w:tr>
       <w:tr>
-        <w:tblPrEx>
-          <w:tblCellMar>
-            <w:top w:w="0" w:type="dxa"/>
-            <w:bottom w:w="0" w:type="dxa"/>
-          </w:tblCellMar>
-        </w:tblPrEx>
         <w:tc>
           <w:tcPr>
             <w:tcW w:w="9354" w:type="dxa"/>
@@ -6710,12 +6509,6 @@
         </w:tc>
       </w:tr>
       <w:tr>
-        <w:tblPrEx>
-          <w:tblCellMar>
-            <w:top w:w="0" w:type="dxa"/>
-            <w:bottom w:w="0" w:type="dxa"/>
-          </w:tblCellMar>
-        </w:tblPrEx>
         <w:tc>
           <w:tcPr>
             <w:tcW w:w="9354" w:type="dxa"/>
@@ -6750,12 +6543,6 @@
         </w:tc>
       </w:tr>
       <w:tr>
-        <w:tblPrEx>
-          <w:tblCellMar>
-            <w:top w:w="0" w:type="dxa"/>
-            <w:bottom w:w="0" w:type="dxa"/>
-          </w:tblCellMar>
-        </w:tblPrEx>
         <w:tc>
           <w:tcPr>
             <w:tcW w:w="9354" w:type="dxa"/>
@@ -6804,7 +6591,10 @@
       </w:r>
       <w:proofErr w:type="gramEnd"/>
       <w:r>
-        <w:t xml:space="preserve"> por 180 dias. A preparação comunitária, com alertas, rotas, pontos de encontro e brigadas, é a lacuna mais evidente.</w:t>
+        <w:t xml:space="preserve"> por 180 dias. </w:t>
+      </w:r>
+      <w:r>
+        <w:t>A preparação comunitária, com alertas, rotas, pontos de encontro e brigadas, é a lacuna mais evidente.</w:t>
       </w:r>
     </w:p>
     <w:tbl>
@@ -6830,12 +6620,6 @@
         <w:gridCol w:w="1300"/>
       </w:tblGrid>
       <w:tr>
-        <w:tblPrEx>
-          <w:tblCellMar>
-            <w:top w:w="0" w:type="dxa"/>
-            <w:bottom w:w="0" w:type="dxa"/>
-          </w:tblCellMar>
-        </w:tblPrEx>
         <w:trPr>
           <w:cantSplit/>
         </w:trPr>
@@ -6980,7 +6764,10 @@
         <w:jc w:val="both"/>
       </w:pPr>
       <w:r>
-        <w:t xml:space="preserve">As áreas inundáveis de Campo Grande concentram-se nos fundos de vale dos córregos urbanos, como Anhanduí, Prosa, Segredo, Bandeira e Lagoa, cuja canalização e impermeabilização das bacias reduziram a capacidade de infiltração e aumentaram a velocidade do escoamento. O evento de 24 de abril de 2025, com 88 mm de chuva registrados pelo CEMADEN, produziu enxurradas nas avenidas Rachid Neder, Tamandaré, Rachel de Queiroz e Espírito Santo e alagamentos em bairros como </w:t>
+        <w:t xml:space="preserve">As áreas inundáveis de Campo Grande concentram-se nos fundos de vale dos córregos urbanos, como Anhanduí, Prosa, Segredo, Bandeira e Lagoa, cuja canalização e impermeabilização das bacias reduziram a capacidade de infiltração e </w:t>
+      </w:r>
+      <w:r>
+        <w:t xml:space="preserve">aumentaram a velocidade do escoamento. O evento de 24 de abril de 2025, com 88 mm de chuva registrados pelo CEMADEN, produziu enxurradas nas avenidas Rachid Neder, Tamandaré, Rachel de Queiroz e Espírito Santo e alagamentos em bairros como </w:t>
       </w:r>
       <w:proofErr w:type="spellStart"/>
       <w:r>
@@ -6996,7 +6783,16 @@
       </w:r>
       <w:proofErr w:type="spellEnd"/>
       <w:r>
-        <w:t>. O município não dispõe de mapa público de manchas de inundação por tempo de retorno, lacuna central para o planejamento urbano e sanitário, que deve ser suprida pela Defesa Civil, pelo Plano Diretor de Desenvolvimento Urbano Ambiental (Lei Complementar nº 341/2018) e pela cartografia social. O fator articula-se a E2-F34, E2-F33 e E5-F24, e define onde devem ser priorizadas drenagem, rotas de fuga (E2-F26) e vigilância de doenças de veiculação hídrica (E2-F06).</w:t>
+        <w:t>. O município não dispõe de mapa público de manchas de inundação por tempo de retorno, lacuna central para o planejamento urbano e sanitário, que deve ser suprida pela Defesa Civil, pelo Plano Diretor de Desenvolvimento Urbano Ambiental (Lei Complementar nº 341/2018)</w:t>
+      </w:r>
+      <w:r>
+        <w:t xml:space="preserve">. </w:t>
+      </w:r>
+      <w:r>
+        <w:t>O fator articula-se a E2-F34, E2-F33 e E5-F24, e define onde devem ser priorizadas drenagem, rotas de fuga (E2-F26</w:t>
+      </w:r>
+      <w:r>
+        <w:t>) e vigilância de doenças de veiculação hídrica (E2-F06).</w:t>
       </w:r>
     </w:p>
     <w:tbl>
@@ -7022,12 +6818,6 @@
         <w:gridCol w:w="1300"/>
       </w:tblGrid>
       <w:tr>
-        <w:tblPrEx>
-          <w:tblCellMar>
-            <w:top w:w="0" w:type="dxa"/>
-            <w:bottom w:w="0" w:type="dxa"/>
-          </w:tblCellMar>
-        </w:tblPrEx>
         <w:trPr>
           <w:cantSplit/>
         </w:trPr>
@@ -7206,12 +6996,6 @@
         <w:gridCol w:w="1300"/>
       </w:tblGrid>
       <w:tr>
-        <w:tblPrEx>
-          <w:tblCellMar>
-            <w:top w:w="0" w:type="dxa"/>
-            <w:bottom w:w="0" w:type="dxa"/>
-          </w:tblCellMar>
-        </w:tblPrEx>
         <w:trPr>
           <w:cantSplit/>
         </w:trPr>
@@ -7383,12 +7167,6 @@
         <w:gridCol w:w="1300"/>
       </w:tblGrid>
       <w:tr>
-        <w:tblPrEx>
-          <w:tblCellMar>
-            <w:top w:w="0" w:type="dxa"/>
-            <w:bottom w:w="0" w:type="dxa"/>
-          </w:tblCellMar>
-        </w:tblPrEx>
         <w:trPr>
           <w:cantSplit/>
         </w:trPr>
@@ -7559,12 +7337,6 @@
         <w:gridCol w:w="1300"/>
       </w:tblGrid>
       <w:tr>
-        <w:tblPrEx>
-          <w:tblCellMar>
-            <w:top w:w="0" w:type="dxa"/>
-            <w:bottom w:w="0" w:type="dxa"/>
-          </w:tblCellMar>
-        </w:tblPrEx>
         <w:trPr>
           <w:cantSplit/>
         </w:trPr>
@@ -7735,12 +7507,6 @@
         <w:gridCol w:w="1300"/>
       </w:tblGrid>
       <w:tr>
-        <w:tblPrEx>
-          <w:tblCellMar>
-            <w:top w:w="0" w:type="dxa"/>
-            <w:bottom w:w="0" w:type="dxa"/>
-          </w:tblCellMar>
-        </w:tblPrEx>
         <w:trPr>
           <w:cantSplit/>
         </w:trPr>
@@ -7923,12 +7689,6 @@
         <w:gridCol w:w="1300"/>
       </w:tblGrid>
       <w:tr>
-        <w:tblPrEx>
-          <w:tblCellMar>
-            <w:top w:w="0" w:type="dxa"/>
-            <w:bottom w:w="0" w:type="dxa"/>
-          </w:tblCellMar>
-        </w:tblPrEx>
         <w:trPr>
           <w:cantSplit/>
         </w:trPr>
@@ -8107,12 +7867,6 @@
         <w:gridCol w:w="1300"/>
       </w:tblGrid>
       <w:tr>
-        <w:tblPrEx>
-          <w:tblCellMar>
-            <w:top w:w="0" w:type="dxa"/>
-            <w:bottom w:w="0" w:type="dxa"/>
-          </w:tblCellMar>
-        </w:tblPrEx>
         <w:trPr>
           <w:cantSplit/>
         </w:trPr>
@@ -8283,12 +8037,6 @@
         <w:gridCol w:w="1300"/>
       </w:tblGrid>
       <w:tr>
-        <w:tblPrEx>
-          <w:tblCellMar>
-            <w:top w:w="0" w:type="dxa"/>
-            <w:bottom w:w="0" w:type="dxa"/>
-          </w:tblCellMar>
-        </w:tblPrEx>
         <w:trPr>
           <w:cantSplit/>
         </w:trPr>
@@ -8459,12 +8207,6 @@
         <w:gridCol w:w="1300"/>
       </w:tblGrid>
       <w:tr>
-        <w:tblPrEx>
-          <w:tblCellMar>
-            <w:top w:w="0" w:type="dxa"/>
-            <w:bottom w:w="0" w:type="dxa"/>
-          </w:tblCellMar>
-        </w:tblPrEx>
         <w:trPr>
           <w:cantSplit/>
         </w:trPr>
@@ -8636,12 +8378,6 @@
         <w:gridCol w:w="1300"/>
       </w:tblGrid>
       <w:tr>
-        <w:tblPrEx>
-          <w:tblCellMar>
-            <w:top w:w="0" w:type="dxa"/>
-            <w:bottom w:w="0" w:type="dxa"/>
-          </w:tblCellMar>
-        </w:tblPrEx>
         <w:trPr>
           <w:cantSplit/>
         </w:trPr>
@@ -8812,12 +8548,6 @@
         <w:gridCol w:w="1300"/>
       </w:tblGrid>
       <w:tr>
-        <w:tblPrEx>
-          <w:tblCellMar>
-            <w:top w:w="0" w:type="dxa"/>
-            <w:bottom w:w="0" w:type="dxa"/>
-          </w:tblCellMar>
-        </w:tblPrEx>
         <w:trPr>
           <w:cantSplit/>
         </w:trPr>
@@ -8988,12 +8718,6 @@
         <w:gridCol w:w="1300"/>
       </w:tblGrid>
       <w:tr>
-        <w:tblPrEx>
-          <w:tblCellMar>
-            <w:top w:w="0" w:type="dxa"/>
-            <w:bottom w:w="0" w:type="dxa"/>
-          </w:tblCellMar>
-        </w:tblPrEx>
         <w:trPr>
           <w:cantSplit/>
         </w:trPr>
@@ -9168,12 +8892,6 @@
         <w:gridCol w:w="1300"/>
       </w:tblGrid>
       <w:tr>
-        <w:tblPrEx>
-          <w:tblCellMar>
-            <w:top w:w="0" w:type="dxa"/>
-            <w:bottom w:w="0" w:type="dxa"/>
-          </w:tblCellMar>
-        </w:tblPrEx>
         <w:trPr>
           <w:cantSplit/>
         </w:trPr>
@@ -9344,12 +9062,6 @@
         <w:gridCol w:w="1300"/>
       </w:tblGrid>
       <w:tr>
-        <w:tblPrEx>
-          <w:tblCellMar>
-            <w:top w:w="0" w:type="dxa"/>
-            <w:bottom w:w="0" w:type="dxa"/>
-          </w:tblCellMar>
-        </w:tblPrEx>
         <w:trPr>
           <w:cantSplit/>
         </w:trPr>
@@ -9520,12 +9232,6 @@
         <w:gridCol w:w="1300"/>
       </w:tblGrid>
       <w:tr>
-        <w:tblPrEx>
-          <w:tblCellMar>
-            <w:top w:w="0" w:type="dxa"/>
-            <w:bottom w:w="0" w:type="dxa"/>
-          </w:tblCellMar>
-        </w:tblPrEx>
         <w:trPr>
           <w:cantSplit/>
         </w:trPr>
@@ -9696,12 +9402,6 @@
         <w:gridCol w:w="1300"/>
       </w:tblGrid>
       <w:tr>
-        <w:tblPrEx>
-          <w:tblCellMar>
-            <w:top w:w="0" w:type="dxa"/>
-            <w:bottom w:w="0" w:type="dxa"/>
-          </w:tblCellMar>
-        </w:tblPrEx>
         <w:trPr>
           <w:cantSplit/>
         </w:trPr>
@@ -9881,12 +9581,6 @@
         <w:gridCol w:w="1300"/>
       </w:tblGrid>
       <w:tr>
-        <w:tblPrEx>
-          <w:tblCellMar>
-            <w:top w:w="0" w:type="dxa"/>
-            <w:bottom w:w="0" w:type="dxa"/>
-          </w:tblCellMar>
-        </w:tblPrEx>
         <w:trPr>
           <w:cantSplit/>
         </w:trPr>
@@ -10057,12 +9751,6 @@
         <w:gridCol w:w="1300"/>
       </w:tblGrid>
       <w:tr>
-        <w:tblPrEx>
-          <w:tblCellMar>
-            <w:top w:w="0" w:type="dxa"/>
-            <w:bottom w:w="0" w:type="dxa"/>
-          </w:tblCellMar>
-        </w:tblPrEx>
         <w:trPr>
           <w:cantSplit/>
         </w:trPr>
@@ -10233,12 +9921,6 @@
         <w:gridCol w:w="1300"/>
       </w:tblGrid>
       <w:tr>
-        <w:tblPrEx>
-          <w:tblCellMar>
-            <w:top w:w="0" w:type="dxa"/>
-            <w:bottom w:w="0" w:type="dxa"/>
-          </w:tblCellMar>
-        </w:tblPrEx>
         <w:trPr>
           <w:cantSplit/>
         </w:trPr>
@@ -10413,12 +10095,6 @@
         <w:gridCol w:w="1300"/>
       </w:tblGrid>
       <w:tr>
-        <w:tblPrEx>
-          <w:tblCellMar>
-            <w:top w:w="0" w:type="dxa"/>
-            <w:bottom w:w="0" w:type="dxa"/>
-          </w:tblCellMar>
-        </w:tblPrEx>
         <w:trPr>
           <w:cantSplit/>
         </w:trPr>
@@ -10589,12 +10265,6 @@
         <w:gridCol w:w="1300"/>
       </w:tblGrid>
       <w:tr>
-        <w:tblPrEx>
-          <w:tblCellMar>
-            <w:top w:w="0" w:type="dxa"/>
-            <w:bottom w:w="0" w:type="dxa"/>
-          </w:tblCellMar>
-        </w:tblPrEx>
         <w:trPr>
           <w:cantSplit/>
         </w:trPr>
@@ -10765,12 +10435,6 @@
         <w:gridCol w:w="1300"/>
       </w:tblGrid>
       <w:tr>
-        <w:tblPrEx>
-          <w:tblCellMar>
-            <w:top w:w="0" w:type="dxa"/>
-            <w:bottom w:w="0" w:type="dxa"/>
-          </w:tblCellMar>
-        </w:tblPrEx>
         <w:trPr>
           <w:cantSplit/>
         </w:trPr>
@@ -10941,12 +10605,6 @@
         <w:gridCol w:w="1300"/>
       </w:tblGrid>
       <w:tr>
-        <w:tblPrEx>
-          <w:tblCellMar>
-            <w:top w:w="0" w:type="dxa"/>
-            <w:bottom w:w="0" w:type="dxa"/>
-          </w:tblCellMar>
-        </w:tblPrEx>
         <w:trPr>
           <w:cantSplit/>
         </w:trPr>
@@ -11126,12 +10784,6 @@
         <w:gridCol w:w="1300"/>
       </w:tblGrid>
       <w:tr>
-        <w:tblPrEx>
-          <w:tblCellMar>
-            <w:top w:w="0" w:type="dxa"/>
-            <w:bottom w:w="0" w:type="dxa"/>
-          </w:tblCellMar>
-        </w:tblPrEx>
         <w:trPr>
           <w:cantSplit/>
         </w:trPr>
@@ -11276,7 +10928,10 @@
         <w:jc w:val="both"/>
       </w:pPr>
       <w:r>
-        <w:t>Rotas de fuga para evacuação em caso de enchente, ventos extremos ou rompimento de barragem não estão definidas nem sinalizadas nos bairros de Campo Grande, segundo a informação pública disponível, o que configura lacuna de preparação a ser confirmada junto à Defesa Civil municipal. A relevância do fator é concreta para as populações a jusante de barragens urbanas classificadas como de risco: o barramento do antigo Clube Atlântico possui classificação de risco alto e dano potencial associado alto no Relatório de Segurança de Barragens 2024-2025 da ANA, com cerca de 100 moradores a jusante, e o Lago do Amor e o Lageado constam de relatório do Imasul sobre barragens urbanas. O fator articula-se a E2-F33, E2-F39 e E5-F02, e a cartografia social é o instrumento adequado para traçar rotas com os moradores, considerando idosos, pessoas com deficiência e crianças (E3-F09, E3-F11).</w:t>
+        <w:t>Rotas de fuga para evacuação em caso de enchente, ventos extremos ou rompimento de barragem não estão definidas nem sinalizadas nos bairros de Campo Grande, segundo a informação pública disponível, o que configura lacuna de preparação a ser confirmada junto à Defesa Civil municipal.</w:t>
+      </w:r>
+      <w:r>
+        <w:t xml:space="preserve"> A relevância do fator é concreta para as populações a jusante de barragens urbanas classificadas como de risco: o barramento do antigo Clube Atlântico possui classificação de risco alto e dano potencial associado alto no Relatório de Segurança de Barragens 2024-2025 da ANA, com cerca de 100 moradores a jusante, e o Lago do Amor e o Lageado constam de relatório do Imasul sobre barragens urbanas. O fator articula-se a E2-F33, E2-F39 e E5-F02, e a cartografia social é o instrumento adequado para traçar rotas com os moradores, considerando idosos, pessoas com deficiência e crianças (E3-F09, E3-F11).</w:t>
       </w:r>
     </w:p>
     <w:tbl>
@@ -11302,12 +10957,6 @@
         <w:gridCol w:w="1300"/>
       </w:tblGrid>
       <w:tr>
-        <w:tblPrEx>
-          <w:tblCellMar>
-            <w:top w:w="0" w:type="dxa"/>
-            <w:bottom w:w="0" w:type="dxa"/>
-          </w:tblCellMar>
-        </w:tblPrEx>
         <w:trPr>
           <w:cantSplit/>
         </w:trPr>
@@ -11478,12 +11127,6 @@
         <w:gridCol w:w="1300"/>
       </w:tblGrid>
       <w:tr>
-        <w:tblPrEx>
-          <w:tblCellMar>
-            <w:top w:w="0" w:type="dxa"/>
-            <w:bottom w:w="0" w:type="dxa"/>
-          </w:tblCellMar>
-        </w:tblPrEx>
         <w:trPr>
           <w:cantSplit/>
         </w:trPr>
@@ -11666,12 +11309,6 @@
         <w:gridCol w:w="1300"/>
       </w:tblGrid>
       <w:tr>
-        <w:tblPrEx>
-          <w:tblCellMar>
-            <w:top w:w="0" w:type="dxa"/>
-            <w:bottom w:w="0" w:type="dxa"/>
-          </w:tblCellMar>
-        </w:tblPrEx>
         <w:trPr>
           <w:cantSplit/>
         </w:trPr>
@@ -11850,12 +11487,6 @@
         <w:gridCol w:w="1300"/>
       </w:tblGrid>
       <w:tr>
-        <w:tblPrEx>
-          <w:tblCellMar>
-            <w:top w:w="0" w:type="dxa"/>
-            <w:bottom w:w="0" w:type="dxa"/>
-          </w:tblCellMar>
-        </w:tblPrEx>
         <w:trPr>
           <w:cantSplit/>
         </w:trPr>
@@ -12034,12 +11665,6 @@
         <w:gridCol w:w="1300"/>
       </w:tblGrid>
       <w:tr>
-        <w:tblPrEx>
-          <w:tblCellMar>
-            <w:top w:w="0" w:type="dxa"/>
-            <w:bottom w:w="0" w:type="dxa"/>
-          </w:tblCellMar>
-        </w:tblPrEx>
         <w:trPr>
           <w:cantSplit/>
         </w:trPr>
@@ -12210,12 +11835,6 @@
         <w:gridCol w:w="1300"/>
       </w:tblGrid>
       <w:tr>
-        <w:tblPrEx>
-          <w:tblCellMar>
-            <w:top w:w="0" w:type="dxa"/>
-            <w:bottom w:w="0" w:type="dxa"/>
-          </w:tblCellMar>
-        </w:tblPrEx>
         <w:trPr>
           <w:cantSplit/>
         </w:trPr>
@@ -12387,12 +12006,6 @@
         <w:gridCol w:w="1300"/>
       </w:tblGrid>
       <w:tr>
-        <w:tblPrEx>
-          <w:tblCellMar>
-            <w:top w:w="0" w:type="dxa"/>
-            <w:bottom w:w="0" w:type="dxa"/>
-          </w:tblCellMar>
-        </w:tblPrEx>
         <w:trPr>
           <w:cantSplit/>
         </w:trPr>
@@ -12563,12 +12176,6 @@
         <w:gridCol w:w="1300"/>
       </w:tblGrid>
       <w:tr>
-        <w:tblPrEx>
-          <w:tblCellMar>
-            <w:top w:w="0" w:type="dxa"/>
-            <w:bottom w:w="0" w:type="dxa"/>
-          </w:tblCellMar>
-        </w:tblPrEx>
         <w:trPr>
           <w:cantSplit/>
         </w:trPr>
@@ -12755,12 +12362,6 @@
         <w:gridCol w:w="1300"/>
       </w:tblGrid>
       <w:tr>
-        <w:tblPrEx>
-          <w:tblCellMar>
-            <w:top w:w="0" w:type="dxa"/>
-            <w:bottom w:w="0" w:type="dxa"/>
-          </w:tblCellMar>
-        </w:tblPrEx>
         <w:trPr>
           <w:cantSplit/>
         </w:trPr>
@@ -12943,12 +12544,6 @@
         <w:gridCol w:w="1300"/>
       </w:tblGrid>
       <w:tr>
-        <w:tblPrEx>
-          <w:tblCellMar>
-            <w:top w:w="0" w:type="dxa"/>
-            <w:bottom w:w="0" w:type="dxa"/>
-          </w:tblCellMar>
-        </w:tblPrEx>
         <w:trPr>
           <w:cantSplit/>
         </w:trPr>
@@ -13119,12 +12714,6 @@
         <w:gridCol w:w="1300"/>
       </w:tblGrid>
       <w:tr>
-        <w:tblPrEx>
-          <w:tblCellMar>
-            <w:top w:w="0" w:type="dxa"/>
-            <w:bottom w:w="0" w:type="dxa"/>
-          </w:tblCellMar>
-        </w:tblPrEx>
         <w:trPr>
           <w:cantSplit/>
         </w:trPr>
@@ -13295,12 +12884,6 @@
         <w:gridCol w:w="1300"/>
       </w:tblGrid>
       <w:tr>
-        <w:tblPrEx>
-          <w:tblCellMar>
-            <w:top w:w="0" w:type="dxa"/>
-            <w:bottom w:w="0" w:type="dxa"/>
-          </w:tblCellMar>
-        </w:tblPrEx>
         <w:trPr>
           <w:cantSplit/>
         </w:trPr>
@@ -13479,12 +13062,6 @@
         <w:gridCol w:w="1300"/>
       </w:tblGrid>
       <w:tr>
-        <w:tblPrEx>
-          <w:tblCellMar>
-            <w:top w:w="0" w:type="dxa"/>
-            <w:bottom w:w="0" w:type="dxa"/>
-          </w:tblCellMar>
-        </w:tblPrEx>
         <w:trPr>
           <w:cantSplit/>
         </w:trPr>
@@ -13630,7 +13207,7 @@
         <w:jc w:val="both"/>
       </w:pPr>
       <w:r>
-        <w:t>Pontos de encontro para emergências, definidos e conhecidos pela população, não foram identificados nas informações públicas disponíveis sobre Campo Grande, o que configura lacuna de preparação a ser confirmada com a Defesa Civil. No vendaval de setembro de 2026, escolas e unidades de saúde, que seriam candidatas naturais a pontos de encontro, foram elas próprias atingidas, com 26 escolas destelhadas, o que demonstra a necessidade de avaliar a segurança estrutural das edificações antes de designá-las. Igrejas, centros comunitários e equipamentos esportivos com estrutura adequada podem compor a rede (E6-F16, E5-F25). O fator articula-se a E5-F01, E2-F26 e E2-F32, e a definição dos pontos deve ser feita com os moradores na cartografia social, considerando acessibilidade para pessoas com deficiência e idosos (E3-F11) e a localização das populações expostas a alagamentos e barragens.</w:t>
+        <w:t>No vendaval de setembro de 2026, escolas e unidades de saúde, que seriam candidatas naturais a pontos de encontro, foram elas próprias atingidas, com 26 escolas destelhadas, o que demonstra a necessidade de avaliar a segurança estrutural das edificações antes de designá-las. Igrejas, centros comunitários e equipamentos esportivos com estrutura adequada podem compor a rede (E6-F16, E5-F25). O fator articula-se a E5-F01, E2-F26 e E2-F32, e a definição dos pontos deve ser feita com os moradores na cartografia social, considerando acessibilidade para pessoas com deficiência e idosos (E3-F11) e a localização das populações expostas a alagamentos e barragens.</w:t>
       </w:r>
     </w:p>
     <w:p>
@@ -13668,12 +13245,6 @@
         <w:gridCol w:w="9354"/>
       </w:tblGrid>
       <w:tr>
-        <w:tblPrEx>
-          <w:tblCellMar>
-            <w:top w:w="0" w:type="dxa"/>
-            <w:bottom w:w="0" w:type="dxa"/>
-          </w:tblCellMar>
-        </w:tblPrEx>
         <w:tc>
           <w:tcPr>
             <w:tcW w:w="9354" w:type="dxa"/>
@@ -13710,12 +13281,6 @@
         </w:tc>
       </w:tr>
       <w:tr>
-        <w:tblPrEx>
-          <w:tblCellMar>
-            <w:top w:w="0" w:type="dxa"/>
-            <w:bottom w:w="0" w:type="dxa"/>
-          </w:tblCellMar>
-        </w:tblPrEx>
         <w:tc>
           <w:tcPr>
             <w:tcW w:w="9354" w:type="dxa"/>
@@ -13750,12 +13315,6 @@
         </w:tc>
       </w:tr>
       <w:tr>
-        <w:tblPrEx>
-          <w:tblCellMar>
-            <w:top w:w="0" w:type="dxa"/>
-            <w:bottom w:w="0" w:type="dxa"/>
-          </w:tblCellMar>
-        </w:tblPrEx>
         <w:tc>
           <w:tcPr>
             <w:tcW w:w="9354" w:type="dxa"/>
@@ -13790,12 +13349,6 @@
         </w:tc>
       </w:tr>
       <w:tr>
-        <w:tblPrEx>
-          <w:tblCellMar>
-            <w:top w:w="0" w:type="dxa"/>
-            <w:bottom w:w="0" w:type="dxa"/>
-          </w:tblCellMar>
-        </w:tblPrEx>
         <w:tc>
           <w:tcPr>
             <w:tcW w:w="9354" w:type="dxa"/>
@@ -13870,12 +13423,6 @@
         <w:gridCol w:w="1300"/>
       </w:tblGrid>
       <w:tr>
-        <w:tblPrEx>
-          <w:tblCellMar>
-            <w:top w:w="0" w:type="dxa"/>
-            <w:bottom w:w="0" w:type="dxa"/>
-          </w:tblCellMar>
-        </w:tblPrEx>
         <w:trPr>
           <w:cantSplit/>
         </w:trPr>
@@ -14054,12 +13601,6 @@
         <w:gridCol w:w="1300"/>
       </w:tblGrid>
       <w:tr>
-        <w:tblPrEx>
-          <w:tblCellMar>
-            <w:top w:w="0" w:type="dxa"/>
-            <w:bottom w:w="0" w:type="dxa"/>
-          </w:tblCellMar>
-        </w:tblPrEx>
         <w:trPr>
           <w:cantSplit/>
         </w:trPr>
@@ -14238,12 +13779,6 @@
         <w:gridCol w:w="1300"/>
       </w:tblGrid>
       <w:tr>
-        <w:tblPrEx>
-          <w:tblCellMar>
-            <w:top w:w="0" w:type="dxa"/>
-            <w:bottom w:w="0" w:type="dxa"/>
-          </w:tblCellMar>
-        </w:tblPrEx>
         <w:trPr>
           <w:cantSplit/>
         </w:trPr>
@@ -14415,12 +13950,6 @@
         <w:gridCol w:w="1300"/>
       </w:tblGrid>
       <w:tr>
-        <w:tblPrEx>
-          <w:tblCellMar>
-            <w:top w:w="0" w:type="dxa"/>
-            <w:bottom w:w="0" w:type="dxa"/>
-          </w:tblCellMar>
-        </w:tblPrEx>
         <w:trPr>
           <w:cantSplit/>
         </w:trPr>
@@ -14591,12 +14120,6 @@
         <w:gridCol w:w="1300"/>
       </w:tblGrid>
       <w:tr>
-        <w:tblPrEx>
-          <w:tblCellMar>
-            <w:top w:w="0" w:type="dxa"/>
-            <w:bottom w:w="0" w:type="dxa"/>
-          </w:tblCellMar>
-        </w:tblPrEx>
         <w:trPr>
           <w:cantSplit/>
         </w:trPr>
@@ -14741,7 +14264,13 @@
         <w:jc w:val="both"/>
       </w:pPr>
       <w:r>
-        <w:t>A propriedade e o controle da terra pelas mulheres em Campo Grande devem ser analisados em duas escalas. Na zona rural e nos assentamentos de reforma agrária, a titulação conjunta ou preferencial às mulheres, prevista na legislação agrária, deve ser verificada nos registros do INCRA. Na zona urbana, a regularização fundiária de núcleos informais e os programas habitacionais podem priorizar a titulação em nome das mulheres, conforme a Lei nº 13.465/2017 e as regras dos programas federais de habitação de interesse social. A ausência de dados municipais desagregados por sexo sobre titularidade de imóveis regularizados constitui lacuna. A titularidade feminina reduz a vulnerabilidade em situações de violência doméstica (E3-F02) e separação, e amplia o acesso a crédito (E1-F22). O fator articula-se a E5-F22 e E3-F19, e o plano popular deve incluir a perspectiva de gênero nos processos de regularização fundiária.</w:t>
+        <w:t xml:space="preserve">A propriedade e o controle da terra pelas mulheres em Campo Grande devem ser analisados em duas escalas. Na zona rural e nos assentamentos de reforma agrária, a titulação conjunta ou preferencial às mulheres, prevista na legislação agrária, deve ser verificada nos registros do INCRA. Na zona urbana, a regularização fundiária de núcleos informais e os programas habitacionais podem priorizar a titulação em nome das mulheres, conforme a Lei nº 13.465/2017 e as regras dos programas federais de habitação de interesse </w:t>
+      </w:r>
+      <w:r>
+        <w:t>social. A ausência de dados municipais desagregados por sexo sobre titularidade de imóveis regularizados constitui lacuna. A</w:t>
+      </w:r>
+      <w:r>
+        <w:t xml:space="preserve"> titularidade feminina reduz a vulnerabilidade em situações de violência doméstica (E3-F02) e separação, e amplia o acesso a crédito (E1-F22). O fator articula-se a E5-F22 e E3-F19, e o plano popular deve incluir a perspectiva de gênero nos processos de regularização fundiária.</w:t>
       </w:r>
     </w:p>
     <w:tbl>
@@ -14767,12 +14296,6 @@
         <w:gridCol w:w="1300"/>
       </w:tblGrid>
       <w:tr>
-        <w:tblPrEx>
-          <w:tblCellMar>
-            <w:top w:w="0" w:type="dxa"/>
-            <w:bottom w:w="0" w:type="dxa"/>
-          </w:tblCellMar>
-        </w:tblPrEx>
         <w:trPr>
           <w:cantSplit/>
         </w:trPr>
@@ -14947,12 +14470,6 @@
         <w:gridCol w:w="1300"/>
       </w:tblGrid>
       <w:tr>
-        <w:tblPrEx>
-          <w:tblCellMar>
-            <w:top w:w="0" w:type="dxa"/>
-            <w:bottom w:w="0" w:type="dxa"/>
-          </w:tblCellMar>
-        </w:tblPrEx>
         <w:trPr>
           <w:cantSplit/>
         </w:trPr>
@@ -15097,7 +14614,13 @@
         <w:jc w:val="both"/>
       </w:pPr>
       <w:r>
-        <w:t>O tráfico de pessoas tem relevância regional para Campo Grande em razão da posição do estado na fronteira com Paraguai e Bolívia e da circulação de migrantes, trabalhadores sazonais e populações indígenas. As modalidades de maior risco são a exploração sexual, o trabalho em condições análogas às de escravidão (E1-F15) e o aliciamento de adolescentes. O Núcleo de Enfrentamento ao Tráfico de Pessoas do estado e a Polícia Federal concentram as investigações, mas a subnotificação é estrutural. A presença de 17,1% de estrangeiros entre as pessoas em situação de rua recenseadas em 2025 (GT-PSR) indica grupo exposto a redes de exploração. Na ausência de dados municipais sistematizados, o fator é tratado como lacuna de informação e risco provável. Articula-se a E3-F13 e E3-F14, e as equipes de APS, Consultório na Rua e assistência social devem ser capacitadas para reconhecer sinais de tráfico e acionar a rede de proteção.</w:t>
+        <w:t>O tráfico de pessoas tem relevância regional para Campo Grande em razão da posição do estado na fronteira com Paraguai e Bolívia e da circulação de migrantes, trabalhadores sazonais e populações indígenas. As modalidades de maior risco são a exploração sexual, o trabalho em condições análogas às de escravidão (E1-F15) e o aliciamento de adolescentes. O Núcleo de Enfrentamento ao Tráfico de Pessoas do estado e a Polícia Federal concentram as investigações, mas a subnotificação é estrutural. A presença de 17,1% de estrangeiros entre as pessoas em situação de rua recenseadas em 2025 (GT-PSR) indica grupo exposto a redes de exploração</w:t>
+      </w:r>
+      <w:r>
+        <w:t>. Na ausência de dados municipais sistematizados, o fator é tratado como lacuna de informação e risco provável. Articula</w:t>
+      </w:r>
+      <w:r>
+        <w:t>-se a E3-F13 e E3-F14, e as equipes de APS, Consultório na Rua e assistência social devem ser capacitadas para reconhecer sinais de tráfico e acionar a rede de proteção.</w:t>
       </w:r>
     </w:p>
     <w:tbl>
@@ -15123,12 +14646,6 @@
         <w:gridCol w:w="1300"/>
       </w:tblGrid>
       <w:tr>
-        <w:tblPrEx>
-          <w:tblCellMar>
-            <w:top w:w="0" w:type="dxa"/>
-            <w:bottom w:w="0" w:type="dxa"/>
-          </w:tblCellMar>
-        </w:tblPrEx>
         <w:trPr>
           <w:cantSplit/>
         </w:trPr>
@@ -15299,12 +14816,6 @@
         <w:gridCol w:w="1300"/>
       </w:tblGrid>
       <w:tr>
-        <w:tblPrEx>
-          <w:tblCellMar>
-            <w:top w:w="0" w:type="dxa"/>
-            <w:bottom w:w="0" w:type="dxa"/>
-          </w:tblCellMar>
-        </w:tblPrEx>
         <w:trPr>
           <w:cantSplit/>
         </w:trPr>
@@ -15475,12 +14986,6 @@
         <w:gridCol w:w="1300"/>
       </w:tblGrid>
       <w:tr>
-        <w:tblPrEx>
-          <w:tblCellMar>
-            <w:top w:w="0" w:type="dxa"/>
-            <w:bottom w:w="0" w:type="dxa"/>
-          </w:tblCellMar>
-        </w:tblPrEx>
         <w:trPr>
           <w:cantSplit/>
         </w:trPr>
@@ -15652,12 +15157,6 @@
         <w:gridCol w:w="1300"/>
       </w:tblGrid>
       <w:tr>
-        <w:tblPrEx>
-          <w:tblCellMar>
-            <w:top w:w="0" w:type="dxa"/>
-            <w:bottom w:w="0" w:type="dxa"/>
-          </w:tblCellMar>
-        </w:tblPrEx>
         <w:trPr>
           <w:cantSplit/>
         </w:trPr>
@@ -15828,12 +15327,6 @@
         <w:gridCol w:w="1300"/>
       </w:tblGrid>
       <w:tr>
-        <w:tblPrEx>
-          <w:tblCellMar>
-            <w:top w:w="0" w:type="dxa"/>
-            <w:bottom w:w="0" w:type="dxa"/>
-          </w:tblCellMar>
-        </w:tblPrEx>
         <w:trPr>
           <w:cantSplit/>
         </w:trPr>
@@ -16004,12 +15497,6 @@
         <w:gridCol w:w="1300"/>
       </w:tblGrid>
       <w:tr>
-        <w:tblPrEx>
-          <w:tblCellMar>
-            <w:top w:w="0" w:type="dxa"/>
-            <w:bottom w:w="0" w:type="dxa"/>
-          </w:tblCellMar>
-        </w:tblPrEx>
         <w:trPr>
           <w:cantSplit/>
         </w:trPr>
@@ -16184,12 +15671,6 @@
         <w:gridCol w:w="1300"/>
       </w:tblGrid>
       <w:tr>
-        <w:tblPrEx>
-          <w:tblCellMar>
-            <w:top w:w="0" w:type="dxa"/>
-            <w:bottom w:w="0" w:type="dxa"/>
-          </w:tblCellMar>
-        </w:tblPrEx>
         <w:trPr>
           <w:cantSplit/>
         </w:trPr>
@@ -16360,12 +15841,6 @@
         <w:gridCol w:w="1300"/>
       </w:tblGrid>
       <w:tr>
-        <w:tblPrEx>
-          <w:tblCellMar>
-            <w:top w:w="0" w:type="dxa"/>
-            <w:bottom w:w="0" w:type="dxa"/>
-          </w:tblCellMar>
-        </w:tblPrEx>
         <w:trPr>
           <w:cantSplit/>
         </w:trPr>
@@ -16544,12 +16019,6 @@
         <w:gridCol w:w="1300"/>
       </w:tblGrid>
       <w:tr>
-        <w:tblPrEx>
-          <w:tblCellMar>
-            <w:top w:w="0" w:type="dxa"/>
-            <w:bottom w:w="0" w:type="dxa"/>
-          </w:tblCellMar>
-        </w:tblPrEx>
         <w:trPr>
           <w:cantSplit/>
         </w:trPr>
@@ -16694,7 +16163,7 @@
         <w:jc w:val="both"/>
       </w:pPr>
       <w:r>
-        <w:t>O racismo ambiental expressa-se em Campo Grande na concentração das exposições ambientais adversas em territórios de maior proporção de população negra, indígena e de baixa renda: fundos de vale sujeitos a alagamento (E2-F34), margens de córregos receptores de esgoto não tratado (E2-F21), áreas periféricas com menor arborização e drenagem, e aldeias urbanas indígenas instaladas em áreas de infraestrutura precária. A cartografia dessas sobreposições, cruzando dados do Censo 2022 por setor censitário com mapas de risco e de saneamento, não foi realizada para o município e constitui lacuna analítica relevante. O fator, incorporado à matriz com o ODS 18 de Igualdade Étnico-Racial, permite nomear como injustiça estrutural o que frequentemente é tratado como acaso geográfico. Articula-se a E3-F16, E3-F19, E2-F01 e E5-F24, e orienta a priorização de investimentos em saneamento e drenagem pelos territórios mais expostos.</w:t>
+        <w:t>O racismo ambiental expressa-se em Campo Grande na concentração das exposições ambientais adversas em territórios de maior proporção de população negra, indígena e de baixa renda: fundos de vale sujeitos a alagamento (E2-F34), margens de córregos receptores de esgoto não tratado (E2-F21), áreas periféricas com menor arborização e drenagem, e aldeias urbanas indígenas instaladas em áreas de infraestrutura precária. O fator, incorporado à matriz com o ODS 18 de Igualdade Étnico-Racial, permite nomear como injustiça estrutural o que frequentemente é tratado como acaso geográfico. Articula-se a E3-F16, E3-F19, E2-F01 e E5-F24, e orienta a priorização de investimentos em saneamento e drenagem pelos territórios mais expostos.</w:t>
       </w:r>
     </w:p>
     <w:tbl>
@@ -16720,12 +16189,6 @@
         <w:gridCol w:w="1300"/>
       </w:tblGrid>
       <w:tr>
-        <w:tblPrEx>
-          <w:tblCellMar>
-            <w:top w:w="0" w:type="dxa"/>
-            <w:bottom w:w="0" w:type="dxa"/>
-          </w:tblCellMar>
-        </w:tblPrEx>
         <w:trPr>
           <w:cantSplit/>
         </w:trPr>
@@ -16897,12 +16360,6 @@
         <w:gridCol w:w="1300"/>
       </w:tblGrid>
       <w:tr>
-        <w:tblPrEx>
-          <w:tblCellMar>
-            <w:top w:w="0" w:type="dxa"/>
-            <w:bottom w:w="0" w:type="dxa"/>
-          </w:tblCellMar>
-        </w:tblPrEx>
         <w:trPr>
           <w:cantSplit/>
         </w:trPr>
@@ -17093,12 +16550,6 @@
         <w:gridCol w:w="9354"/>
       </w:tblGrid>
       <w:tr>
-        <w:tblPrEx>
-          <w:tblCellMar>
-            <w:top w:w="0" w:type="dxa"/>
-            <w:bottom w:w="0" w:type="dxa"/>
-          </w:tblCellMar>
-        </w:tblPrEx>
         <w:tc>
           <w:tcPr>
             <w:tcW w:w="9354" w:type="dxa"/>
@@ -17135,12 +16586,6 @@
         </w:tc>
       </w:tr>
       <w:tr>
-        <w:tblPrEx>
-          <w:tblCellMar>
-            <w:top w:w="0" w:type="dxa"/>
-            <w:bottom w:w="0" w:type="dxa"/>
-          </w:tblCellMar>
-        </w:tblPrEx>
         <w:tc>
           <w:tcPr>
             <w:tcW w:w="9354" w:type="dxa"/>
@@ -17175,12 +16620,6 @@
         </w:tc>
       </w:tr>
       <w:tr>
-        <w:tblPrEx>
-          <w:tblCellMar>
-            <w:top w:w="0" w:type="dxa"/>
-            <w:bottom w:w="0" w:type="dxa"/>
-          </w:tblCellMar>
-        </w:tblPrEx>
         <w:tc>
           <w:tcPr>
             <w:tcW w:w="9354" w:type="dxa"/>
@@ -17215,12 +16654,6 @@
         </w:tc>
       </w:tr>
       <w:tr>
-        <w:tblPrEx>
-          <w:tblCellMar>
-            <w:top w:w="0" w:type="dxa"/>
-            <w:bottom w:w="0" w:type="dxa"/>
-          </w:tblCellMar>
-        </w:tblPrEx>
         <w:tc>
           <w:tcPr>
             <w:tcW w:w="9354" w:type="dxa"/>
@@ -17287,12 +16720,6 @@
         <w:gridCol w:w="1300"/>
       </w:tblGrid>
       <w:tr>
-        <w:tblPrEx>
-          <w:tblCellMar>
-            <w:top w:w="0" w:type="dxa"/>
-            <w:bottom w:w="0" w:type="dxa"/>
-          </w:tblCellMar>
-        </w:tblPrEx>
         <w:trPr>
           <w:cantSplit/>
         </w:trPr>
@@ -17471,12 +16898,6 @@
         <w:gridCol w:w="1300"/>
       </w:tblGrid>
       <w:tr>
-        <w:tblPrEx>
-          <w:tblCellMar>
-            <w:top w:w="0" w:type="dxa"/>
-            <w:bottom w:w="0" w:type="dxa"/>
-          </w:tblCellMar>
-        </w:tblPrEx>
         <w:trPr>
           <w:cantSplit/>
         </w:trPr>
@@ -17621,7 +17042,7 @@
         <w:jc w:val="both"/>
       </w:pPr>
       <w:r>
-        <w:t>A gestão de bancos de sementes em Campo Grande tem expressão limitada a iniciativas de agricultores familiares, assentamentos e comunidades indígenas que conservam sementes crioulas e variedades tradicionais, sem registro municipal ou apoio institucional sistemático. A Embrapa Gado de Corte, sediada na capital, e as universidades locais detêm acervos e competência técnica em recursos genéticos que poderiam apoiar iniciativas comunitárias. A manutenção de sementes adaptadas ao Cerrado tem valor estratégico diante da intensificação de estiagens e calor (E2-F30), pois amplia a resiliência da produção familiar. Nas aldeias urbanas Terena, a guarda de sementes associa-se a práticas alimentares e culturais (E4-F18). A inexistência de inventário dessas iniciativas é lacuna que a cartografia social pode suprir. O fator articula-se a E1-F03, E1-F04 e E1-F26, e experiências como a de bancos comunitários de sementes acompanhados pela PICAPS em outros territórios podem orientar a ação local.</w:t>
+        <w:t>A gestão de bancos de sementes em Campo Grande tem expressão limitada a iniciativas de agricultores familiares, assentamentos e comunidades indígenas que conservam sementes crioulas e variedades tradicionais, sem registro municipal ou apoio institucional sistemático. A Embrapa Gado de Corte, sediada na capital, e as universidades locais detêm acervos e competência técnica em recursos genéticos que poderiam apoiar iniciativas comunitárias. A manutenção de sementes adaptadas ao Cerrado tem valor estratégico diante da intensificação de estiagens e calor (E2-F30), pois amplia a resiliência da produção familiar. Nas aldeias urbanas Terena, a guarda de sementes associa-se a práticas alimentares e culturais (E4-F18). O fator articula-se a E1-F03, E1-F04 e E1-F26, e experiências como a de bancos comunitários de sementes acompanhados pela PICAPS em outros territórios podem orientar a ação local.</w:t>
       </w:r>
     </w:p>
     <w:tbl>
@@ -17647,12 +17068,6 @@
         <w:gridCol w:w="1300"/>
       </w:tblGrid>
       <w:tr>
-        <w:tblPrEx>
-          <w:tblCellMar>
-            <w:top w:w="0" w:type="dxa"/>
-            <w:bottom w:w="0" w:type="dxa"/>
-          </w:tblCellMar>
-        </w:tblPrEx>
         <w:trPr>
           <w:cantSplit/>
         </w:trPr>
@@ -17824,12 +17239,6 @@
         <w:gridCol w:w="1300"/>
       </w:tblGrid>
       <w:tr>
-        <w:tblPrEx>
-          <w:tblCellMar>
-            <w:top w:w="0" w:type="dxa"/>
-            <w:bottom w:w="0" w:type="dxa"/>
-          </w:tblCellMar>
-        </w:tblPrEx>
         <w:trPr>
           <w:cantSplit/>
         </w:trPr>
@@ -18000,12 +17409,6 @@
         <w:gridCol w:w="1300"/>
       </w:tblGrid>
       <w:tr>
-        <w:tblPrEx>
-          <w:tblCellMar>
-            <w:top w:w="0" w:type="dxa"/>
-            <w:bottom w:w="0" w:type="dxa"/>
-          </w:tblCellMar>
-        </w:tblPrEx>
         <w:trPr>
           <w:cantSplit/>
         </w:trPr>
@@ -18150,7 +17553,16 @@
         <w:jc w:val="both"/>
       </w:pPr>
       <w:r>
-        <w:t>As tecnologias sociais em Campo Grande incluem cisternas e sistemas de captação de água de chuva, biodigestores, fossas ecológicas, hortas verticais e soluções de construção de baixo custo, aplicadas em iniciativas de extensão universitária, organizações da sociedade civil e assentamentos rurais, sem programa municipal que as difunda de forma sistemática. A relevância dessas tecnologias aumenta com a recorrência de eventos extremos: captação de chuva reduz a dependência do abastecimento em estiagens (E2-F30), e técnicas simples de reforço de coberturas reduzem danos em vendavais (E2-F17). A ausência de inventário municipal de tecnologias sociais em uso constitui lacuna. O fator articula-se a E5-F10, que trata da formação para criar e usar essas soluções, a E4-F24 e a E1-F23, e o plano popular pode prever a seleção, com a comunidade, de tecnologias sociais prioritárias para cada território.</w:t>
+        <w:t xml:space="preserve">As tecnologias sociais em Campo Grande incluem cisternas e sistemas de captação de água de chuva, biodigestores, fossas ecológicas, hortas verticais e soluções de construção de baixo custo, aplicadas em iniciativas de extensão universitária, organizações da sociedade civil e </w:t>
+      </w:r>
+      <w:r>
+        <w:t>assentamentos rurais, sem programa municipal que as difunda de forma sistemática. A relevância dessas tecnologias aumenta com a recorrência de eventos extremos: captação de chuva reduz a dependência do abastecimento em estiagens (E2-F30), e técnicas simples de reforço de coberturas reduzem danos em vendavais (E2-F17). A ausência de inventário municipal de tecnologias sociais em uso constitui lacuna</w:t>
+      </w:r>
+      <w:r>
+        <w:t xml:space="preserve"> relevante</w:t>
+      </w:r>
+      <w:r>
+        <w:t>. O fator articula-se a E5-F10, que trata da formação para criar e usar essas soluções, a E4-F24 e a E1-F23, e o plano popular pode prever a seleção, com a comunidade, de tecnologias sociais prioritárias para cada território.</w:t>
       </w:r>
     </w:p>
     <w:tbl>
@@ -18176,12 +17588,6 @@
         <w:gridCol w:w="1300"/>
       </w:tblGrid>
       <w:tr>
-        <w:tblPrEx>
-          <w:tblCellMar>
-            <w:top w:w="0" w:type="dxa"/>
-            <w:bottom w:w="0" w:type="dxa"/>
-          </w:tblCellMar>
-        </w:tblPrEx>
         <w:trPr>
           <w:cantSplit/>
         </w:trPr>
@@ -18364,12 +17770,6 @@
         <w:gridCol w:w="1300"/>
       </w:tblGrid>
       <w:tr>
-        <w:tblPrEx>
-          <w:tblCellMar>
-            <w:top w:w="0" w:type="dxa"/>
-            <w:bottom w:w="0" w:type="dxa"/>
-          </w:tblCellMar>
-        </w:tblPrEx>
         <w:trPr>
           <w:cantSplit/>
         </w:trPr>
@@ -18540,12 +17940,6 @@
         <w:gridCol w:w="1300"/>
       </w:tblGrid>
       <w:tr>
-        <w:tblPrEx>
-          <w:tblCellMar>
-            <w:top w:w="0" w:type="dxa"/>
-            <w:bottom w:w="0" w:type="dxa"/>
-          </w:tblCellMar>
-        </w:tblPrEx>
         <w:trPr>
           <w:cantSplit/>
         </w:trPr>
@@ -18690,7 +18084,10 @@
         <w:jc w:val="both"/>
       </w:pPr>
       <w:r>
-        <w:t xml:space="preserve">As tecnologias ambientalmente corretas em uso em Campo Grande concentram-se no setor privado e em domicílios de renda média e alta, com expansão da geração solar distribuída favorecida pela alta irradiação regional. Nos serviços públicos, a adoção é pontual: a instalação de geração solar em unidades de saúde e escolas, que reduziria custos e garantiria funcionamento em interrupções de energia como a de setembro de 2026, não está organizada em programa municipal, segundo a informação pública disponível. Tecnologias de tratamento de esgoto descentralizado, </w:t>
+        <w:t xml:space="preserve">As tecnologias ambientalmente corretas em uso em Campo Grande concentram-se no setor privado e em domicílios de renda média e alta, com expansão da geração solar distribuída favorecida pela alta irradiação regional. Nos </w:t>
+      </w:r>
+      <w:r>
+        <w:t xml:space="preserve">serviços públicos, a adoção é pontual: a instalação de geração solar em unidades de saúde e escolas, que reduziria custos e garantiria funcionamento em interrupções de energia como a de setembro de 2026, não está organizada em programa municipal, segundo a informação pública disponível. Tecnologias de tratamento de esgoto descentralizado, </w:t>
       </w:r>
       <w:proofErr w:type="spellStart"/>
       <w:r>
@@ -18698,7 +18095,7 @@
       </w:r>
       <w:proofErr w:type="spellEnd"/>
       <w:r>
-        <w:t xml:space="preserve"> de água e iluminação pública eficiente têm aplicação potencial nas áreas de expansão. O fator articula-se a E4-F24, que trata do acesso a essas tecnologias pelas populações que delas mais necessitam, a E5-F14 e a E1-F23, e o diagnóstico registra como lacuna a inexistência de inventário municipal de tecnologias ambientais nos equipamentos públicos.</w:t>
+        <w:t xml:space="preserve"> de água e iluminação pública eficiente têm aplicação potencial nas áreas de expansão. O fator articula-se a E4-F24, que trata do acesso a essas tecnologias pelas populações que delas mais necessitam, a E5-F14 e a E1-F23.</w:t>
       </w:r>
     </w:p>
     <w:tbl>
@@ -18724,12 +18121,6 @@
         <w:gridCol w:w="1300"/>
       </w:tblGrid>
       <w:tr>
-        <w:tblPrEx>
-          <w:tblCellMar>
-            <w:top w:w="0" w:type="dxa"/>
-            <w:bottom w:w="0" w:type="dxa"/>
-          </w:tblCellMar>
-        </w:tblPrEx>
         <w:trPr>
           <w:cantSplit/>
         </w:trPr>
@@ -18932,12 +18323,6 @@
         <w:gridCol w:w="1300"/>
       </w:tblGrid>
       <w:tr>
-        <w:tblPrEx>
-          <w:tblCellMar>
-            <w:top w:w="0" w:type="dxa"/>
-            <w:bottom w:w="0" w:type="dxa"/>
-          </w:tblCellMar>
-        </w:tblPrEx>
         <w:trPr>
           <w:cantSplit/>
         </w:trPr>
@@ -18971,7 +18356,6 @@
                 <w:bCs/>
                 <w:color w:val="FFFFFF"/>
               </w:rPr>
-              <w:lastRenderedPageBreak/>
               <w:t>E4-F10</w:t>
             </w:r>
           </w:p>
@@ -19091,7 +18475,11 @@
       </w:r>
       <w:proofErr w:type="gramEnd"/>
       <w:r>
-        <w:t xml:space="preserve"> autoriza obras emergenciais com dispensa de licitação por até um ano. A forma como escolas, unidades de saúde, rede elétrica e arborização forem reconstruídas determinará a vulnerabilidade da cidade aos próximos eventos: reconstruir com os mesmos padrões reproduz o risco. A substituição de árvores caídas por espécies adequadas ao espaço urbano, o reforço de coberturas, o enterramento seletivo de redes elétricas em trechos críticos e a revisão da drenagem são componentes de uma reconstrução resiliente. O fator articula-se a E4-F07, E1-F29, E5-F20 e E4-F25, e o plano popular deve propor que as obras financiadas pela </w:t>
+        <w:t xml:space="preserve"> autoriza obras emergenciais com dispensa de </w:t>
+      </w:r>
+      <w:r>
+        <w:lastRenderedPageBreak/>
+        <w:t xml:space="preserve">licitação por até um ano. A forma como escolas, unidades de saúde, rede elétrica e arborização forem reconstruídas determinará a vulnerabilidade da cidade aos próximos eventos: reconstruir com os mesmos padrões reproduz o risco. A substituição de árvores caídas por espécies adequadas ao espaço urbano, o reforço de coberturas, o enterramento seletivo de redes elétricas em trechos críticos e a revisão da drenagem são componentes de uma reconstrução resiliente. O fator articula-se a E4-F07, E1-F29, E5-F20 e E4-F25, e o plano popular deve propor que as obras financiadas pela </w:t>
       </w:r>
       <w:proofErr w:type="gramStart"/>
       <w:r>
@@ -19125,12 +18513,6 @@
         <w:gridCol w:w="1300"/>
       </w:tblGrid>
       <w:tr>
-        <w:tblPrEx>
-          <w:tblCellMar>
-            <w:top w:w="0" w:type="dxa"/>
-            <w:bottom w:w="0" w:type="dxa"/>
-          </w:tblCellMar>
-        </w:tblPrEx>
         <w:trPr>
           <w:cantSplit/>
         </w:trPr>
@@ -19301,12 +18683,6 @@
         <w:gridCol w:w="1300"/>
       </w:tblGrid>
       <w:tr>
-        <w:tblPrEx>
-          <w:tblCellMar>
-            <w:top w:w="0" w:type="dxa"/>
-            <w:bottom w:w="0" w:type="dxa"/>
-          </w:tblCellMar>
-        </w:tblPrEx>
         <w:trPr>
           <w:cantSplit/>
         </w:trPr>
@@ -19477,12 +18853,6 @@
         <w:gridCol w:w="1300"/>
       </w:tblGrid>
       <w:tr>
-        <w:tblPrEx>
-          <w:tblCellMar>
-            <w:top w:w="0" w:type="dxa"/>
-            <w:bottom w:w="0" w:type="dxa"/>
-          </w:tblCellMar>
-        </w:tblPrEx>
         <w:trPr>
           <w:cantSplit/>
         </w:trPr>
@@ -19627,11 +18997,7 @@
         <w:jc w:val="both"/>
       </w:pPr>
       <w:r>
-        <w:t xml:space="preserve">Campo Grande não possui costa marítima e não tem relação direta com a gestão de oceanos e recursos marinhos, razão pela qual o fator é tratado pela via da interface indireta, conforme as notas metodológicas. O município integra a bacia do rio Paraná por meio do córrego Anhanduí e do rio Pardo, e a qualidade das águas que deixa o território, afetada pelo lançamento de esgoto não tratado e pela carga de sedimentos e </w:t>
-      </w:r>
-      <w:r>
-        <w:lastRenderedPageBreak/>
-        <w:t>agroquímicos, contribui para a condição dos sistemas hídricos a jusante e, em última instância, dos ambientes estuarinos e costeiros. O consumo urbano de pescado de origem marinha e o descarte de plásticos e resíduos que alcançam a rede de drenagem são as outras interfaces. O fator articula-se a E4-F04 e E2-F21, e sua relevância para o planejamento local reside na responsabilidade do município pela qualidade da água que exporta para a bacia.</w:t>
+        <w:t>Campo Grande não possui costa marítima e não tem relação direta com a gestão de oceanos e recursos marinhos, razão pela qual o fator é tratado pela via da interface indireta, conforme as notas metodológicas. O município integra a bacia do rio Paraná por meio do córrego Anhanduí e do rio Pardo, e a qualidade das águas que deixa o território, afetada pelo lançamento de esgoto não tratado e pela carga de sedimentos e agroquímicos, contribui para a condição dos sistemas hídricos a jusante e, em última instância, dos ambientes estuarinos e costeiros. O consumo urbano de pescado de origem marinha e o descarte de plásticos e resíduos que alcançam a rede de drenagem são as outras interfaces. O fator articula-se a E4-F04 e E2-F21, e sua relevância para o planejamento local reside na responsabilidade do município pela qualidade da água que exporta para a bacia.</w:t>
       </w:r>
     </w:p>
     <w:tbl>
@@ -19657,12 +19023,6 @@
         <w:gridCol w:w="1300"/>
       </w:tblGrid>
       <w:tr>
-        <w:tblPrEx>
-          <w:tblCellMar>
-            <w:top w:w="0" w:type="dxa"/>
-            <w:bottom w:w="0" w:type="dxa"/>
-          </w:tblCellMar>
-        </w:tblPrEx>
         <w:trPr>
           <w:cantSplit/>
         </w:trPr>
@@ -19696,6 +19056,7 @@
                 <w:bCs/>
                 <w:color w:val="FFFFFF"/>
               </w:rPr>
+              <w:lastRenderedPageBreak/>
               <w:t>E4-F14</w:t>
             </w:r>
           </w:p>
@@ -19807,7 +19168,13 @@
         <w:jc w:val="both"/>
       </w:pPr>
       <w:r>
-        <w:t>A pesquisa científica voltada à recuperação de ambientes degradados em Campo Grande é conduzida pela UFMS, pela UCDB e pela Embrapa em temas como recuperação de áreas degradadas do Cerrado, monitoramento de córregos urbanos e manejo de pastagens. A aplicação desse conhecimento à restauração dos córregos urbanos, à recuperação de voçorocas em áreas de expansão e à recomposição da arborização após o vendaval de 2026 é oportunidade concreta de cooperação entre universidades e poder público. A participação comunitária no monitoramento, por meio de ciência cidadã e da cartografia social, amplia a capacidade de acompanhamento. O fator articula-se a E4-F06, E4-F04, E4-F25 e E6-F04, e o diagnóstico registra como lacuna a inexistência de programa municipal de recuperação ambiental com base em evidências e metas de restauração por microbacia.</w:t>
+        <w:t xml:space="preserve">A pesquisa científica voltada à recuperação de ambientes degradados em Campo Grande é conduzida pela UFMS, pela UCDB e pela Embrapa em temas como recuperação de áreas degradadas do Cerrado, monitoramento de córregos urbanos e manejo de pastagens. A aplicação desse conhecimento à restauração dos córregos urbanos, à recuperação de voçorocas em áreas de expansão e à recomposição da arborização após o vendaval de 2026 é oportunidade concreta de cooperação entre universidades e poder público. A participação comunitária no monitoramento, por meio de ciência cidadã e da cartografia social, amplia a capacidade de acompanhamento. </w:t>
+      </w:r>
+      <w:r>
+        <w:t>O fator articula-se a E4-F06, E4-F04, E4-F25 e E6-F04</w:t>
+      </w:r>
+      <w:r>
+        <w:t>.</w:t>
       </w:r>
     </w:p>
     <w:tbl>
@@ -19833,12 +19200,6 @@
         <w:gridCol w:w="1300"/>
       </w:tblGrid>
       <w:tr>
-        <w:tblPrEx>
-          <w:tblCellMar>
-            <w:top w:w="0" w:type="dxa"/>
-            <w:bottom w:w="0" w:type="dxa"/>
-          </w:tblCellMar>
-        </w:tblPrEx>
         <w:trPr>
           <w:cantSplit/>
         </w:trPr>
@@ -20009,12 +19370,6 @@
         <w:gridCol w:w="1300"/>
       </w:tblGrid>
       <w:tr>
-        <w:tblPrEx>
-          <w:tblCellMar>
-            <w:top w:w="0" w:type="dxa"/>
-            <w:bottom w:w="0" w:type="dxa"/>
-          </w:tblCellMar>
-        </w:tblPrEx>
         <w:trPr>
           <w:cantSplit/>
         </w:trPr>
@@ -20185,12 +19540,6 @@
         <w:gridCol w:w="1300"/>
       </w:tblGrid>
       <w:tr>
-        <w:tblPrEx>
-          <w:tblCellMar>
-            <w:top w:w="0" w:type="dxa"/>
-            <w:bottom w:w="0" w:type="dxa"/>
-          </w:tblCellMar>
-        </w:tblPrEx>
         <w:trPr>
           <w:cantSplit/>
         </w:trPr>
@@ -20224,7 +19573,6 @@
                 <w:bCs/>
                 <w:color w:val="FFFFFF"/>
               </w:rPr>
-              <w:lastRenderedPageBreak/>
               <w:t>E4-F17</w:t>
             </w:r>
           </w:p>
@@ -20336,7 +19684,11 @@
         <w:jc w:val="both"/>
       </w:pPr>
       <w:r>
-        <w:t>A gestão dos recursos naturais em Campo Grande envolve a secretaria municipal de meio ambiente, o Imasul e o IBAMA, com instrumentos como o licenciamento ambiental, o Cadastro Ambiental Rural, as unidades de conservação municipais e o zoneamento do Plano Diretor. A capacidade de fiscalização é insuficiente frente à expansão urbana sobre áreas sensíveis e às pressões sobre os mananciais. A gestão de barragens urbanas é exemplo das fragilidades: laudos técnicos apontam desde 2024 problemas estruturais na barragem do antigo Clube Atlântico, de responsabilidade privada, objeto de inquérito civil do Ministério Público estadual. O fator, que na Matriz v1.0.2 reúne a gestão de ecossistemas terrestres e aquáticos, fauna e produtos químicos, articula-se a E4-F04, E4-F16, E4-F22 e E5-F15, e o plano popular deve fortalecer a participação social nos conselhos ambientais e no acompanhamento do licenciamento.</w:t>
+        <w:t xml:space="preserve">A gestão dos recursos naturais em Campo Grande envolve a secretaria municipal de meio ambiente, o Imasul e o IBAMA, com instrumentos como o licenciamento ambiental, o Cadastro Ambiental Rural, as unidades de conservação municipais e o zoneamento do Plano Diretor. A capacidade de fiscalização é insuficiente frente à expansão urbana sobre áreas sensíveis e às pressões sobre os mananciais. A gestão de barragens urbanas é exemplo das fragilidades: laudos técnicos apontam desde 2024 problemas estruturais na barragem do antigo Clube Atlântico, de responsabilidade privada, objeto de inquérito civil do Ministério Público estadual. O fator, que na Matriz v1.0.2 reúne a gestão de ecossistemas terrestres e aquáticos, fauna </w:t>
+      </w:r>
+      <w:r>
+        <w:lastRenderedPageBreak/>
+        <w:t>e produtos químicos, articula-se a E4-F04, E4-F16, E4-F22 e E5-F15, e o plano popular deve fortalecer a participação social nos conselhos ambientais e no acompanhamento do licenciamento.</w:t>
       </w:r>
     </w:p>
     <w:tbl>
@@ -20362,12 +19714,6 @@
         <w:gridCol w:w="1300"/>
       </w:tblGrid>
       <w:tr>
-        <w:tblPrEx>
-          <w:tblCellMar>
-            <w:top w:w="0" w:type="dxa"/>
-            <w:bottom w:w="0" w:type="dxa"/>
-          </w:tblCellMar>
-        </w:tblPrEx>
         <w:trPr>
           <w:cantSplit/>
         </w:trPr>
@@ -20546,12 +19892,6 @@
         <w:gridCol w:w="1300"/>
       </w:tblGrid>
       <w:tr>
-        <w:tblPrEx>
-          <w:tblCellMar>
-            <w:top w:w="0" w:type="dxa"/>
-            <w:bottom w:w="0" w:type="dxa"/>
-          </w:tblCellMar>
-        </w:tblPrEx>
         <w:trPr>
           <w:cantSplit/>
         </w:trPr>
@@ -20722,12 +20062,6 @@
         <w:gridCol w:w="1300"/>
       </w:tblGrid>
       <w:tr>
-        <w:tblPrEx>
-          <w:tblCellMar>
-            <w:top w:w="0" w:type="dxa"/>
-            <w:bottom w:w="0" w:type="dxa"/>
-          </w:tblCellMar>
-        </w:tblPrEx>
         <w:trPr>
           <w:cantSplit/>
         </w:trPr>
@@ -20872,11 +20206,7 @@
         <w:jc w:val="both"/>
       </w:pPr>
       <w:r>
-        <w:t xml:space="preserve">O tráfico de fauna e flora silvestres afeta Mato Grosso do Sul em razão da biodiversidade do Pantanal e do Cerrado e da posição de fronteira, e Campo Grande funciona como ponto de trânsito e destino de animais capturados ilegalmente, como aves, répteis e peixes ornamentais, segundo registros de apreensões da </w:t>
-      </w:r>
-      <w:r>
-        <w:lastRenderedPageBreak/>
-        <w:t>Polícia Militar Ambiental e do IBAMA. A pesca ilegal nos rios do estado é componente do mesmo fenômeno. Os dados de autos de infração e apreensões por município, disponíveis nos órgãos de fiscalização, devem ser consultados para dimensionar a ocorrência local, não sistematizados nesta versão. O tráfico ameaça espécies, introduz riscos sanitários associados a zoonoses e alimenta redes criminosas que podem se sobrepor a outras atividades ilícitas (E6-F06). O fator articula-se a E4-F19 e E4-F15, e a educação ambiental (E4-F11) e os canais de denúncia comunitária são componentes da prevenção.</w:t>
+        <w:t>O tráfico de fauna e flora silvestres afeta Mato Grosso do Sul em razão da biodiversidade do Pantanal e do Cerrado e da posição de fronteira, e Campo Grande funciona como ponto de trânsito e destino de animais capturados ilegalmente, como aves, répteis e peixes ornamentais, segundo registros de apreensões da Polícia Militar Ambiental e do IBAMA. A pesca ilegal nos rios do estado é componente do mesmo fenômeno. Os dados de autos de infração e apreensões por município, disponíveis nos órgãos de fiscalização, devem ser consultados para dimensionar a ocorrência local, não sistematizados nesta versão. O tráfico ameaça espécies, introduz riscos sanitários associados a zoonoses e alimenta redes criminosas que podem se sobrepor a outras atividades ilícitas (E6-F06). O fator articula-se a E4-F19 e E4-F15, e a educação ambiental (E4-F11) e os canais de denúncia comunitária são componentes da prevenção.</w:t>
       </w:r>
     </w:p>
     <w:tbl>
@@ -20902,12 +20232,6 @@
         <w:gridCol w:w="1300"/>
       </w:tblGrid>
       <w:tr>
-        <w:tblPrEx>
-          <w:tblCellMar>
-            <w:top w:w="0" w:type="dxa"/>
-            <w:bottom w:w="0" w:type="dxa"/>
-          </w:tblCellMar>
-        </w:tblPrEx>
         <w:trPr>
           <w:cantSplit/>
         </w:trPr>
@@ -20941,6 +20265,7 @@
                 <w:bCs/>
                 <w:color w:val="FFFFFF"/>
               </w:rPr>
+              <w:lastRenderedPageBreak/>
               <w:t>E4-F21</w:t>
             </w:r>
           </w:p>
@@ -21078,12 +20403,6 @@
         <w:gridCol w:w="1300"/>
       </w:tblGrid>
       <w:tr>
-        <w:tblPrEx>
-          <w:tblCellMar>
-            <w:top w:w="0" w:type="dxa"/>
-            <w:bottom w:w="0" w:type="dxa"/>
-          </w:tblCellMar>
-        </w:tblPrEx>
         <w:trPr>
           <w:cantSplit/>
         </w:trPr>
@@ -21228,7 +20547,13 @@
         <w:jc w:val="both"/>
       </w:pPr>
       <w:r>
-        <w:t>A gestão da biodiversidade para o desenvolvimento e a redução da pobreza em Campo Grande tem potencial ainda pouco explorado em atividades como turismo de natureza e observação de aves, produção de mudas nativas para restauração, extrativismo sustentável de espécies do Cerrado e serviços ambientais em propriedades rurais. Essas atividades podem gerar renda para agricultores familiares, comunidades tradicionais e trabalhadores urbanos, desde que acompanhadas de formação, crédito e mercado. Os parques urbanos e as unidades de conservação municipais oferecem base para iniciativas de educação e turismo com participação comunitária. A inexistência de programa municipal que articule conservação e geração de renda constitui lacuna de política pública. O fator articula-se a E1-F23, E4-F25, E4-F01 e E4-F18, e o plano popular pode identificar, com a comunidade, cadeias da sociobiodiversidade viáveis no território.</w:t>
+        <w:t xml:space="preserve">A gestão da biodiversidade para o desenvolvimento e a redução da pobreza em Campo Grande tem potencial ainda pouco explorado em atividades como turismo de natureza e observação de aves, produção de mudas nativas para restauração, extrativismo sustentável de espécies do Cerrado e serviços ambientais em propriedades rurais. Essas atividades podem gerar renda para agricultores familiares, comunidades tradicionais e trabalhadores urbanos, desde que acompanhadas de formação, crédito e mercado. Os parques urbanos e as unidades de conservação municipais oferecem base para iniciativas de educação e turismo com participação comunitária. </w:t>
+      </w:r>
+      <w:r>
+        <w:t>A inexistência de programa municipal que articule conservação e geração de renda constitui lacuna de política pública. O</w:t>
+      </w:r>
+      <w:r>
+        <w:t xml:space="preserve"> fator articula-se a E1-F23, E4-F25, E4-F01 e E4-F18, e o plano popular pode identificar, com a comunidade, cadeias da sociobiodiversidade viáveis no território.</w:t>
       </w:r>
     </w:p>
     <w:tbl>
@@ -21254,12 +20579,6 @@
         <w:gridCol w:w="1300"/>
       </w:tblGrid>
       <w:tr>
-        <w:tblPrEx>
-          <w:tblCellMar>
-            <w:top w:w="0" w:type="dxa"/>
-            <w:bottom w:w="0" w:type="dxa"/>
-          </w:tblCellMar>
-        </w:tblPrEx>
         <w:trPr>
           <w:cantSplit/>
         </w:trPr>
@@ -21438,12 +20757,6 @@
         <w:gridCol w:w="1300"/>
       </w:tblGrid>
       <w:tr>
-        <w:tblPrEx>
-          <w:tblCellMar>
-            <w:top w:w="0" w:type="dxa"/>
-            <w:bottom w:w="0" w:type="dxa"/>
-          </w:tblCellMar>
-        </w:tblPrEx>
         <w:trPr>
           <w:cantSplit/>
         </w:trPr>
@@ -21477,7 +20790,6 @@
                 <w:bCs/>
                 <w:color w:val="FFFFFF"/>
               </w:rPr>
-              <w:lastRenderedPageBreak/>
               <w:t>E4-F25</w:t>
             </w:r>
           </w:p>
@@ -21589,7 +20901,11 @@
         <w:jc w:val="both"/>
       </w:pPr>
       <w:r>
-        <w:t>O reflorestamento em Campo Grande é conduzido de forma pontual por programas municipais de arborização, compensações ambientais de empreendimentos e iniciativas de organizações da sociedade civil, sem meta municipal de recomposição de matas ciliares por microbacia. A restauração das áreas de preservação permanente dos córregos urbanos é a prioridade funcional, pela relação direta com a qualidade da água, o controle de enchentes e a redução das ilhas de calor. A perda de árvores no vendaval de setembro de 2026 cria necessidade e oportunidade de replantio planejado, com espécies nativas adequadas ao espaço urbano e manejo preventivo (E4-F21). A cobertura arbórea por região urbana, que tende a ser menor nas periferias, deve ser medida com base em imagens de satélite, dado não sistematizado nesta versão. O fator articula-se a E4-F16, E4-F04 e E4-F10, e mutirões comunitários de plantio (E6-F05) favorecem a apropriação social das áreas recuperadas.</w:t>
+        <w:t xml:space="preserve">O reflorestamento em Campo Grande é conduzido de forma pontual por programas municipais de arborização, compensações ambientais de empreendimentos e iniciativas de organizações da sociedade civil, sem meta municipal de recomposição de matas ciliares por microbacia. A restauração das áreas de preservação permanente dos córregos urbanos é a prioridade funcional, pela relação direta com a qualidade </w:t>
+      </w:r>
+      <w:r>
+        <w:lastRenderedPageBreak/>
+        <w:t>da água, o controle de enchentes e a redução das ilhas de calor. A perda de árvores no vendaval de setembro de 2026 cria necessidade e oportunidade de replantio planejado, com espécies nativas adequadas ao espaço urbano e manejo preventivo (E4-F21). A cobertura arbórea por região urbana, que tende a ser menor nas periferias, deve ser medida com base em imagens de satélite, dado não sistematizado nesta versão. O fator articula-se a E4-F16, E4-F04 e E4-F10, e mutirões comunitários de plantio (E6-F05) favorecem a apropriação social das áreas recuperadas.</w:t>
       </w:r>
     </w:p>
     <w:p>
@@ -21627,12 +20943,6 @@
         <w:gridCol w:w="9354"/>
       </w:tblGrid>
       <w:tr>
-        <w:tblPrEx>
-          <w:tblCellMar>
-            <w:top w:w="0" w:type="dxa"/>
-            <w:bottom w:w="0" w:type="dxa"/>
-          </w:tblCellMar>
-        </w:tblPrEx>
         <w:tc>
           <w:tcPr>
             <w:tcW w:w="9354" w:type="dxa"/>
@@ -21669,12 +20979,6 @@
         </w:tc>
       </w:tr>
       <w:tr>
-        <w:tblPrEx>
-          <w:tblCellMar>
-            <w:top w:w="0" w:type="dxa"/>
-            <w:bottom w:w="0" w:type="dxa"/>
-          </w:tblCellMar>
-        </w:tblPrEx>
         <w:tc>
           <w:tcPr>
             <w:tcW w:w="9354" w:type="dxa"/>
@@ -21709,12 +21013,6 @@
         </w:tc>
       </w:tr>
       <w:tr>
-        <w:tblPrEx>
-          <w:tblCellMar>
-            <w:top w:w="0" w:type="dxa"/>
-            <w:bottom w:w="0" w:type="dxa"/>
-          </w:tblCellMar>
-        </w:tblPrEx>
         <w:tc>
           <w:tcPr>
             <w:tcW w:w="9354" w:type="dxa"/>
@@ -21749,12 +21047,6 @@
         </w:tc>
       </w:tr>
       <w:tr>
-        <w:tblPrEx>
-          <w:tblCellMar>
-            <w:top w:w="0" w:type="dxa"/>
-            <w:bottom w:w="0" w:type="dxa"/>
-          </w:tblCellMar>
-        </w:tblPrEx>
         <w:tc>
           <w:tcPr>
             <w:tcW w:w="9354" w:type="dxa"/>
@@ -21821,12 +21113,6 @@
         <w:gridCol w:w="1300"/>
       </w:tblGrid>
       <w:tr>
-        <w:tblPrEx>
-          <w:tblCellMar>
-            <w:top w:w="0" w:type="dxa"/>
-            <w:bottom w:w="0" w:type="dxa"/>
-          </w:tblCellMar>
-        </w:tblPrEx>
         <w:trPr>
           <w:cantSplit/>
         </w:trPr>
@@ -21971,7 +21257,7 @@
         <w:jc w:val="both"/>
       </w:pPr>
       <w:r>
-        <w:t>A disponibilidade de abrigos para emergências em Campo Grande não está documentada em plano de contingência de acesso público, segundo a informação disponível, o que configura lacuna de preparação a ser verificada junto à Defesa Civil municipal. A rede potencial inclui escolas, ginásios, centros comunitários e igrejas, mas o vendaval de 10 de setembro de 2026, que destelhou 26 escolas municipais segundo a Prefeitura, demonstra que a designação de abrigos exige avaliação prévia de segurança estrutural das edificações. Os serviços de acolhimento institucional da assistência social, dimensionados para a população em situação de rua de 1.476 pessoas recenseadas pelo GT-PSR em 2025 (escala municipal), operam no limite e não comportam deslocamentos em massa. O fator articula-se a E2-F39, E6-F16, E3-F14 e E4-F07, e o plano popular deve mapear, com a comunidade, edificações seguras por região urbana e acordos prévios com organizações religiosas e comunitárias para seu uso em emergências.</w:t>
+        <w:t>A rede potencial inclui escolas, ginásios, centros comunitários e igrejas, mas o vendaval de 10 de setembro de 2026, que destelhou 26 escolas municipais segundo a Prefeitura, demonstra que a designação de abrigos exige avaliação prévia de segurança estrutural das edificações. Os serviços de acolhimento institucional da assistência social, dimensionados para a população em situação de rua de 1.476 pessoas recenseadas pelo GT-PSR em 2025 (escala municipal), operam no limite e não comportam deslocamentos em massa. O fator articula-se a E2-F39, E6-F16, E3-F14 e E4-F07, e o plano popular deve mapear, com a comunidade, edificações seguras por região urbana e acordos prévios com organizações religiosas e comunitárias para seu uso em emergências.</w:t>
       </w:r>
     </w:p>
     <w:tbl>
@@ -21997,12 +21283,6 @@
         <w:gridCol w:w="1300"/>
       </w:tblGrid>
       <w:tr>
-        <w:tblPrEx>
-          <w:tblCellMar>
-            <w:top w:w="0" w:type="dxa"/>
-            <w:bottom w:w="0" w:type="dxa"/>
-          </w:tblCellMar>
-        </w:tblPrEx>
         <w:trPr>
           <w:cantSplit/>
         </w:trPr>
@@ -22173,12 +21453,6 @@
         <w:gridCol w:w="1300"/>
       </w:tblGrid>
       <w:tr>
-        <w:tblPrEx>
-          <w:tblCellMar>
-            <w:top w:w="0" w:type="dxa"/>
-            <w:bottom w:w="0" w:type="dxa"/>
-          </w:tblCellMar>
-        </w:tblPrEx>
         <w:trPr>
           <w:cantSplit/>
         </w:trPr>
@@ -22324,7 +21598,7 @@
         <w:jc w:val="both"/>
       </w:pPr>
       <w:r>
-        <w:t>Campo Grande é atravessada ou contornada pelas rodovias federais BR-163 e BR-262, corredores de escoamento de grãos, combustíveis, fertilizantes e agroquímicos, e abriga terminais de distribuição de combustíveis, o que configura exposição a acidentes com produtos perigosos em áreas próximas a bairros residenciais. Os registros de acidentes com cargas perigosas no município, mantidos pela Polícia Rodoviária Federal, pelo Corpo de Bombeiros e pelos órgãos ambientais, não foram sistematizados nesta versão e constituem lacuna de informação. O plano de contingência para acidentes com produtos perigosos, previsto no Plano Nacional de Prevenção, Preparação e Resposta Rápida a Emergências Ambientais com Produtos Químicos Perigosos, deve ser verificado no âmbito municipal. O fator articula-se a E2-F11, E5-F15, E2-F21 e E2-F33, e a cartografia social pode identificar trechos de tráfego pesado próximos a escolas, unidades de saúde e moradias.</w:t>
+        <w:t>Campo Grande é atravessada ou contornada pelas rodovias federais BR-163 e BR-262, corredores de escoamento de grãos, combustíveis, fertilizantes e agroquímicos, e abriga terminais de distribuição de combustíveis, o que configura exposição a acidentes com produtos perigosos em áreas próximas a bairros residenciais. O plano de contingência para acidentes com produtos perigosos, previsto no Plano Nacional de Prevenção, Preparação e Resposta Rápida a Emergências Ambientais com Produtos Químicos Perigosos, deve ser verificado no âmbito municipal. O fator articula-se a E2-F11, E5-F15, E2-F21 e E2-F33, e a cartografia social pode identificar trechos de tráfego pesado próximos a escolas, unidades de saúde e moradias.</w:t>
       </w:r>
     </w:p>
     <w:tbl>
@@ -22350,12 +21624,6 @@
         <w:gridCol w:w="1300"/>
       </w:tblGrid>
       <w:tr>
-        <w:tblPrEx>
-          <w:tblCellMar>
-            <w:top w:w="0" w:type="dxa"/>
-            <w:bottom w:w="0" w:type="dxa"/>
-          </w:tblCellMar>
-        </w:tblPrEx>
         <w:trPr>
           <w:cantSplit/>
         </w:trPr>
@@ -22526,12 +21794,6 @@
         <w:gridCol w:w="1300"/>
       </w:tblGrid>
       <w:tr>
-        <w:tblPrEx>
-          <w:tblCellMar>
-            <w:top w:w="0" w:type="dxa"/>
-            <w:bottom w:w="0" w:type="dxa"/>
-          </w:tblCellMar>
-        </w:tblPrEx>
         <w:trPr>
           <w:cantSplit/>
         </w:trPr>
@@ -22702,12 +21964,6 @@
         <w:gridCol w:w="1300"/>
       </w:tblGrid>
       <w:tr>
-        <w:tblPrEx>
-          <w:tblCellMar>
-            <w:top w:w="0" w:type="dxa"/>
-            <w:bottom w:w="0" w:type="dxa"/>
-          </w:tblCellMar>
-        </w:tblPrEx>
         <w:trPr>
           <w:cantSplit/>
         </w:trPr>
@@ -22852,11 +22108,11 @@
         <w:jc w:val="both"/>
       </w:pPr>
       <w:r>
-        <w:t xml:space="preserve">Campo Grande concentra a maior oferta de educação superior de Mato Grosso do Sul, com a Universidade Federal de Mato Grosso do Sul, a Universidade Estadual de Mato Grosso do Sul, a Universidade Católica Dom Bosco, o Instituto Federal e instituições privadas, incluindo cursos de graduação e pós-graduação em todas as profissões da saúde. A presença dessas instituições sustenta a formação da força de trabalho do </w:t>
+        <w:t xml:space="preserve">Campo Grande concentra a maior oferta de educação superior de Mato Grosso do Sul, com a Universidade Federal de Mato Grosso do Sul, a Universidade Estadual de Mato Grosso do Sul, a Universidade Católica Dom Bosco, o Instituto Federal e instituições privadas, incluindo cursos de graduação e pós-graduação em todas as profissões da saúde. A presença dessas instituições sustenta a formação da força de trabalho do SUS municipal (E2-F16) e a capacidade de pesquisa local (E4-F06). O acesso de estudantes negros, indígenas e de baixa renda depende das políticas de ação afirmativa, das bolsas (E5-F11) e das condições </w:t>
       </w:r>
       <w:r>
         <w:lastRenderedPageBreak/>
-        <w:t>SUS municipal (E2-F16) e a capacidade de pesquisa local (E4-F06). O acesso de estudantes negros, indígenas e de baixa renda depende das políticas de ação afirmativa, das bolsas (E5-F11) e das condições de permanência. Os dados de matrícula por cor ou raça e origem escolar, disponíveis no Censo da Educação Superior do INEP, devem ser incorporados ao diagnóstico. O fator articula-se a E5-F11 e E6-F04, e a extensão universitária é via de articulação com os territórios.</w:t>
+        <w:t>de permanência. Os dados de matrícula por cor ou raça e origem escolar, disponíveis no Censo da Educação Superior do INEP, devem ser incorporados ao diagnóstico. O fator articula-se a E5-F11 e E6-F04, e a extensão universitária é via de articulação com os territórios.</w:t>
       </w:r>
     </w:p>
     <w:tbl>
@@ -22882,12 +22138,6 @@
         <w:gridCol w:w="1300"/>
       </w:tblGrid>
       <w:tr>
-        <w:tblPrEx>
-          <w:tblCellMar>
-            <w:top w:w="0" w:type="dxa"/>
-            <w:bottom w:w="0" w:type="dxa"/>
-          </w:tblCellMar>
-        </w:tblPrEx>
         <w:trPr>
           <w:cantSplit/>
         </w:trPr>
@@ -23058,12 +22308,6 @@
         <w:gridCol w:w="1300"/>
       </w:tblGrid>
       <w:tr>
-        <w:tblPrEx>
-          <w:tblCellMar>
-            <w:top w:w="0" w:type="dxa"/>
-            <w:bottom w:w="0" w:type="dxa"/>
-          </w:tblCellMar>
-        </w:tblPrEx>
         <w:trPr>
           <w:cantSplit/>
         </w:trPr>
@@ -23234,12 +22478,6 @@
         <w:gridCol w:w="1300"/>
       </w:tblGrid>
       <w:tr>
-        <w:tblPrEx>
-          <w:tblCellMar>
-            <w:top w:w="0" w:type="dxa"/>
-            <w:bottom w:w="0" w:type="dxa"/>
-          </w:tblCellMar>
-        </w:tblPrEx>
         <w:trPr>
           <w:cantSplit/>
         </w:trPr>
@@ -23392,7 +22630,7 @@
       </w:r>
       <w:proofErr w:type="spellEnd"/>
       <w:r>
-        <w:t>, hortas, biodigestores, coberturas mais resistentes e soluções de drenagem de baixo custo amplia a autonomia comunitária e gera oportunidades de trabalho. A experiência dos eventos extremos de 2025 e 2026 confere urgência à formação em técnicas de adaptação e reconstrução (E4-F10). A inexistência de dados sobre cursos e egressos nessa área constitui lacuna de informação. O fator articula-se a E4-F05, E4-F24, E1-F09 e E5-F16, e o plano popular pode associar a formação de pesquisadores populares à formação técnica em tecnologias sociais prioritárias para cada território.</w:t>
+        <w:t>, hortas, biodigestores, coberturas mais resistentes e soluções de drenagem de baixo custo amplia a autonomia comunitária e gera oportunidades de trabalho. A experiência dos eventos extremos de 2025 e 2026 confere urgência à formação em técnicas de adaptação e reconstrução (E4-F10). O fator articula-se a E4-F05, E4-F24, E1-F09 e E5-F16, e o plano popular pode associar a formação de pesquisadores populares à formação técnica em tecnologias sociais prioritárias para cada território.</w:t>
       </w:r>
     </w:p>
     <w:tbl>
@@ -23418,12 +22656,6 @@
         <w:gridCol w:w="1300"/>
       </w:tblGrid>
       <w:tr>
-        <w:tblPrEx>
-          <w:tblCellMar>
-            <w:top w:w="0" w:type="dxa"/>
-            <w:bottom w:w="0" w:type="dxa"/>
-          </w:tblCellMar>
-        </w:tblPrEx>
         <w:trPr>
           <w:cantSplit/>
         </w:trPr>
@@ -23595,12 +22827,6 @@
         <w:gridCol w:w="1300"/>
       </w:tblGrid>
       <w:tr>
-        <w:tblPrEx>
-          <w:tblCellMar>
-            <w:top w:w="0" w:type="dxa"/>
-            <w:bottom w:w="0" w:type="dxa"/>
-          </w:tblCellMar>
-        </w:tblPrEx>
         <w:trPr>
           <w:cantSplit/>
         </w:trPr>
@@ -23771,12 +22997,6 @@
         <w:gridCol w:w="1300"/>
       </w:tblGrid>
       <w:tr>
-        <w:tblPrEx>
-          <w:tblCellMar>
-            <w:top w:w="0" w:type="dxa"/>
-            <w:bottom w:w="0" w:type="dxa"/>
-          </w:tblCellMar>
-        </w:tblPrEx>
         <w:trPr>
           <w:cantSplit/>
         </w:trPr>
@@ -23959,12 +23179,6 @@
         <w:gridCol w:w="1300"/>
       </w:tblGrid>
       <w:tr>
-        <w:tblPrEx>
-          <w:tblCellMar>
-            <w:top w:w="0" w:type="dxa"/>
-            <w:bottom w:w="0" w:type="dxa"/>
-          </w:tblCellMar>
-        </w:tblPrEx>
         <w:trPr>
           <w:cantSplit/>
         </w:trPr>
@@ -24113,7 +23327,13 @@
       </w:r>
       <w:r>
         <w:lastRenderedPageBreak/>
-        <w:t>equipamentos em interrupções como a de setembro de 2026. Programas de geração compartilhada em conjuntos habitacionais e comunidades poderiam reduzir o peso da conta de energia no orçamento das famílias de menor renda. O fator articula-se a E4-F08, E4-F24 e E5-F13, e o diagnóstico registra como lacuna a inexistência de levantamento da geração solar em equipamentos públicos municipais.</w:t>
+        <w:t xml:space="preserve">equipamentos em interrupções como a de setembro de 2026. Programas de geração compartilhada em conjuntos habitacionais e comunidades poderiam reduzir o peso da conta de energia no orçamento das famílias de menor renda. </w:t>
+      </w:r>
+      <w:r>
+        <w:t>O fator articula-se a E4-F08, E4-F24 e E5-F13</w:t>
+      </w:r>
+      <w:r>
+        <w:t>.</w:t>
       </w:r>
     </w:p>
     <w:tbl>
@@ -24139,12 +23359,6 @@
         <w:gridCol w:w="1300"/>
       </w:tblGrid>
       <w:tr>
-        <w:tblPrEx>
-          <w:tblCellMar>
-            <w:top w:w="0" w:type="dxa"/>
-            <w:bottom w:w="0" w:type="dxa"/>
-          </w:tblCellMar>
-        </w:tblPrEx>
         <w:trPr>
           <w:cantSplit/>
         </w:trPr>
@@ -24315,12 +23529,6 @@
         <w:gridCol w:w="1300"/>
       </w:tblGrid>
       <w:tr>
-        <w:tblPrEx>
-          <w:tblCellMar>
-            <w:top w:w="0" w:type="dxa"/>
-            <w:bottom w:w="0" w:type="dxa"/>
-          </w:tblCellMar>
-        </w:tblPrEx>
         <w:trPr>
           <w:cantSplit/>
         </w:trPr>
@@ -24491,12 +23699,6 @@
         <w:gridCol w:w="1300"/>
       </w:tblGrid>
       <w:tr>
-        <w:tblPrEx>
-          <w:tblCellMar>
-            <w:top w:w="0" w:type="dxa"/>
-            <w:bottom w:w="0" w:type="dxa"/>
-          </w:tblCellMar>
-        </w:tblPrEx>
         <w:trPr>
           <w:cantSplit/>
         </w:trPr>
@@ -24667,12 +23869,6 @@
         <w:gridCol w:w="1300"/>
       </w:tblGrid>
       <w:tr>
-        <w:tblPrEx>
-          <w:tblCellMar>
-            <w:top w:w="0" w:type="dxa"/>
-            <w:bottom w:w="0" w:type="dxa"/>
-          </w:tblCellMar>
-        </w:tblPrEx>
         <w:trPr>
           <w:cantSplit/>
         </w:trPr>
@@ -24706,7 +23902,6 @@
                 <w:bCs/>
                 <w:color w:val="FFFFFF"/>
               </w:rPr>
-              <w:lastRenderedPageBreak/>
               <w:t>E5-F18</w:t>
             </w:r>
           </w:p>
@@ -24818,7 +24013,11 @@
         <w:jc w:val="both"/>
       </w:pPr>
       <w:r>
-        <w:t>Campo Grande obteve o pior índice cultural entre as capitais brasileiras em pesquisa do Ministério da Cultura divulgada em agosto de 2025, com posições inferiores em 14 indicadores de acesso e consumo cultural, incluindo livros, cinema, espetáculos musicais e festas populares (G1, 2025, escala das capitais). O resultado expressa a concentração de equipamentos na região central, o custo de acesso, a oferta reduzida de programação gratuita nos bairros e a baixa integração entre cultura, educação e assistência. O acesso à cultura é marcadamente desigual por renda e território, padrão que deve ser verificado pela cartografia social. O fator articula-se a E5-F17, E5-F25, E5-F27 e E5-F28, e o plano popular pode propor circuitos culturais descentralizados, uso das escolas nos fins de semana e apoio a festas e expressões comunitárias, com efeitos sobre convivência, saúde mental e prevenção da violência.</w:t>
+        <w:t xml:space="preserve">Campo Grande obteve o pior índice cultural entre as capitais brasileiras em pesquisa do Ministério da Cultura divulgada em agosto de 2025, com posições inferiores em 14 indicadores de acesso e consumo </w:t>
+      </w:r>
+      <w:r>
+        <w:lastRenderedPageBreak/>
+        <w:t>cultural, incluindo livros, cinema, espetáculos musicais e festas populares (G1, 2025, escala das capitais). O resultado expressa a concentração de equipamentos na região central, o custo de acesso, a oferta reduzida de programação gratuita nos bairros e a baixa integração entre cultura, educação e assistência. O acesso à cultura é marcadamente desigual por renda e território, padrão que deve ser verificado pela cartografia social. O fator articula-se a E5-F17, E5-F25, E5-F27 e E5-F28, e o plano popular pode propor circuitos culturais descentralizados, uso das escolas nos fins de semana e apoio a festas e expressões comunitárias, com efeitos sobre convivência, saúde mental e prevenção da violência.</w:t>
       </w:r>
     </w:p>
     <w:tbl>
@@ -24844,12 +24043,6 @@
         <w:gridCol w:w="1300"/>
       </w:tblGrid>
       <w:tr>
-        <w:tblPrEx>
-          <w:tblCellMar>
-            <w:top w:w="0" w:type="dxa"/>
-            <w:bottom w:w="0" w:type="dxa"/>
-          </w:tblCellMar>
-        </w:tblPrEx>
         <w:trPr>
           <w:cantSplit/>
         </w:trPr>
@@ -25020,12 +24213,6 @@
         <w:gridCol w:w="1300"/>
       </w:tblGrid>
       <w:tr>
-        <w:tblPrEx>
-          <w:tblCellMar>
-            <w:top w:w="0" w:type="dxa"/>
-            <w:bottom w:w="0" w:type="dxa"/>
-          </w:tblCellMar>
-        </w:tblPrEx>
         <w:trPr>
           <w:cantSplit/>
         </w:trPr>
@@ -25204,12 +24391,6 @@
         <w:gridCol w:w="1300"/>
       </w:tblGrid>
       <w:tr>
-        <w:tblPrEx>
-          <w:tblCellMar>
-            <w:top w:w="0" w:type="dxa"/>
-            <w:bottom w:w="0" w:type="dxa"/>
-          </w:tblCellMar>
-        </w:tblPrEx>
         <w:trPr>
           <w:cantSplit/>
         </w:trPr>
@@ -25354,11 +24535,7 @@
         <w:jc w:val="both"/>
       </w:pPr>
       <w:r>
-        <w:t xml:space="preserve">O acesso a tecnologias de informação e comunicação em Campo Grande é amplo pela telefonia móvel, mas desigual em qualidade de conexão, disponibilidade de computadores e habilidades digitais entre regiões e grupos sociais, padrão a ser quantificado com os dados de acesso à internet do Censo 2022 e da ANATEL por município, não sistematizados nesta versão. A digitalização de serviços públicos, como agendamento de consultas, acesso ao CadÚnico e serviços previdenciários, aprofunda a exclusão de idosos, pessoas com </w:t>
-      </w:r>
-      <w:r>
-        <w:lastRenderedPageBreak/>
-        <w:t>baixa escolaridade e indígenas com conectividade precária. Em emergências, o celular é o principal canal de alertas e informação (E2-F37, E6-F11), mas depende de energia, sinal e crédito, afetados em eventos como o de setembro de 2026. O fator articula-se a E5-F09, E3-F04 e E6-F11, e o plano popular pode prever pontos comunitários de acesso e formação digital.</w:t>
+        <w:t>O acesso a tecnologias de informação e comunicação em Campo Grande é amplo pela telefonia móvel, mas desigual em qualidade de conexão, disponibilidade de computadores e habilidades digitais entre regiões e grupos sociais, padrão a ser quantificado com os dados de acesso à internet do Censo 2022 e da ANATEL por município, não sistematizados nesta versão. A digitalização de serviços públicos, como agendamento de consultas, acesso ao CadÚnico e serviços previdenciários, aprofunda a exclusão de idosos, pessoas com baixa escolaridade e indígenas com conectividade precária. Em emergências, o celular é o principal canal de alertas e informação (E2-F37, E6-F11), mas depende de energia, sinal e crédito, afetados em eventos como o de setembro de 2026. O fator articula-se a E5-F09, E3-F04 e E6-F11, e o plano popular pode prever pontos comunitários de acesso e formação digital.</w:t>
       </w:r>
     </w:p>
     <w:tbl>
@@ -25384,12 +24561,6 @@
         <w:gridCol w:w="1300"/>
       </w:tblGrid>
       <w:tr>
-        <w:tblPrEx>
-          <w:tblCellMar>
-            <w:top w:w="0" w:type="dxa"/>
-            <w:bottom w:w="0" w:type="dxa"/>
-          </w:tblCellMar>
-        </w:tblPrEx>
         <w:trPr>
           <w:cantSplit/>
         </w:trPr>
@@ -25423,6 +24594,7 @@
                 <w:bCs/>
                 <w:color w:val="FFFFFF"/>
               </w:rPr>
+              <w:lastRenderedPageBreak/>
               <w:t>E5-F22</w:t>
             </w:r>
           </w:p>
@@ -25560,12 +24732,6 @@
         <w:gridCol w:w="1300"/>
       </w:tblGrid>
       <w:tr>
-        <w:tblPrEx>
-          <w:tblCellMar>
-            <w:top w:w="0" w:type="dxa"/>
-            <w:bottom w:w="0" w:type="dxa"/>
-          </w:tblCellMar>
-        </w:tblPrEx>
         <w:trPr>
           <w:cantSplit/>
         </w:trPr>
@@ -25736,12 +24902,6 @@
         <w:gridCol w:w="1300"/>
       </w:tblGrid>
       <w:tr>
-        <w:tblPrEx>
-          <w:tblCellMar>
-            <w:top w:w="0" w:type="dxa"/>
-            <w:bottom w:w="0" w:type="dxa"/>
-          </w:tblCellMar>
-        </w:tblPrEx>
         <w:trPr>
           <w:cantSplit/>
         </w:trPr>
@@ -25912,12 +25072,6 @@
         <w:gridCol w:w="1300"/>
       </w:tblGrid>
       <w:tr>
-        <w:tblPrEx>
-          <w:tblCellMar>
-            <w:top w:w="0" w:type="dxa"/>
-            <w:bottom w:w="0" w:type="dxa"/>
-          </w:tblCellMar>
-        </w:tblPrEx>
         <w:trPr>
           <w:cantSplit/>
         </w:trPr>
@@ -25951,7 +25105,6 @@
                 <w:bCs/>
                 <w:color w:val="FFFFFF"/>
               </w:rPr>
-              <w:lastRenderedPageBreak/>
               <w:t>E5-F25</w:t>
             </w:r>
           </w:p>
@@ -26063,7 +25216,11 @@
         <w:jc w:val="both"/>
       </w:pPr>
       <w:r>
-        <w:t>Os equipamentos públicos de lazer e cultura seguros em Campo Grande concentram-se em parques de grande porte, como o Parque das Nações Indígenas e os parques lineares, e na região central, com oferta escassa e manutenção irregular de praças, quadras e centros comunitários nas regiões periféricas. A segurança desses espaços depende de iluminação (E5-F30), manutenção e ocupação comunitária, e sua ausência reduz o uso por mulheres, crianças e idosos. O vendaval de 2026 danificou equipamentos culturais centrais, como o Armazém Cultural e a Plataforma Cultural, evidenciando também sua vulnerabilidade física. O inventário de equipamentos de lazer, esporte e cultura por região urbana, a ser elaborado com a prefeitura e a cartografia social, é lacuna do diagnóstico. O fator articula-se a E5-F18, E5-F26, E5-F28 e E2-F27, e a ocupação qualificada desses espaços é estratégia de prevenção da violência.</w:t>
+        <w:t xml:space="preserve">Os equipamentos públicos de lazer e cultura seguros em Campo Grande concentram-se em parques de grande porte, como o Parque das Nações Indígenas e os parques lineares, e na região central, com oferta escassa e manutenção irregular de praças, quadras e centros comunitários nas regiões periféricas. A segurança desses espaços depende de iluminação (E5-F30), manutenção e ocupação comunitária, e sua ausência reduz o uso por mulheres, crianças e idosos. O vendaval de 2026 danificou equipamentos culturais </w:t>
+      </w:r>
+      <w:r>
+        <w:lastRenderedPageBreak/>
+        <w:t>centrais, como o Armazém Cultural e a Plataforma Cultural, evidenciando também sua vulnerabilidade física. O fator articula-se a E5-F18, E5-F26, E5-F28 e E2-F27, e a ocupação qualificada desses espaços é estratégia de prevenção da violência.</w:t>
       </w:r>
     </w:p>
     <w:tbl>
@@ -26089,12 +25246,6 @@
         <w:gridCol w:w="1300"/>
       </w:tblGrid>
       <w:tr>
-        <w:tblPrEx>
-          <w:tblCellMar>
-            <w:top w:w="0" w:type="dxa"/>
-            <w:bottom w:w="0" w:type="dxa"/>
-          </w:tblCellMar>
-        </w:tblPrEx>
         <w:trPr>
           <w:cantSplit/>
         </w:trPr>
@@ -26265,12 +25416,6 @@
         <w:gridCol w:w="1300"/>
       </w:tblGrid>
       <w:tr>
-        <w:tblPrEx>
-          <w:tblCellMar>
-            <w:top w:w="0" w:type="dxa"/>
-            <w:bottom w:w="0" w:type="dxa"/>
-          </w:tblCellMar>
-        </w:tblPrEx>
         <w:trPr>
           <w:cantSplit/>
         </w:trPr>
@@ -26415,7 +25560,7 @@
         <w:jc w:val="both"/>
       </w:pPr>
       <w:r>
-        <w:t>As bibliotecas públicas de Campo Grande concentram-se na região central e nas instituições de ensino superior, com cobertura reduzida nas regiões periféricas, onde as bibliotecas escolares são o principal acesso a livros. O resultado da pesquisa do Ministério da Cultura de 2025, que colocou a capital em último lugar entre as capitais em índice cultural, inclui o acesso a livros entre os indicadores avaliados (G1, 2025). O número de bibliotecas públicas e comunitárias por região, seu horário de funcionamento e acervo devem ser inventariados, lacuna desta versão. Bibliotecas comunitárias mantidas por associações e coletivos podem ampliar o acesso com baixo custo. O fator articula-se a E5-F18, E5-F09 e E5-F21, e a biblioteca pode funcionar como espaço de encontro, acesso digital e informação em saúde nos territórios, inclusive como ponto de referência para a comunicação comunitária.</w:t>
+        <w:t>As bibliotecas públicas de Campo Grande concentram-se na região central e nas instituições de ensino superior, com cobertura reduzida nas regiões periféricas, onde as bibliotecas escolares são o principal acesso a livros. O resultado da pesquisa do Ministério da Cultura de 2025, que colocou a capital em último lugar entre as capitais em índice cultural, inclui o acesso a livros entre os indicadores avaliados (G1, 2025). Bibliotecas comunitárias mantidas por associações e coletivos podem ampliar o acesso com baixo custo. O fator articula-se a E5-F18, E5-F09 e E5-F21, e a biblioteca pode funcionar como espaço de encontro, acesso digital e informação em saúde nos territórios, inclusive como ponto de referência para a comunicação comunitária.</w:t>
       </w:r>
     </w:p>
     <w:tbl>
@@ -26441,12 +25586,6 @@
         <w:gridCol w:w="1300"/>
       </w:tblGrid>
       <w:tr>
-        <w:tblPrEx>
-          <w:tblCellMar>
-            <w:top w:w="0" w:type="dxa"/>
-            <w:bottom w:w="0" w:type="dxa"/>
-          </w:tblCellMar>
-        </w:tblPrEx>
         <w:trPr>
           <w:cantSplit/>
         </w:trPr>
@@ -26591,11 +25730,7 @@
         <w:jc w:val="both"/>
       </w:pPr>
       <w:r>
-        <w:t xml:space="preserve">O lazer em Campo Grande é desigualmente distribuído: os parques urbanos de maior porte, como o Parque das Nações Indígenas, concentram a oferta gratuita de lazer ao ar livre, enquanto as regiões periféricas dispõem de poucas praças equipadas e seguras. As restrições de tempo impostas por jornadas extensas e longos deslocamentos (E1-F18, E5-F23), a sobrecarga de cuidado das mulheres (E1-F07) e a insegurança (E2-F27) reduzem o tempo e as oportunidades de lazer. O lazer tem efeitos documentados sobre saúde mental, convivência comunitária e envelhecimento ativo. Na ausência de inquérito municipal sobre uso do </w:t>
-      </w:r>
-      <w:r>
-        <w:lastRenderedPageBreak/>
-        <w:t>tempo e práticas de lazer, a cartografia social é a fonte para identificar espaços usados, demandas e barreiras. O fator articula-se a E5-F25, E5-F26, E2-F18 e E2-F19, e a qualificação de áreas verdes recuperadas em fundos de vale (E4-F25) pode ampliar a oferta de lazer onde ela é mais escassa.</w:t>
+        <w:t>O lazer em Campo Grande é desigualmente distribuído: os parques urbanos de maior porte, como o Parque das Nações Indígenas, concentram a oferta gratuita de lazer ao ar livre, enquanto as regiões periféricas dispõem de poucas praças equipadas e seguras. As restrições de tempo impostas por jornadas extensas e longos deslocamentos (E1-F18, E5-F23), a sobrecarga de cuidado das mulheres (E1-F07) e a insegurança (E2-F27) reduzem o tempo e as oportunidades de lazer. O lazer tem efeitos documentados sobre saúde mental, convivência comunitária e envelhecimento ativo. Na ausência de inquérito municipal sobre uso do tempo e práticas de lazer, a cartografia social é a fonte para identificar espaços usados, demandas e barreiras. O fator articula-se a E5-F25, E5-F26, E2-F18 e E2-F19, e a qualificação de áreas verdes recuperadas em fundos de vale (E4-F25) pode ampliar a oferta de lazer onde ela é mais escassa.</w:t>
       </w:r>
     </w:p>
     <w:tbl>
@@ -26621,12 +25756,6 @@
         <w:gridCol w:w="1300"/>
       </w:tblGrid>
       <w:tr>
-        <w:tblPrEx>
-          <w:tblCellMar>
-            <w:top w:w="0" w:type="dxa"/>
-            <w:bottom w:w="0" w:type="dxa"/>
-          </w:tblCellMar>
-        </w:tblPrEx>
         <w:trPr>
           <w:cantSplit/>
         </w:trPr>
@@ -26779,7 +25908,11 @@
       </w:r>
       <w:proofErr w:type="gramEnd"/>
       <w:r>
-        <w:t>, como a festa de São Benedito da comunidade Tia Eva, a culinária e as práticas de cuidado de origem pantaneira, paraguaia e nordestina, e o conhecimento dos moradores sobre o próprio território. Esses saberes são pouco reconhecidos pelas políticas públicas, que tendem a tratá-los como folclore e não como conhecimento. A valorização dos saberes locais é princípio metodológico da Pedagogia da Práxis no Território, que parte do universo temático das comunidades para construir o conhecimento sobre o território. O fator articula-se a E4-F18, E4-F03, E3-F18 e E5-F17, e o plano popular pode prever registro, transmissão intergeracional e integração desses saberes à escola, à APS e às estratégias de adaptação climática.</w:t>
+        <w:t xml:space="preserve">, como a festa de São Benedito da comunidade </w:t>
+      </w:r>
+      <w:r>
+        <w:lastRenderedPageBreak/>
+        <w:t>Tia Eva, a culinária e as práticas de cuidado de origem pantaneira, paraguaia e nordestina, e o conhecimento dos moradores sobre o próprio território. Esses saberes são pouco reconhecidos pelas políticas públicas, que tendem a tratá-los como folclore e não como conhecimento. A valorização dos saberes locais é princípio metodológico da Pedagogia da Práxis no Território, que parte do universo temático das comunidades para construir o conhecimento sobre o território. O fator articula-se a E4-F18, E4-F03, E3-F18 e E5-F17, e o plano popular pode prever registro, transmissão intergeracional e integração desses saberes à escola, à APS e às estratégias de adaptação climática.</w:t>
       </w:r>
     </w:p>
     <w:tbl>
@@ -26805,12 +25938,6 @@
         <w:gridCol w:w="1300"/>
       </w:tblGrid>
       <w:tr>
-        <w:tblPrEx>
-          <w:tblCellMar>
-            <w:top w:w="0" w:type="dxa"/>
-            <w:bottom w:w="0" w:type="dxa"/>
-          </w:tblCellMar>
-        </w:tblPrEx>
         <w:trPr>
           <w:cantSplit/>
         </w:trPr>
@@ -27001,12 +26128,6 @@
         <w:gridCol w:w="9354"/>
       </w:tblGrid>
       <w:tr>
-        <w:tblPrEx>
-          <w:tblCellMar>
-            <w:top w:w="0" w:type="dxa"/>
-            <w:bottom w:w="0" w:type="dxa"/>
-          </w:tblCellMar>
-        </w:tblPrEx>
         <w:tc>
           <w:tcPr>
             <w:tcW w:w="9354" w:type="dxa"/>
@@ -27043,12 +26164,6 @@
         </w:tc>
       </w:tr>
       <w:tr>
-        <w:tblPrEx>
-          <w:tblCellMar>
-            <w:top w:w="0" w:type="dxa"/>
-            <w:bottom w:w="0" w:type="dxa"/>
-          </w:tblCellMar>
-        </w:tblPrEx>
         <w:tc>
           <w:tcPr>
             <w:tcW w:w="9354" w:type="dxa"/>
@@ -27083,12 +26198,6 @@
         </w:tc>
       </w:tr>
       <w:tr>
-        <w:tblPrEx>
-          <w:tblCellMar>
-            <w:top w:w="0" w:type="dxa"/>
-            <w:bottom w:w="0" w:type="dxa"/>
-          </w:tblCellMar>
-        </w:tblPrEx>
         <w:tc>
           <w:tcPr>
             <w:tcW w:w="9354" w:type="dxa"/>
@@ -27123,12 +26232,6 @@
         </w:tc>
       </w:tr>
       <w:tr>
-        <w:tblPrEx>
-          <w:tblCellMar>
-            <w:top w:w="0" w:type="dxa"/>
-            <w:bottom w:w="0" w:type="dxa"/>
-          </w:tblCellMar>
-        </w:tblPrEx>
         <w:tc>
           <w:tcPr>
             <w:tcW w:w="9354" w:type="dxa"/>
@@ -27203,12 +26306,6 @@
         <w:gridCol w:w="1300"/>
       </w:tblGrid>
       <w:tr>
-        <w:tblPrEx>
-          <w:tblCellMar>
-            <w:top w:w="0" w:type="dxa"/>
-            <w:bottom w:w="0" w:type="dxa"/>
-          </w:tblCellMar>
-        </w:tblPrEx>
         <w:trPr>
           <w:cantSplit/>
         </w:trPr>
@@ -27353,7 +26450,19 @@
         <w:jc w:val="both"/>
       </w:pPr>
       <w:r>
-        <w:t>As associações de moradores e lideranças locais de Campo Grande constituem rede extensa, mas heterogênea em atividade e representatividade, que inclui associações de bairro, lideranças das aldeias urbanas indígenas e das comunidades quilombolas, conselhos locais de saúde e grupos ligados a igrejas e movimentos de moradia. O registro dessas organizações não está consolidado em base pública municipal, e sua capacidade de mobilização varia entre regiões, o que constitui lacuna que a cartografia social deve suprir com inventário de organizações, lideranças e pautas por território. Nos eventos extremos de 2025 e 2026, lideranças locais atuaram na identificação de famílias atingidas e na mobilização de ajuda, função não reconhecida formalmente nos planos de contingência. O fator articula-se a E6-F02, E6-F07, E1-F17 e E2-F32, e o plano popular deve reconhecer essas lideranças como interlocutoras permanentes do planejamento territorial e da gestão de riscos.</w:t>
+        <w:t xml:space="preserve">As associações de moradores e lideranças locais de Campo Grande constituem rede extensa, mas heterogênea em atividade e representatividade, que inclui associações de bairro, lideranças das aldeias urbanas indígenas e </w:t>
+      </w:r>
+      <w:r>
+        <w:t>das comunidades quilombolas, conselhos locais de saúde e grupos ligados a igrejas e movimentos de moradia. O registro dessas organizações não está consolidado em base pública municipal, e sua capacidade de mobilização varia entre regiões</w:t>
+      </w:r>
+      <w:r>
+        <w:t>.</w:t>
+      </w:r>
+      <w:r>
+        <w:t xml:space="preserve"> Nos eventos extremos de 2025 e 2026, lideranças locais atuaram na identificação de famílias atingidas e na mobilização</w:t>
+      </w:r>
+      <w:r>
+        <w:t xml:space="preserve"> de ajuda, função não reconhecida formalmente nos planos de contingência. O fator articula-se a E6-F02, E6-F07, E1-F17 e E2-F32, e o plano popular deve reconhecer essas lideranças como interlocutoras permanentes do planejamento territorial e da gestão de riscos.</w:t>
       </w:r>
     </w:p>
     <w:tbl>
@@ -27379,12 +26488,6 @@
         <w:gridCol w:w="1300"/>
       </w:tblGrid>
       <w:tr>
-        <w:tblPrEx>
-          <w:tblCellMar>
-            <w:top w:w="0" w:type="dxa"/>
-            <w:bottom w:w="0" w:type="dxa"/>
-          </w:tblCellMar>
-        </w:tblPrEx>
         <w:trPr>
           <w:cantSplit/>
         </w:trPr>
@@ -27555,12 +26658,6 @@
         <w:gridCol w:w="1300"/>
       </w:tblGrid>
       <w:tr>
-        <w:tblPrEx>
-          <w:tblCellMar>
-            <w:top w:w="0" w:type="dxa"/>
-            <w:bottom w:w="0" w:type="dxa"/>
-          </w:tblCellMar>
-        </w:tblPrEx>
         <w:trPr>
           <w:cantSplit/>
         </w:trPr>
@@ -27706,7 +26803,7 @@
         <w:jc w:val="both"/>
       </w:pPr>
       <w:r>
-        <w:t>As rádios comunitárias autorizadas no município de Campo Grande, cujo registro é mantido pelo Ministério das Comunicações e pela ANATEL, devem ser levantadas para o diagnóstico, dado não sistematizado nesta versão e registrado como lacuna. Em uma capital com mais de 970 mil habitantes estimados pelo IBGE para 2026, a comunicação comunitária por rádio tende a ter alcance segmentado, concentrado em públicos específicos, como comunidades religiosas, indígenas e moradores de bairros periféricos. A relevância do fator cresce em emergências, quando a interrupção de energia e de internet, como ocorreu no vendaval de setembro de 2026, reduz o alcance dos canais digitais e torna o rádio a pilhas um meio resiliente de alerta e orientação. O fator articula-se a E2-F37, E2-F29, E6-F11 e E4-F09, e o plano popular pode prever acordos com rádios comunitárias e locais para veiculação de alertas e informações de saúde em linguagem acessível.</w:t>
+        <w:t>Em uma capital com mais de 970 mil habitantes estimados pelo IBGE para 2026, a comunicação comunitária por rádio tende a ter alcance segmentado, concentrado em públicos específicos, como comunidades religiosas, indígenas e moradores de bairros periféricos. A relevância do fator cresce em emergências, quando a interrupção de energia e de internet, como ocorreu no vendaval de setembro de 2026, reduz o alcance dos canais digitais e torna o rádio a pilhas um meio resiliente de alerta e orientação. O fator articula-se a E2-F37, E2-F29, E6-F11 e E4-F09, e o plano popular pode prever acordos com rádios comunitárias e locais para veiculação de alertas e informações de saúde em linguagem acessível.</w:t>
       </w:r>
     </w:p>
     <w:tbl>
@@ -27732,12 +26829,6 @@
         <w:gridCol w:w="1300"/>
       </w:tblGrid>
       <w:tr>
-        <w:tblPrEx>
-          <w:tblCellMar>
-            <w:top w:w="0" w:type="dxa"/>
-            <w:bottom w:w="0" w:type="dxa"/>
-          </w:tblCellMar>
-        </w:tblPrEx>
         <w:trPr>
           <w:cantSplit/>
         </w:trPr>
@@ -27908,12 +26999,6 @@
         <w:gridCol w:w="1300"/>
       </w:tblGrid>
       <w:tr>
-        <w:tblPrEx>
-          <w:tblCellMar>
-            <w:top w:w="0" w:type="dxa"/>
-            <w:bottom w:w="0" w:type="dxa"/>
-          </w:tblCellMar>
-        </w:tblPrEx>
         <w:trPr>
           <w:cantSplit/>
         </w:trPr>
@@ -28084,12 +27169,6 @@
         <w:gridCol w:w="1300"/>
       </w:tblGrid>
       <w:tr>
-        <w:tblPrEx>
-          <w:tblCellMar>
-            <w:top w:w="0" w:type="dxa"/>
-            <w:bottom w:w="0" w:type="dxa"/>
-          </w:tblCellMar>
-        </w:tblPrEx>
         <w:trPr>
           <w:cantSplit/>
         </w:trPr>
@@ -28234,19 +27313,19 @@
         <w:jc w:val="both"/>
       </w:pPr>
       <w:r>
-        <w:t xml:space="preserve">O crime organizado tem presença em Campo Grande associada às rotas de tráfico de drogas e armas que atravessam Mato Grosso do Sul a partir da fronteira com Paraguai e Bolívia, segundo análises do Anuário Brasileiro de Segurança Pública e das forças de segurança. Nos territórios periféricos, o mercado varejista </w:t>
+        <w:t xml:space="preserve">O crime organizado tem presença em Campo Grande associada às rotas de tráfico de drogas e armas que atravessam Mato Grosso do Sul a partir da fronteira com Paraguai e Bolívia, segundo análises do Anuário Brasileiro de Segurança Pública e das forças de segurança. Nos territórios periféricos, o mercado varejista de drogas estrutura parte da violência letal, recruta adolescentes e jovens e restringe a circulação de moradores e de equipes de serviços públicos. A </w:t>
+      </w:r>
+      <w:proofErr w:type="spellStart"/>
+      <w:r>
+        <w:t>sobremortalidade</w:t>
+      </w:r>
+      <w:proofErr w:type="spellEnd"/>
+      <w:r>
+        <w:t xml:space="preserve"> de jovens negros e indígenas por </w:t>
       </w:r>
       <w:r>
         <w:lastRenderedPageBreak/>
-        <w:t xml:space="preserve">de drogas estrutura parte da violência letal, recruta adolescentes e jovens e restringe a circulação de moradores e de equipes de serviços públicos. A </w:t>
-      </w:r>
-      <w:proofErr w:type="spellStart"/>
-      <w:r>
-        <w:t>sobremortalidade</w:t>
-      </w:r>
-      <w:proofErr w:type="spellEnd"/>
-      <w:r>
-        <w:t xml:space="preserve"> de jovens negros e indígenas por homicídio na capital (Agência Brasil, 2024) é expressão desse padrão (E2-F28). Os dados de mortes violentas intencionais e de apreensões por região, disponíveis na Secretaria de Justiça e Segurança Pública, devem ser incorporados ao diagnóstico, não sistematizados nesta versão. O fator articula-se a E2-F27, E2-F10 e E3-F07, e o enfrentamento exige articular repressão qualificada, prevenção social e oferta de alternativas para a juventude.</w:t>
+        <w:t>homicídio na capital (Agência Brasil, 2024) é expressão desse padrão (E2-F28). Os dados de mortes violentas intencionais e de apreensões por região, disponíveis na Secretaria de Justiça e Segurança Pública, devem ser incorporados ao diagnóstico, não sistematizados nesta versão. O fator articula-se a E2-F27, E2-F10 e E3-F07, e o enfrentamento exige articular repressão qualificada, prevenção social e oferta de alternativas para a juventude.</w:t>
       </w:r>
     </w:p>
     <w:tbl>
@@ -28272,12 +27351,6 @@
         <w:gridCol w:w="1300"/>
       </w:tblGrid>
       <w:tr>
-        <w:tblPrEx>
-          <w:tblCellMar>
-            <w:top w:w="0" w:type="dxa"/>
-            <w:bottom w:w="0" w:type="dxa"/>
-          </w:tblCellMar>
-        </w:tblPrEx>
         <w:trPr>
           <w:cantSplit/>
         </w:trPr>
@@ -28448,12 +27521,6 @@
         <w:gridCol w:w="1300"/>
       </w:tblGrid>
       <w:tr>
-        <w:tblPrEx>
-          <w:tblCellMar>
-            <w:top w:w="0" w:type="dxa"/>
-            <w:bottom w:w="0" w:type="dxa"/>
-          </w:tblCellMar>
-        </w:tblPrEx>
         <w:trPr>
           <w:cantSplit/>
         </w:trPr>
@@ -28632,12 +27699,6 @@
         <w:gridCol w:w="1300"/>
       </w:tblGrid>
       <w:tr>
-        <w:tblPrEx>
-          <w:tblCellMar>
-            <w:top w:w="0" w:type="dxa"/>
-            <w:bottom w:w="0" w:type="dxa"/>
-          </w:tblCellMar>
-        </w:tblPrEx>
         <w:trPr>
           <w:cantSplit/>
         </w:trPr>
@@ -28782,11 +27843,7 @@
         <w:jc w:val="both"/>
       </w:pPr>
       <w:r>
-        <w:t xml:space="preserve">A transparência ativa em Campo Grande é exercida pelo portal de transparência municipal, pelos relatórios de gestão submetidos ao Conselho Municipal de Saúde, pelo SIOPS e pelos portais das concessionárias de serviços públicos e das agências reguladoras. O IBGE Cidades registra receitas brutas realizadas de R$ 6,06 bilhões e despesas empenhadas de R$ 6,39 bilhões pelo município, com referência às contas municipais (IBGE, escala municipal), magnitude que indica a relevância do acompanhamento social do gasto. A disponibilidade de dados abertos, georreferenciados e em linguagem acessível é limitada: informações sobre qualidade do ar, barragens de risco, alertas e execução de obras emergenciais circulam de forma </w:t>
-      </w:r>
-      <w:r>
-        <w:lastRenderedPageBreak/>
-        <w:t>dispersa. O fator articula-se a E6-F08, E6-F07, E4-F09 e E1-F25, e o plano popular pode propor um painel territorial público que reúna indicadores de saúde, saneamento, riscos e investimento por região urbana.</w:t>
+        <w:t>A transparência ativa em Campo Grande é exercida pelo portal de transparência municipal, pelos relatórios de gestão submetidos ao Conselho Municipal de Saúde, pelo SIOPS e pelos portais das concessionárias de serviços públicos e das agências reguladoras. O IBGE Cidades registra receitas brutas realizadas de R$ 6,06 bilhões e despesas empenhadas de R$ 6,39 bilhões pelo município, com referência às contas municipais (IBGE, escala municipal), magnitude que indica a relevância do acompanhamento social do gasto. A disponibilidade de dados abertos, georreferenciados e em linguagem acessível é limitada: informações sobre qualidade do ar, barragens de risco, alertas e execução de obras emergenciais circulam de forma dispersa. O fator articula-se a E6-F08, E6-F07, E4-F09 e E1-F25, e o plano popular pode propor um painel territorial público que reúna indicadores de saúde, saneamento, riscos e investimento por região urbana.</w:t>
       </w:r>
     </w:p>
     <w:tbl>
@@ -28812,12 +27869,6 @@
         <w:gridCol w:w="1300"/>
       </w:tblGrid>
       <w:tr>
-        <w:tblPrEx>
-          <w:tblCellMar>
-            <w:top w:w="0" w:type="dxa"/>
-            <w:bottom w:w="0" w:type="dxa"/>
-          </w:tblCellMar>
-        </w:tblPrEx>
         <w:trPr>
           <w:cantSplit/>
         </w:trPr>
@@ -28851,6 +27902,7 @@
                 <w:bCs/>
                 <w:color w:val="FFFFFF"/>
               </w:rPr>
+              <w:lastRenderedPageBreak/>
               <w:t>E6-F11</w:t>
             </w:r>
           </w:p>
@@ -28962,7 +28014,7 @@
         <w:jc w:val="both"/>
       </w:pPr>
       <w:r>
-        <w:t>Os grupos de mensagens são o principal canal de comunicação comunitária em Campo Grande, usados por associações de moradores, escolas, igrejas, equipes de saúde, comunidades indígenas e redes de vizinhança para avisos, organização de ações e circulação de informações. Nos eventos extremos de 2025 e 2026, esses grupos difundiram alertas, informações sobre interrupção de energia e pedidos de ajuda com rapidez superior à dos canais oficiais, mas também propagaram informações imprecisas. Sua efetividade depende de moderação, de fontes confiáveis e da conexão, comprometida quando a energia falha por longos períodos. A inexistência de levantamento desses grupos e de sua abrangência territorial é lacuna que a cartografia social pode suprir. O fator articula-se a E6-F03, E2-F29, E2-F37 e E4-F09, e o plano popular pode estruturar uma rede de grupos territoriais com pontos focais formados para retransmitir alertas oficiais e informações verificadas de saúde.</w:t>
+        <w:t>Os grupos de mensagens são o principal canal de comunicação comunitária em Campo Grande, usados por associações de moradores, escolas, igrejas, equipes de saúde, comunidades indígenas e redes de vizinhança para avisos, organização de ações e circulação de informações. Nos eventos extremos de 2025 e 2026, esses grupos difundiram alertas, informações sobre interrupção de energia e pedidos de ajuda com rapidez superior à dos canais oficiais, mas também propagaram informações imprecisas. Sua efetividade depende de moderação, de fontes confiáveis e da conexão, comprometida quando a energia falha por longos períodos. O fator articula-se a E6-F03, E2-F29, E2-F37 e E4-F09, e o plano popular pode estruturar uma rede de grupos territoriais com pontos focais formados para retransmitir alertas oficiais e informações verificadas de saúde.</w:t>
       </w:r>
     </w:p>
     <w:tbl>
@@ -28988,12 +28040,6 @@
         <w:gridCol w:w="1300"/>
       </w:tblGrid>
       <w:tr>
-        <w:tblPrEx>
-          <w:tblCellMar>
-            <w:top w:w="0" w:type="dxa"/>
-            <w:bottom w:w="0" w:type="dxa"/>
-          </w:tblCellMar>
-        </w:tblPrEx>
         <w:trPr>
           <w:cantSplit/>
         </w:trPr>
@@ -29164,12 +28210,6 @@
         <w:gridCol w:w="1300"/>
       </w:tblGrid>
       <w:tr>
-        <w:tblPrEx>
-          <w:tblCellMar>
-            <w:top w:w="0" w:type="dxa"/>
-            <w:bottom w:w="0" w:type="dxa"/>
-          </w:tblCellMar>
-        </w:tblPrEx>
         <w:trPr>
           <w:cantSplit/>
         </w:trPr>
@@ -29326,7 +28366,19 @@
         <w:jc w:val="both"/>
       </w:pPr>
       <w:r>
-        <w:t>As igrejas, grupos religiosos e coletivos comunitários de Campo Grande desempenham papel relevante no apoio a pessoas em situação de vulnerabilidade, com distribuição de alimentos, acolhimento de pessoas em situação de rua, apoio a famílias atingidas por eventos extremos e cessão de espaços para atividades comunitárias. Sua capilaridade nas regiões periféricas supera a de muitos serviços públicos, o que os torna atores estratégicos na resposta a emergências, como pontos de abrigo, distribuição de doações e comunicação. A ausência de cadastro dessas organizações e de acordos prévios com a Defesa Civil limita sua integração aos planos de contingência, lacuna que a cartografia social pode suprir. O fator articula-se a E5-F01, E2-F39, E1-F17 e E6-F15, e o plano popular deve prever formas de cooperação que respeitem a laicidade do Estado e a autonomia das organizações, com foco na proteção das pessoas atingidas.</w:t>
+        <w:t xml:space="preserve">As igrejas, grupos religiosos e coletivos comunitários de Campo Grande desempenham papel relevante no apoio a pessoas em situação de vulnerabilidade, com distribuição de alimentos, acolhimento de pessoas em situação de rua, apoio a famílias atingidas por eventos extremos e cessão de espaços para atividades comunitárias. Sua capilaridade nas regiões periféricas supera a de muitos serviços públicos, o que os torna atores estratégicos na resposta a emergências, como pontos de abrigo, distribuição de doações e comunicação. </w:t>
+      </w:r>
+      <w:r>
+        <w:rPr>
+          <w:highlight w:val="yellow"/>
+        </w:rPr>
+        <w:t>A ausência de cadastro dessas organizações e de acordos prévios com a Defesa Civil limita sua integração aos planos de contingência</w:t>
+      </w:r>
+      <w:r>
+        <w:t>.</w:t>
+      </w:r>
+      <w:r>
+        <w:t xml:space="preserve"> O fator articula-se a E5-F01, E2-F39, E1-F17 e E6-F15, e o plano popular deve prever formas de cooperação que respeitem a laicidade do Estado e a autonomia das organizações, com foco na proteção das pessoas atingidas.</w:t>
       </w:r>
     </w:p>
     <w:p>
@@ -29388,12 +28440,6 @@
         <w:gridCol w:w="2200"/>
       </w:tblGrid>
       <w:tr>
-        <w:tblPrEx>
-          <w:tblCellMar>
-            <w:top w:w="0" w:type="dxa"/>
-            <w:bottom w:w="0" w:type="dxa"/>
-          </w:tblCellMar>
-        </w:tblPrEx>
         <w:trPr>
           <w:tblHeader/>
         </w:trPr>
@@ -29504,12 +28550,6 @@
         </w:tc>
       </w:tr>
       <w:tr>
-        <w:tblPrEx>
-          <w:tblCellMar>
-            <w:top w:w="0" w:type="dxa"/>
-            <w:bottom w:w="0" w:type="dxa"/>
-          </w:tblCellMar>
-        </w:tblPrEx>
         <w:trPr>
           <w:cantSplit/>
         </w:trPr>
@@ -29612,12 +28652,6 @@
         </w:tc>
       </w:tr>
       <w:tr>
-        <w:tblPrEx>
-          <w:tblCellMar>
-            <w:top w:w="0" w:type="dxa"/>
-            <w:bottom w:w="0" w:type="dxa"/>
-          </w:tblCellMar>
-        </w:tblPrEx>
         <w:trPr>
           <w:cantSplit/>
         </w:trPr>
@@ -29720,12 +28754,6 @@
         </w:tc>
       </w:tr>
       <w:tr>
-        <w:tblPrEx>
-          <w:tblCellMar>
-            <w:top w:w="0" w:type="dxa"/>
-            <w:bottom w:w="0" w:type="dxa"/>
-          </w:tblCellMar>
-        </w:tblPrEx>
         <w:trPr>
           <w:cantSplit/>
         </w:trPr>
@@ -29837,12 +28865,6 @@
         </w:tc>
       </w:tr>
       <w:tr>
-        <w:tblPrEx>
-          <w:tblCellMar>
-            <w:top w:w="0" w:type="dxa"/>
-            <w:bottom w:w="0" w:type="dxa"/>
-          </w:tblCellMar>
-        </w:tblPrEx>
         <w:trPr>
           <w:cantSplit/>
         </w:trPr>
@@ -29945,12 +28967,6 @@
         </w:tc>
       </w:tr>
       <w:tr>
-        <w:tblPrEx>
-          <w:tblCellMar>
-            <w:top w:w="0" w:type="dxa"/>
-            <w:bottom w:w="0" w:type="dxa"/>
-          </w:tblCellMar>
-        </w:tblPrEx>
         <w:trPr>
           <w:cantSplit/>
         </w:trPr>
@@ -30053,12 +29069,6 @@
         </w:tc>
       </w:tr>
       <w:tr>
-        <w:tblPrEx>
-          <w:tblCellMar>
-            <w:top w:w="0" w:type="dxa"/>
-            <w:bottom w:w="0" w:type="dxa"/>
-          </w:tblCellMar>
-        </w:tblPrEx>
         <w:trPr>
           <w:cantSplit/>
         </w:trPr>
@@ -30161,12 +29171,6 @@
         </w:tc>
       </w:tr>
       <w:tr>
-        <w:tblPrEx>
-          <w:tblCellMar>
-            <w:top w:w="0" w:type="dxa"/>
-            <w:bottom w:w="0" w:type="dxa"/>
-          </w:tblCellMar>
-        </w:tblPrEx>
         <w:trPr>
           <w:cantSplit/>
         </w:trPr>
@@ -30321,12 +29325,6 @@
         <w:gridCol w:w="2200"/>
       </w:tblGrid>
       <w:tr>
-        <w:tblPrEx>
-          <w:tblCellMar>
-            <w:top w:w="0" w:type="dxa"/>
-            <w:bottom w:w="0" w:type="dxa"/>
-          </w:tblCellMar>
-        </w:tblPrEx>
         <w:trPr>
           <w:tblHeader/>
         </w:trPr>
@@ -30437,12 +29435,6 @@
         </w:tc>
       </w:tr>
       <w:tr>
-        <w:tblPrEx>
-          <w:tblCellMar>
-            <w:top w:w="0" w:type="dxa"/>
-            <w:bottom w:w="0" w:type="dxa"/>
-          </w:tblCellMar>
-        </w:tblPrEx>
         <w:trPr>
           <w:cantSplit/>
         </w:trPr>
@@ -30545,12 +29537,6 @@
         </w:tc>
       </w:tr>
       <w:tr>
-        <w:tblPrEx>
-          <w:tblCellMar>
-            <w:top w:w="0" w:type="dxa"/>
-            <w:bottom w:w="0" w:type="dxa"/>
-          </w:tblCellMar>
-        </w:tblPrEx>
         <w:trPr>
           <w:cantSplit/>
         </w:trPr>
@@ -30653,12 +29639,6 @@
         </w:tc>
       </w:tr>
       <w:tr>
-        <w:tblPrEx>
-          <w:tblCellMar>
-            <w:top w:w="0" w:type="dxa"/>
-            <w:bottom w:w="0" w:type="dxa"/>
-          </w:tblCellMar>
-        </w:tblPrEx>
         <w:trPr>
           <w:cantSplit/>
         </w:trPr>
@@ -30762,12 +29742,6 @@
         </w:tc>
       </w:tr>
       <w:tr>
-        <w:tblPrEx>
-          <w:tblCellMar>
-            <w:top w:w="0" w:type="dxa"/>
-            <w:bottom w:w="0" w:type="dxa"/>
-          </w:tblCellMar>
-        </w:tblPrEx>
         <w:trPr>
           <w:cantSplit/>
         </w:trPr>
@@ -30870,12 +29844,6 @@
         </w:tc>
       </w:tr>
       <w:tr>
-        <w:tblPrEx>
-          <w:tblCellMar>
-            <w:top w:w="0" w:type="dxa"/>
-            <w:bottom w:w="0" w:type="dxa"/>
-          </w:tblCellMar>
-        </w:tblPrEx>
         <w:trPr>
           <w:cantSplit/>
         </w:trPr>
@@ -30978,12 +29946,6 @@
         </w:tc>
       </w:tr>
       <w:tr>
-        <w:tblPrEx>
-          <w:tblCellMar>
-            <w:top w:w="0" w:type="dxa"/>
-            <w:bottom w:w="0" w:type="dxa"/>
-          </w:tblCellMar>
-        </w:tblPrEx>
         <w:trPr>
           <w:cantSplit/>
         </w:trPr>
@@ -31086,12 +30048,6 @@
         </w:tc>
       </w:tr>
       <w:tr>
-        <w:tblPrEx>
-          <w:tblCellMar>
-            <w:top w:w="0" w:type="dxa"/>
-            <w:bottom w:w="0" w:type="dxa"/>
-          </w:tblCellMar>
-        </w:tblPrEx>
         <w:trPr>
           <w:cantSplit/>
         </w:trPr>
@@ -31241,12 +30197,6 @@
         <w:gridCol w:w="4254"/>
       </w:tblGrid>
       <w:tr>
-        <w:tblPrEx>
-          <w:tblCellMar>
-            <w:top w:w="0" w:type="dxa"/>
-            <w:bottom w:w="0" w:type="dxa"/>
-          </w:tblCellMar>
-        </w:tblPrEx>
         <w:trPr>
           <w:tblHeader/>
         </w:trPr>
@@ -31357,12 +30307,6 @@
         </w:tc>
       </w:tr>
       <w:tr>
-        <w:tblPrEx>
-          <w:tblCellMar>
-            <w:top w:w="0" w:type="dxa"/>
-            <w:bottom w:w="0" w:type="dxa"/>
-          </w:tblCellMar>
-        </w:tblPrEx>
         <w:trPr>
           <w:cantSplit/>
         </w:trPr>
@@ -31464,12 +30408,6 @@
         </w:tc>
       </w:tr>
       <w:tr>
-        <w:tblPrEx>
-          <w:tblCellMar>
-            <w:top w:w="0" w:type="dxa"/>
-            <w:bottom w:w="0" w:type="dxa"/>
-          </w:tblCellMar>
-        </w:tblPrEx>
         <w:trPr>
           <w:cantSplit/>
         </w:trPr>
@@ -31571,12 +30509,6 @@
         </w:tc>
       </w:tr>
       <w:tr>
-        <w:tblPrEx>
-          <w:tblCellMar>
-            <w:top w:w="0" w:type="dxa"/>
-            <w:bottom w:w="0" w:type="dxa"/>
-          </w:tblCellMar>
-        </w:tblPrEx>
         <w:trPr>
           <w:cantSplit/>
         </w:trPr>
@@ -31678,12 +30610,6 @@
         </w:tc>
       </w:tr>
       <w:tr>
-        <w:tblPrEx>
-          <w:tblCellMar>
-            <w:top w:w="0" w:type="dxa"/>
-            <w:bottom w:w="0" w:type="dxa"/>
-          </w:tblCellMar>
-        </w:tblPrEx>
         <w:trPr>
           <w:cantSplit/>
         </w:trPr>
@@ -31747,6 +30673,7 @@
               <w:rPr>
                 <w:sz w:val="19"/>
                 <w:szCs w:val="19"/>
+                <w:highlight w:val="yellow"/>
               </w:rPr>
               <w:t>Lacuna de informação</w:t>
             </w:r>
@@ -31792,6 +30719,9 @@
         <w:spacing w:before="240" w:after="100"/>
       </w:pPr>
       <w:r>
+        <w:rPr>
+          <w:highlight w:val="yellow"/>
+        </w:rPr>
         <w:t>Principais lacunas de informação</w:t>
       </w:r>
     </w:p>
@@ -31801,6 +30731,9 @@
         <w:jc w:val="both"/>
       </w:pPr>
       <w:r>
+        <w:rPr>
+          <w:highlight w:val="yellow"/>
+        </w:rPr>
         <w:t>Constituem lacunas por consulta direta às bases: séries municipais do SIM, SINASC e SINAN para mortalidade materna, neonatal e por causas externas e para agravos transmissíveis; estrutura etária, pessoas com deficiência, características do entorno dos domicílios e acesso à internet do Censo 2022 por setor censitário; famílias no CadÚnico e no Bolsa Família por território (VIS Data/MDS); cobertura e uso da terra e focos de calor no município (MapBiomas, PRODES, Programa Queimadas); registros de desastres no S2iD; inventário de barragens no SNISB; indicadores do VIGITEL para a capital; matrículas e indicadores docentes do Censo Escolar por escola; execução orçamentária por função (SIOPS e portal de transparência); e inventário comunitário de organizações, rádios, grupos de mensagens, hortas e pontos de risco, a ser produzido pela cartografia social.</w:t>
       </w:r>
     </w:p>
@@ -31836,12 +30769,6 @@
         <w:gridCol w:w="8454"/>
       </w:tblGrid>
       <w:tr>
-        <w:tblPrEx>
-          <w:tblCellMar>
-            <w:top w:w="0" w:type="dxa"/>
-            <w:bottom w:w="0" w:type="dxa"/>
-          </w:tblCellMar>
-        </w:tblPrEx>
         <w:trPr>
           <w:tblHeader/>
         </w:trPr>
@@ -31917,12 +30844,6 @@
         </w:tc>
       </w:tr>
       <w:tr>
-        <w:tblPrEx>
-          <w:tblCellMar>
-            <w:top w:w="0" w:type="dxa"/>
-            <w:bottom w:w="0" w:type="dxa"/>
-          </w:tblCellMar>
-        </w:tblPrEx>
         <w:trPr>
           <w:cantSplit/>
         </w:trPr>
@@ -31993,12 +30914,6 @@
         </w:tc>
       </w:tr>
       <w:tr>
-        <w:tblPrEx>
-          <w:tblCellMar>
-            <w:top w:w="0" w:type="dxa"/>
-            <w:bottom w:w="0" w:type="dxa"/>
-          </w:tblCellMar>
-        </w:tblPrEx>
         <w:trPr>
           <w:cantSplit/>
         </w:trPr>
@@ -32085,12 +31000,6 @@
         </w:tc>
       </w:tr>
       <w:tr>
-        <w:tblPrEx>
-          <w:tblCellMar>
-            <w:top w:w="0" w:type="dxa"/>
-            <w:bottom w:w="0" w:type="dxa"/>
-          </w:tblCellMar>
-        </w:tblPrEx>
         <w:trPr>
           <w:cantSplit/>
         </w:trPr>
@@ -32193,12 +31102,6 @@
         </w:tc>
       </w:tr>
       <w:tr>
-        <w:tblPrEx>
-          <w:tblCellMar>
-            <w:top w:w="0" w:type="dxa"/>
-            <w:bottom w:w="0" w:type="dxa"/>
-          </w:tblCellMar>
-        </w:tblPrEx>
         <w:trPr>
           <w:cantSplit/>
         </w:trPr>
@@ -32285,12 +31188,6 @@
         </w:tc>
       </w:tr>
       <w:tr>
-        <w:tblPrEx>
-          <w:tblCellMar>
-            <w:top w:w="0" w:type="dxa"/>
-            <w:bottom w:w="0" w:type="dxa"/>
-          </w:tblCellMar>
-        </w:tblPrEx>
         <w:trPr>
           <w:cantSplit/>
         </w:trPr>
@@ -32377,12 +31274,6 @@
         </w:tc>
       </w:tr>
       <w:tr>
-        <w:tblPrEx>
-          <w:tblCellMar>
-            <w:top w:w="0" w:type="dxa"/>
-            <w:bottom w:w="0" w:type="dxa"/>
-          </w:tblCellMar>
-        </w:tblPrEx>
         <w:trPr>
           <w:cantSplit/>
         </w:trPr>
@@ -32453,12 +31344,6 @@
         </w:tc>
       </w:tr>
       <w:tr>
-        <w:tblPrEx>
-          <w:tblCellMar>
-            <w:top w:w="0" w:type="dxa"/>
-            <w:bottom w:w="0" w:type="dxa"/>
-          </w:tblCellMar>
-        </w:tblPrEx>
         <w:trPr>
           <w:cantSplit/>
         </w:trPr>
@@ -32553,8 +31438,12 @@
       </w:pPr>
     </w:p>
     <w:sectPr>
-      <w:headerReference w:type="default" r:id="rId7"/>
-      <w:footerReference w:type="default" r:id="rId8"/>
+      <w:headerReference w:type="even" r:id="rId7"/>
+      <w:headerReference w:type="default" r:id="rId8"/>
+      <w:footerReference w:type="even" r:id="rId9"/>
+      <w:footerReference w:type="default" r:id="rId10"/>
+      <w:headerReference w:type="first" r:id="rId11"/>
+      <w:footerReference w:type="first" r:id="rId12"/>
       <w:pgSz w:w="11906" w:h="16838"/>
       <w:pgMar w:top="1134" w:right="1134" w:bottom="1134" w:left="1418" w:header="708" w:footer="708" w:gutter="0"/>
       <w:cols w:space="720"/>
@@ -32584,6 +31473,16 @@
 </file>
 
 <file path=word/footer1.xml><?xml version="1.0" encoding="utf-8"?>
+<w:ftr xmlns:wpc="http://schemas.microsoft.com/office/word/2010/wordprocessingCanvas" xmlns:cx="http://schemas.microsoft.com/office/drawing/2014/chartex" xmlns:cx1="http://schemas.microsoft.com/office/drawing/2015/9/8/chartex" xmlns:cx2="http://schemas.microsoft.com/office/drawing/2015/10/21/chartex" xmlns:cx3="http://schemas.microsoft.com/office/drawing/2016/5/9/chartex" xmlns:cx4="http://schemas.microsoft.com/office/drawing/2016/5/10/chartex" xmlns:cx5="http://schemas.microsoft.com/office/drawing/2016/5/11/chartex" xmlns:cx6="http://schemas.microsoft.com/office/drawing/2016/5/12/chartex" xmlns:cx7="http://schemas.microsoft.com/office/drawing/2016/5/13/chartex" xmlns:cx8="http://schemas.microsoft.com/office/drawing/2016/5/14/chartex" xmlns:mc="http://schemas.openxmlformats.org/markup-compatibility/2006" xmlns:aink="http://schemas.microsoft.com/office/drawing/2016/ink" xmlns:am3d="http://schemas.microsoft.com/office/drawing/2017/model3d" xmlns:o="urn:schemas-microsoft-com:office:office" xmlns:oel="http://schemas.microsoft.com/office/2019/extlst" xmlns:r="http://schemas.openxmlformats.org/officeDocument/2006/relationships" xmlns:m="http://schemas.openxmlformats.org/officeDocument/2006/math" xmlns:v="urn:schemas-microsoft-com:vml" xmlns:wp14="http://schemas.microsoft.com/office/word/2010/wordprocessingDrawing" xmlns:wp="http://schemas.openxmlformats.org/drawingml/2006/wordprocessingDrawing" xmlns:w10="urn:schemas-microsoft-com:office:word" xmlns:w="http://schemas.openxmlformats.org/wordprocessingml/2006/main" xmlns:w14="http://schemas.microsoft.com/office/word/2010/wordml" xmlns:w15="http://schemas.microsoft.com/office/word/2012/wordml" xmlns:w16cex="http://schemas.microsoft.com/office/word/2018/wordml/cex" xmlns:w16cid="http://schemas.microsoft.com/office/word/2016/wordml/cid" xmlns:w16="http://schemas.microsoft.com/office/word/2018/wordml" xmlns:w16du="http://schemas.microsoft.com/office/word/2023/wordml/word16du" xmlns:w16sdtdh="http://schemas.microsoft.com/office/word/2020/wordml/sdtdatahash" xmlns:w16sdtfl="http://schemas.microsoft.com/office/word/2024/wordml/sdtformatlock" xmlns:w16se="http://schemas.microsoft.com/office/word/2015/wordml/symex" xmlns:wpg="http://schemas.microsoft.com/office/word/2010/wordprocessingGroup" xmlns:wpi="http://schemas.microsoft.com/office/word/2010/wordprocessingInk" xmlns:wne="http://schemas.microsoft.com/office/word/2006/wordml" xmlns:wps="http://schemas.microsoft.com/office/word/2010/wordprocessingShape" mc:Ignorable="w14 w15 w16se w16cid w16 w16cex w16sdtdh w16sdtfl w16du wp14">
+  <w:p>
+    <w:pPr>
+      <w:pStyle w:val="Rodap"/>
+    </w:pPr>
+  </w:p>
+</w:ftr>
+</file>
+
+<file path=word/footer2.xml><?xml version="1.0" encoding="utf-8"?>
 <w:ftr xmlns:wpc="http://schemas.microsoft.com/office/word/2010/wordprocessingCanvas" xmlns:cx="http://schemas.microsoft.com/office/drawing/2014/chartex" xmlns:cx1="http://schemas.microsoft.com/office/drawing/2015/9/8/chartex" xmlns:cx2="http://schemas.microsoft.com/office/drawing/2015/10/21/chartex" xmlns:cx3="http://schemas.microsoft.com/office/drawing/2016/5/9/chartex" xmlns:cx4="http://schemas.microsoft.com/office/drawing/2016/5/10/chartex" xmlns:cx5="http://schemas.microsoft.com/office/drawing/2016/5/11/chartex" xmlns:cx6="http://schemas.microsoft.com/office/drawing/2016/5/12/chartex" xmlns:cx7="http://schemas.microsoft.com/office/drawing/2016/5/13/chartex" xmlns:cx8="http://schemas.microsoft.com/office/drawing/2016/5/14/chartex" xmlns:mc="http://schemas.openxmlformats.org/markup-compatibility/2006" xmlns:aink="http://schemas.microsoft.com/office/drawing/2016/ink" xmlns:am3d="http://schemas.microsoft.com/office/drawing/2017/model3d" xmlns:o="urn:schemas-microsoft-com:office:office" xmlns:oel="http://schemas.microsoft.com/office/2019/extlst" xmlns:r="http://schemas.openxmlformats.org/officeDocument/2006/relationships" xmlns:m="http://schemas.openxmlformats.org/officeDocument/2006/math" xmlns:v="urn:schemas-microsoft-com:vml" xmlns:wp14="http://schemas.microsoft.com/office/word/2010/wordprocessingDrawing" xmlns:wp="http://schemas.openxmlformats.org/drawingml/2006/wordprocessingDrawing" xmlns:w10="urn:schemas-microsoft-com:office:word" xmlns:w="http://schemas.openxmlformats.org/wordprocessingml/2006/main" xmlns:w14="http://schemas.microsoft.com/office/word/2010/wordml" xmlns:w15="http://schemas.microsoft.com/office/word/2012/wordml" xmlns:w16cex="http://schemas.microsoft.com/office/word/2018/wordml/cex" xmlns:w16cid="http://schemas.microsoft.com/office/word/2016/wordml/cid" xmlns:w16="http://schemas.microsoft.com/office/word/2018/wordml" xmlns:w16du="http://schemas.microsoft.com/office/word/2023/wordml/word16du" xmlns:w16sdtdh="http://schemas.microsoft.com/office/word/2020/wordml/sdtdatahash" xmlns:w16sdtfl="http://schemas.microsoft.com/office/word/2024/wordml/sdtformatlock" xmlns:w16se="http://schemas.microsoft.com/office/word/2015/wordml/symex" xmlns:wpg="http://schemas.microsoft.com/office/word/2010/wordprocessingGroup" xmlns:wpi="http://schemas.microsoft.com/office/word/2010/wordprocessingInk" xmlns:wne="http://schemas.microsoft.com/office/word/2006/wordml" xmlns:wps="http://schemas.microsoft.com/office/word/2010/wordprocessingShape" mc:Ignorable="w14 w15 w16se w16cid w16 w16cex w16sdtdh w16sdtfl w16du wp14">
   <w:p>
     <w:pPr>
@@ -32646,6 +31545,16 @@
 </w:ftr>
 </file>
 
+<file path=word/footer3.xml><?xml version="1.0" encoding="utf-8"?>
+<w:ftr xmlns:wpc="http://schemas.microsoft.com/office/word/2010/wordprocessingCanvas" xmlns:cx="http://schemas.microsoft.com/office/drawing/2014/chartex" xmlns:cx1="http://schemas.microsoft.com/office/drawing/2015/9/8/chartex" xmlns:cx2="http://schemas.microsoft.com/office/drawing/2015/10/21/chartex" xmlns:cx3="http://schemas.microsoft.com/office/drawing/2016/5/9/chartex" xmlns:cx4="http://schemas.microsoft.com/office/drawing/2016/5/10/chartex" xmlns:cx5="http://schemas.microsoft.com/office/drawing/2016/5/11/chartex" xmlns:cx6="http://schemas.microsoft.com/office/drawing/2016/5/12/chartex" xmlns:cx7="http://schemas.microsoft.com/office/drawing/2016/5/13/chartex" xmlns:cx8="http://schemas.microsoft.com/office/drawing/2016/5/14/chartex" xmlns:mc="http://schemas.openxmlformats.org/markup-compatibility/2006" xmlns:aink="http://schemas.microsoft.com/office/drawing/2016/ink" xmlns:am3d="http://schemas.microsoft.com/office/drawing/2017/model3d" xmlns:o="urn:schemas-microsoft-com:office:office" xmlns:oel="http://schemas.microsoft.com/office/2019/extlst" xmlns:r="http://schemas.openxmlformats.org/officeDocument/2006/relationships" xmlns:m="http://schemas.openxmlformats.org/officeDocument/2006/math" xmlns:v="urn:schemas-microsoft-com:vml" xmlns:wp14="http://schemas.microsoft.com/office/word/2010/wordprocessingDrawing" xmlns:wp="http://schemas.openxmlformats.org/drawingml/2006/wordprocessingDrawing" xmlns:w10="urn:schemas-microsoft-com:office:word" xmlns:w="http://schemas.openxmlformats.org/wordprocessingml/2006/main" xmlns:w14="http://schemas.microsoft.com/office/word/2010/wordml" xmlns:w15="http://schemas.microsoft.com/office/word/2012/wordml" xmlns:w16cex="http://schemas.microsoft.com/office/word/2018/wordml/cex" xmlns:w16cid="http://schemas.microsoft.com/office/word/2016/wordml/cid" xmlns:w16="http://schemas.microsoft.com/office/word/2018/wordml" xmlns:w16du="http://schemas.microsoft.com/office/word/2023/wordml/word16du" xmlns:w16sdtdh="http://schemas.microsoft.com/office/word/2020/wordml/sdtdatahash" xmlns:w16sdtfl="http://schemas.microsoft.com/office/word/2024/wordml/sdtformatlock" xmlns:w16se="http://schemas.microsoft.com/office/word/2015/wordml/symex" xmlns:wpg="http://schemas.microsoft.com/office/word/2010/wordprocessingGroup" xmlns:wpi="http://schemas.microsoft.com/office/word/2010/wordprocessingInk" xmlns:wne="http://schemas.microsoft.com/office/word/2006/wordml" xmlns:wps="http://schemas.microsoft.com/office/word/2010/wordprocessingShape" mc:Ignorable="w14 w15 w16se w16cid w16 w16cex w16sdtdh w16sdtfl w16du wp14">
+  <w:p>
+    <w:pPr>
+      <w:pStyle w:val="Rodap"/>
+    </w:pPr>
+  </w:p>
+</w:ftr>
+</file>
+
 <file path=word/footnotes.xml><?xml version="1.0" encoding="utf-8"?>
 <w:footnotes xmlns:wpc="http://schemas.microsoft.com/office/word/2010/wordprocessingCanvas" xmlns:cx="http://schemas.microsoft.com/office/drawing/2014/chartex" xmlns:cx1="http://schemas.microsoft.com/office/drawing/2015/9/8/chartex" xmlns:cx2="http://schemas.microsoft.com/office/drawing/2015/10/21/chartex" xmlns:cx3="http://schemas.microsoft.com/office/drawing/2016/5/9/chartex" xmlns:cx4="http://schemas.microsoft.com/office/drawing/2016/5/10/chartex" xmlns:cx5="http://schemas.microsoft.com/office/drawing/2016/5/11/chartex" xmlns:cx6="http://schemas.microsoft.com/office/drawing/2016/5/12/chartex" xmlns:cx7="http://schemas.microsoft.com/office/drawing/2016/5/13/chartex" xmlns:cx8="http://schemas.microsoft.com/office/drawing/2016/5/14/chartex" xmlns:mc="http://schemas.openxmlformats.org/markup-compatibility/2006" xmlns:aink="http://schemas.microsoft.com/office/drawing/2016/ink" xmlns:am3d="http://schemas.microsoft.com/office/drawing/2017/model3d" xmlns:o="urn:schemas-microsoft-com:office:office" xmlns:oel="http://schemas.microsoft.com/office/2019/extlst" xmlns:r="http://schemas.openxmlformats.org/officeDocument/2006/relationships" xmlns:m="http://schemas.openxmlformats.org/officeDocument/2006/math" xmlns:v="urn:schemas-microsoft-com:vml" xmlns:wp14="http://schemas.microsoft.com/office/word/2010/wordprocessingDrawing" xmlns:wp="http://schemas.openxmlformats.org/drawingml/2006/wordprocessingDrawing" xmlns:w10="urn:schemas-microsoft-com:office:word" xmlns:w="http://schemas.openxmlformats.org/wordprocessingml/2006/main" xmlns:w14="http://schemas.microsoft.com/office/word/2010/wordml" xmlns:w15="http://schemas.microsoft.com/office/word/2012/wordml" xmlns:w16cex="http://schemas.microsoft.com/office/word/2018/wordml/cex" xmlns:w16cid="http://schemas.microsoft.com/office/word/2016/wordml/cid" xmlns:w16="http://schemas.microsoft.com/office/word/2018/wordml" xmlns:w16du="http://schemas.microsoft.com/office/word/2023/wordml/word16du" xmlns:w16sdtdh="http://schemas.microsoft.com/office/word/2020/wordml/sdtdatahash" xmlns:w16sdtfl="http://schemas.microsoft.com/office/word/2024/wordml/sdtformatlock" xmlns:w16se="http://schemas.microsoft.com/office/word/2015/wordml/symex" xmlns:wpg="http://schemas.microsoft.com/office/word/2010/wordprocessingGroup" xmlns:wpi="http://schemas.microsoft.com/office/word/2010/wordprocessingInk" xmlns:wne="http://schemas.microsoft.com/office/word/2006/wordml" xmlns:wps="http://schemas.microsoft.com/office/word/2010/wordprocessingShape" mc:Ignorable="w14 w15 w16se w16cid w16 w16cex w16sdtdh w16sdtfl w16du wp14">
   <w:footnote w:type="separator" w:id="-1">
@@ -32666,6 +31575,16 @@
 </file>
 
 <file path=word/header1.xml><?xml version="1.0" encoding="utf-8"?>
+<w:hdr xmlns:wpc="http://schemas.microsoft.com/office/word/2010/wordprocessingCanvas" xmlns:cx="http://schemas.microsoft.com/office/drawing/2014/chartex" xmlns:cx1="http://schemas.microsoft.com/office/drawing/2015/9/8/chartex" xmlns:cx2="http://schemas.microsoft.com/office/drawing/2015/10/21/chartex" xmlns:cx3="http://schemas.microsoft.com/office/drawing/2016/5/9/chartex" xmlns:cx4="http://schemas.microsoft.com/office/drawing/2016/5/10/chartex" xmlns:cx5="http://schemas.microsoft.com/office/drawing/2016/5/11/chartex" xmlns:cx6="http://schemas.microsoft.com/office/drawing/2016/5/12/chartex" xmlns:cx7="http://schemas.microsoft.com/office/drawing/2016/5/13/chartex" xmlns:cx8="http://schemas.microsoft.com/office/drawing/2016/5/14/chartex" xmlns:mc="http://schemas.openxmlformats.org/markup-compatibility/2006" xmlns:aink="http://schemas.microsoft.com/office/drawing/2016/ink" xmlns:am3d="http://schemas.microsoft.com/office/drawing/2017/model3d" xmlns:o="urn:schemas-microsoft-com:office:office" xmlns:oel="http://schemas.microsoft.com/office/2019/extlst" xmlns:r="http://schemas.openxmlformats.org/officeDocument/2006/relationships" xmlns:m="http://schemas.openxmlformats.org/officeDocument/2006/math" xmlns:v="urn:schemas-microsoft-com:vml" xmlns:wp14="http://schemas.microsoft.com/office/word/2010/wordprocessingDrawing" xmlns:wp="http://schemas.openxmlformats.org/drawingml/2006/wordprocessingDrawing" xmlns:w10="urn:schemas-microsoft-com:office:word" xmlns:w="http://schemas.openxmlformats.org/wordprocessingml/2006/main" xmlns:w14="http://schemas.microsoft.com/office/word/2010/wordml" xmlns:w15="http://schemas.microsoft.com/office/word/2012/wordml" xmlns:w16cex="http://schemas.microsoft.com/office/word/2018/wordml/cex" xmlns:w16cid="http://schemas.microsoft.com/office/word/2016/wordml/cid" xmlns:w16="http://schemas.microsoft.com/office/word/2018/wordml" xmlns:w16du="http://schemas.microsoft.com/office/word/2023/wordml/word16du" xmlns:w16sdtdh="http://schemas.microsoft.com/office/word/2020/wordml/sdtdatahash" xmlns:w16sdtfl="http://schemas.microsoft.com/office/word/2024/wordml/sdtformatlock" xmlns:w16se="http://schemas.microsoft.com/office/word/2015/wordml/symex" xmlns:wpg="http://schemas.microsoft.com/office/word/2010/wordprocessingGroup" xmlns:wpi="http://schemas.microsoft.com/office/word/2010/wordprocessingInk" xmlns:wne="http://schemas.microsoft.com/office/word/2006/wordml" xmlns:wps="http://schemas.microsoft.com/office/word/2010/wordprocessingShape" mc:Ignorable="w14 w15 w16se w16cid w16 w16cex w16sdtdh w16sdtfl w16du wp14">
+  <w:p>
+    <w:pPr>
+      <w:pStyle w:val="Cabealho"/>
+    </w:pPr>
+  </w:p>
+</w:hdr>
+</file>
+
+<file path=word/header2.xml><?xml version="1.0" encoding="utf-8"?>
 <w:hdr xmlns:wpc="http://schemas.microsoft.com/office/word/2010/wordprocessingCanvas" xmlns:cx="http://schemas.microsoft.com/office/drawing/2014/chartex" xmlns:cx1="http://schemas.microsoft.com/office/drawing/2015/9/8/chartex" xmlns:cx2="http://schemas.microsoft.com/office/drawing/2015/10/21/chartex" xmlns:cx3="http://schemas.microsoft.com/office/drawing/2016/5/9/chartex" xmlns:cx4="http://schemas.microsoft.com/office/drawing/2016/5/10/chartex" xmlns:cx5="http://schemas.microsoft.com/office/drawing/2016/5/11/chartex" xmlns:cx6="http://schemas.microsoft.com/office/drawing/2016/5/12/chartex" xmlns:cx7="http://schemas.microsoft.com/office/drawing/2016/5/13/chartex" xmlns:cx8="http://schemas.microsoft.com/office/drawing/2016/5/14/chartex" xmlns:mc="http://schemas.openxmlformats.org/markup-compatibility/2006" xmlns:aink="http://schemas.microsoft.com/office/drawing/2016/ink" xmlns:am3d="http://schemas.microsoft.com/office/drawing/2017/model3d" xmlns:o="urn:schemas-microsoft-com:office:office" xmlns:oel="http://schemas.microsoft.com/office/2019/extlst" xmlns:r="http://schemas.openxmlformats.org/officeDocument/2006/relationships" xmlns:m="http://schemas.openxmlformats.org/officeDocument/2006/math" xmlns:v="urn:schemas-microsoft-com:vml" xmlns:wp14="http://schemas.microsoft.com/office/word/2010/wordprocessingDrawing" xmlns:wp="http://schemas.openxmlformats.org/drawingml/2006/wordprocessingDrawing" xmlns:w10="urn:schemas-microsoft-com:office:word" xmlns:w="http://schemas.openxmlformats.org/wordprocessingml/2006/main" xmlns:w14="http://schemas.microsoft.com/office/word/2010/wordml" xmlns:w15="http://schemas.microsoft.com/office/word/2012/wordml" xmlns:w16cex="http://schemas.microsoft.com/office/word/2018/wordml/cex" xmlns:w16cid="http://schemas.microsoft.com/office/word/2016/wordml/cid" xmlns:w16="http://schemas.microsoft.com/office/word/2018/wordml" xmlns:w16du="http://schemas.microsoft.com/office/word/2023/wordml/word16du" xmlns:w16sdtdh="http://schemas.microsoft.com/office/word/2020/wordml/sdtdatahash" xmlns:w16sdtfl="http://schemas.microsoft.com/office/word/2024/wordml/sdtformatlock" xmlns:w16se="http://schemas.microsoft.com/office/word/2015/wordml/symex" xmlns:wpg="http://schemas.microsoft.com/office/word/2010/wordprocessingGroup" xmlns:wpi="http://schemas.microsoft.com/office/word/2010/wordprocessingInk" xmlns:wne="http://schemas.microsoft.com/office/word/2006/wordml" xmlns:wps="http://schemas.microsoft.com/office/word/2010/wordprocessingShape" mc:Ignorable="w14 w15 w16se w16cid w16 w16cex w16sdtdh w16sdtfl w16du wp14">
   <w:p>
     <w:pPr>
@@ -32719,6 +31638,16 @@
       </w:rPr>
       <w:t xml:space="preserve"> Fiocruz Brasília   |   Diagnóstico Situacional   |   Campo Grande/MS</w:t>
     </w:r>
+  </w:p>
+</w:hdr>
+</file>
+
+<file path=word/header3.xml><?xml version="1.0" encoding="utf-8"?>
+<w:hdr xmlns:wpc="http://schemas.microsoft.com/office/word/2010/wordprocessingCanvas" xmlns:cx="http://schemas.microsoft.com/office/drawing/2014/chartex" xmlns:cx1="http://schemas.microsoft.com/office/drawing/2015/9/8/chartex" xmlns:cx2="http://schemas.microsoft.com/office/drawing/2015/10/21/chartex" xmlns:cx3="http://schemas.microsoft.com/office/drawing/2016/5/9/chartex" xmlns:cx4="http://schemas.microsoft.com/office/drawing/2016/5/10/chartex" xmlns:cx5="http://schemas.microsoft.com/office/drawing/2016/5/11/chartex" xmlns:cx6="http://schemas.microsoft.com/office/drawing/2016/5/12/chartex" xmlns:cx7="http://schemas.microsoft.com/office/drawing/2016/5/13/chartex" xmlns:cx8="http://schemas.microsoft.com/office/drawing/2016/5/14/chartex" xmlns:mc="http://schemas.openxmlformats.org/markup-compatibility/2006" xmlns:aink="http://schemas.microsoft.com/office/drawing/2016/ink" xmlns:am3d="http://schemas.microsoft.com/office/drawing/2017/model3d" xmlns:o="urn:schemas-microsoft-com:office:office" xmlns:oel="http://schemas.microsoft.com/office/2019/extlst" xmlns:r="http://schemas.openxmlformats.org/officeDocument/2006/relationships" xmlns:m="http://schemas.openxmlformats.org/officeDocument/2006/math" xmlns:v="urn:schemas-microsoft-com:vml" xmlns:wp14="http://schemas.microsoft.com/office/word/2010/wordprocessingDrawing" xmlns:wp="http://schemas.openxmlformats.org/drawingml/2006/wordprocessingDrawing" xmlns:w10="urn:schemas-microsoft-com:office:word" xmlns:w="http://schemas.openxmlformats.org/wordprocessingml/2006/main" xmlns:w14="http://schemas.microsoft.com/office/word/2010/wordml" xmlns:w15="http://schemas.microsoft.com/office/word/2012/wordml" xmlns:w16cex="http://schemas.microsoft.com/office/word/2018/wordml/cex" xmlns:w16cid="http://schemas.microsoft.com/office/word/2016/wordml/cid" xmlns:w16="http://schemas.microsoft.com/office/word/2018/wordml" xmlns:w16du="http://schemas.microsoft.com/office/word/2023/wordml/word16du" xmlns:w16sdtdh="http://schemas.microsoft.com/office/word/2020/wordml/sdtdatahash" xmlns:w16sdtfl="http://schemas.microsoft.com/office/word/2024/wordml/sdtformatlock" xmlns:w16se="http://schemas.microsoft.com/office/word/2015/wordml/symex" xmlns:wpg="http://schemas.microsoft.com/office/word/2010/wordprocessingGroup" xmlns:wpi="http://schemas.microsoft.com/office/word/2010/wordprocessingInk" xmlns:wne="http://schemas.microsoft.com/office/word/2006/wordml" xmlns:wps="http://schemas.microsoft.com/office/word/2010/wordprocessingShape" mc:Ignorable="w14 w15 w16se w16cid w16 w16cex w16sdtdh w16sdtfl w16du wp14">
+  <w:p>
+    <w:pPr>
+      <w:pStyle w:val="Cabealho"/>
+    </w:pPr>
   </w:p>
 </w:hdr>
 </file>
@@ -33774,4 +32703,43 @@
   <a:objectDefaults/>
   <a:extraClrSchemeLst/>
 </a:theme>
+</file>
+
+<file path=word/webextensions/taskpanes.xml><?xml version="1.0" encoding="utf-8"?>
+<wetp:taskpanes xmlns:wetp="http://schemas.microsoft.com/office/webextensions/taskpanes/2010/11">
+  <wetp:taskpane dockstate="right" visibility="0" width="525" row="5">
+    <wetp:webextensionref xmlns:r="http://schemas.openxmlformats.org/officeDocument/2006/relationships" r:id="rId1"/>
+  </wetp:taskpane>
+  <wetp:taskpane dockstate="right" visibility="0" width="525" row="6">
+    <wetp:webextensionref xmlns:r="http://schemas.openxmlformats.org/officeDocument/2006/relationships" r:id="rId2"/>
+  </wetp:taskpane>
+</wetp:taskpanes>
+</file>
+
+<file path=word/webextensions/webextension1.xml><?xml version="1.0" encoding="utf-8"?>
+<we:webextension xmlns:we="http://schemas.microsoft.com/office/webextensions/webextension/2010/11" id="{6908AE5F-C913-40B3-9ABF-3DD5AB7D1265}">
+  <we:reference id="WA200010725" version="1.0.0.1" store="Omex" storeType="OMEX"/>
+  <we:alternateReferences>
+    <we:reference id="WA200010725" version="1.0.0.1" store="WA200010725" storeType="OMEX"/>
+  </we:alternateReferences>
+  <we:properties>
+    <we:property name="claude.fileId" value="&quot;d1ede30a-17f3-4723-b642-1590db51d871&quot;"/>
+  </we:properties>
+  <we:bindings/>
+  <we:snapshot xmlns:r="http://schemas.openxmlformats.org/officeDocument/2006/relationships"/>
+</we:webextension>
+</file>
+
+<file path=word/webextensions/webextension2.xml><?xml version="1.0" encoding="utf-8"?>
+<we:webextension xmlns:we="http://schemas.microsoft.com/office/webextensions/webextension/2010/11" id="{DC8CA568-F7F3-48CB-8185-5D43A539E479}">
+  <we:reference id="WA200010453" version="1.0.0.1" store="Omex" storeType="OMEX"/>
+  <we:alternateReferences>
+    <we:reference id="WA200010453" version="1.0.0.1" store="WA200010453" storeType="OMEX"/>
+  </we:alternateReferences>
+  <we:properties>
+    <we:property name="claude.fileId" value="&quot;0efe5765-0a37-4238-bbd8-69fa9ae55702&quot;"/>
+  </we:properties>
+  <we:bindings/>
+  <we:snapshot xmlns:r="http://schemas.openxmlformats.org/officeDocument/2006/relationships"/>
+</we:webextension>
 </file>
</xml_diff>

<commit_message>
Diagnóstico de Campo Grande/MS: nova revisão (4 fatores e notas metodológicas)
Co-Authored-By: Claude Opus 5.5 <noreply@anthropic.com>
Claude-Session: https://claude.ai/code/session_01DaExKAnWXMvYMevoj2HpBX
</commit_message>
<xml_diff>
--- a/territorios/fontes/Diagnostico_Situacional_CampoGrande_MS_Matriz_v1.0.2.docx
+++ b/territorios/fontes/Diagnostico_Situacional_CampoGrande_MS_Matriz_v1.0.2.docx
@@ -1665,7 +1665,10 @@
       </w:r>
       <w:proofErr w:type="spellEnd"/>
       <w:r>
-        <w:t>), e a concentração da massa salarial nas faixas mais altas indicam que o preço dos alimentos pesa desproporcionalmente sobre as famílias inscritas no CadÚnico. O fator relaciona-se a E1-F06 e E1-F24 e tem como desfecho sanitário E2-F02, devendo o plano popular priorizar a produção de dados intraurbanos por meio do SISVAN e do Cadastro Único.</w:t>
+        <w:t>), e a concentração da massa salarial nas faixas mais altas indicam que o preço dos alimentos pesa desproporcionalmente sobre as famílias inscritas no CadÚnico. O fator relaciona-se a E1-F06 e E1-F24 e tem como desfecho sanitário E2-F02</w:t>
+      </w:r>
+      <w:r>
+        <w:t>.</w:t>
       </w:r>
     </w:p>
     <w:tbl>
@@ -1835,11 +1838,11 @@
         <w:jc w:val="both"/>
       </w:pPr>
       <w:r>
-        <w:t xml:space="preserve">A agricultura familiar no município concentra-se em assentamentos de reforma agrária e pequenas propriedades do cinturão rural, que ocupa a maior parte dos 8.082,33 km² do território (IBGE), mas tem participação marginal na estrutura econômica dominada pela pecuária extensiva e pela lavoura empresarial </w:t>
+        <w:t xml:space="preserve">A agricultura familiar no município concentra-se em assentamentos de reforma agrária e pequenas propriedades do cinturão rural, que ocupa a maior parte dos 8.082,33 km² do território (IBGE), mas tem participação marginal na estrutura econômica dominada pela pecuária extensiva e pela lavoura empresarial de grãos. O Censo Agropecuário 2017 do IBGE é a fonte disponível para dimensionar estabelecimentos </w:t>
       </w:r>
       <w:r>
         <w:lastRenderedPageBreak/>
-        <w:t>de grãos. O Censo Agropecuário 2017 do IBGE é a fonte disponível para dimensionar estabelecimentos familiares e deve ser confrontado com os registros do Cadastro Nacional da Agricultura Familiar. O fortalecimento da agricultura familiar condiciona E1-F06 e E1-F26 e reduz a dependência de cadeias longas vulneráveis a choques de preço (E1-F24) e a eventos climáticos como os registrados em 2024 e 2026 (E2-F30, E2-F17).</w:t>
+        <w:t>familiares e deve ser confrontado com os registros do Cadastro Nacional da Agricultura Familiar. O fortalecimento da agricultura familiar condiciona E1-F06 e E1-F26 e reduz a dependência de cadeias longas vulneráveis a choques de preço (E1-F24) e a eventos climáticos como os registrados em 2024 e 2026 (E2-F30, E2-F17).</w:t>
       </w:r>
     </w:p>
     <w:tbl>
@@ -10928,10 +10931,21 @@
         <w:jc w:val="both"/>
       </w:pPr>
       <w:r>
-        <w:t>Rotas de fuga para evacuação em caso de enchente, ventos extremos ou rompimento de barragem não estão definidas nem sinalizadas nos bairros de Campo Grande, segundo a informação pública disponível, o que configura lacuna de preparação a ser confirmada junto à Defesa Civil municipal.</w:t>
-      </w:r>
-      <w:r>
-        <w:t xml:space="preserve"> A relevância do fator é concreta para as populações a jusante de barragens urbanas classificadas como de risco: o barramento do antigo Clube Atlântico possui classificação de risco alto e dano potencial associado alto no Relatório de Segurança de Barragens 2024-2025 da ANA, com cerca de 100 moradores a jusante, e o Lago do Amor e o Lageado constam de relatório do Imasul sobre barragens urbanas. O fator articula-se a E2-F33, E2-F39 e E5-F02, e a cartografia social é o instrumento adequado para traçar rotas com os moradores, considerando idosos, pessoas com deficiência e crianças (E3-F09, E3-F11).</w:t>
+        <w:t xml:space="preserve">Rotas de fuga para evacuação em caso de enchente, ventos extremos ou rompimento de barragem não estão definidas nem sinalizadas nos bairros de Campo Grande, segundo a informação pública </w:t>
+      </w:r>
+      <w:proofErr w:type="spellStart"/>
+      <w:r>
+        <w:t>disponível</w:t>
+      </w:r>
+      <w:r>
+        <w:t>.</w:t>
+      </w:r>
+      <w:r>
+        <w:t>A</w:t>
+      </w:r>
+      <w:proofErr w:type="spellEnd"/>
+      <w:r>
+        <w:t xml:space="preserve"> relevância do fator é concreta para as populações a jusante de barragens urbanas classificadas como de risco: o barramento do antigo Clube Atlântico possui classificação de risco alto e dano potencial associado alto no Relatório de Segurança de Barragens 2024-2025 da ANA, com cerca de 100 moradores a jusante, e o Lago do Amor e o Lageado constam de relatório do Imasul sobre barragens urbanas. O fator articula-se a E2-F33, E2-F39 e E5-F02, e a cartografia social é o instrumento adequado para traçar rotas com os moradores, considerando idosos, pessoas com deficiência e crianças (E3-F09, E3-F11).</w:t>
       </w:r>
     </w:p>
     <w:tbl>
@@ -11279,11 +11293,11 @@
       </w:r>
       <w:proofErr w:type="spellEnd"/>
       <w:r>
-        <w:t xml:space="preserve">-MS e do Tribunal de Justiça, mantém Mato Grosso do Sul entre os estados com taxas elevadas de feminicídio segundo o Anuário Brasileiro de Segurança Pública </w:t>
+        <w:t xml:space="preserve">-MS e do Tribunal de Justiça, mantém Mato Grosso do Sul entre os estados com taxas elevadas de feminicídio segundo o Anuário Brasileiro de Segurança Pública (E3-F02). As notificações de violência interpessoal e autoprovocada no SINAN, o SIM por causas externas </w:t>
       </w:r>
       <w:r>
         <w:lastRenderedPageBreak/>
-        <w:t>(E3-F02). As notificações de violência interpessoal e autoprovocada no SINAN, o SIM por causas externas e os registros policiais devem ser cruzados por região de residência, raça e sexo. A violência produz efeitos sobre saúde mental (E2-F18), uso de substâncias (E2-F10) e acesso a serviços. O fator articula-se a E2-F27, E6-F06 e E3-F16 e exige abordagem intersetorial de prevenção.</w:t>
+        <w:t>e os registros policiais devem ser cruzados por região de residência, raça e sexo. A violência produz efeitos sobre saúde mental (E2-F18), uso de substâncias (E2-F10) e acesso a serviços. O fator articula-se a E2-F27, E6-F06 e E3-F16 e exige abordagem intersetorial de prevenção.</w:t>
       </w:r>
     </w:p>
     <w:tbl>
@@ -14267,7 +14281,7 @@
         <w:t xml:space="preserve">A propriedade e o controle da terra pelas mulheres em Campo Grande devem ser analisados em duas escalas. Na zona rural e nos assentamentos de reforma agrária, a titulação conjunta ou preferencial às mulheres, prevista na legislação agrária, deve ser verificada nos registros do INCRA. Na zona urbana, a regularização fundiária de núcleos informais e os programas habitacionais podem priorizar a titulação em nome das mulheres, conforme a Lei nº 13.465/2017 e as regras dos programas federais de habitação de interesse </w:t>
       </w:r>
       <w:r>
-        <w:t>social. A ausência de dados municipais desagregados por sexo sobre titularidade de imóveis regularizados constitui lacuna. A</w:t>
+        <w:t>social. A</w:t>
       </w:r>
       <w:r>
         <w:t xml:space="preserve"> titularidade feminina reduz a vulnerabilidade em situações de violência doméstica (E3-F02) e separação, e amplia o acesso a crédito (E1-F22). O fator articula-se a E5-F22 e E3-F19, e o plano popular deve incluir a perspectiva de gênero nos processos de regularização fundiária.</w:t>
@@ -14440,11 +14454,11 @@
         <w:jc w:val="both"/>
       </w:pPr>
       <w:r>
-        <w:t xml:space="preserve">A coordenação de políticas para igualdade de gênero em Campo Grande envolve a Subsecretaria municipal de Políticas para as Mulheres, as secretarias de Saúde, Assistência Social e Educação, a Casa da Mulher Brasileira e o sistema de justiça. A existência de equipamentos de referência não garante, por si, coerência </w:t>
+        <w:t xml:space="preserve">A coordenação de políticas para igualdade de gênero em Campo Grande envolve a Subsecretaria municipal de Políticas para as Mulheres, as secretarias de Saúde, Assistência Social e Educação, a Casa da Mulher Brasileira e o sistema de justiça. A existência de equipamentos de referência não garante, por si, coerência entre políticas: a notificação de violência na APS nem sempre resulta em acompanhamento pela assistência </w:t>
       </w:r>
       <w:r>
         <w:lastRenderedPageBreak/>
-        <w:t>entre políticas: a notificação de violência na APS nem sempre resulta em acompanhamento pela assistência social, e programas de geração de renda nem sempre se articulam à oferta de creche. O plano municipal de políticas para mulheres e o Conselho Municipal dos Direitos da Mulher são os instrumentos de coordenação, e sua vigência, metas e execução orçamentária devem ser verificadas para o diagnóstico. O fator articula-se a E3-F02, E3-F04 e E6-F07, e a avaliação deve se basear em fluxos efetivos de atendimento e não apenas na existência formal de serviços.</w:t>
+        <w:t>social, e programas de geração de renda nem sempre se articulam à oferta de creche. O plano municipal de políticas para mulheres e o Conselho Municipal dos Direitos da Mulher são os instrumentos de coordenação, e sua vigência, metas e execução orçamentária devem ser verificadas para o diagnóstico. O fator articula-se a E3-F02, E3-F04 e E6-F07, e a avaliação deve se basear em fluxos efetivos de atendimento e não apenas na existência formal de serviços.</w:t>
       </w:r>
     </w:p>
     <w:tbl>
@@ -14617,7 +14631,7 @@
         <w:t>O tráfico de pessoas tem relevância regional para Campo Grande em razão da posição do estado na fronteira com Paraguai e Bolívia e da circulação de migrantes, trabalhadores sazonais e populações indígenas. As modalidades de maior risco são a exploração sexual, o trabalho em condições análogas às de escravidão (E1-F15) e o aliciamento de adolescentes. O Núcleo de Enfrentamento ao Tráfico de Pessoas do estado e a Polícia Federal concentram as investigações, mas a subnotificação é estrutural. A presença de 17,1% de estrangeiros entre as pessoas em situação de rua recenseadas em 2025 (GT-PSR) indica grupo exposto a redes de exploração</w:t>
       </w:r>
       <w:r>
-        <w:t>. Na ausência de dados municipais sistematizados, o fator é tratado como lacuna de informação e risco provável. Articula</w:t>
+        <w:t>. Articula</w:t>
       </w:r>
       <w:r>
         <w:t>-se a E3-F13 e E3-F14, e as equipes de APS, Consultório na Rua e assistência social devem ser capacitadas para reconhecer sinais de tráfico e acionar a rede de proteção.</w:t>
@@ -30718,24 +30732,6 @@
         <w:keepNext/>
         <w:spacing w:before="240" w:after="100"/>
       </w:pPr>
-      <w:r>
-        <w:rPr>
-          <w:highlight w:val="yellow"/>
-        </w:rPr>
-        <w:t>Principais lacunas de informação</w:t>
-      </w:r>
-    </w:p>
-    <w:p>
-      <w:pPr>
-        <w:spacing w:before="60" w:after="120" w:line="276" w:lineRule="auto"/>
-        <w:jc w:val="both"/>
-      </w:pPr>
-      <w:r>
-        <w:rPr>
-          <w:highlight w:val="yellow"/>
-        </w:rPr>
-        <w:t>Constituem lacunas por consulta direta às bases: séries municipais do SIM, SINASC e SINAN para mortalidade materna, neonatal e por causas externas e para agravos transmissíveis; estrutura etária, pessoas com deficiência, características do entorno dos domicílios e acesso à internet do Censo 2022 por setor censitário; famílias no CadÚnico e no Bolsa Família por território (VIS Data/MDS); cobertura e uso da terra e focos de calor no município (MapBiomas, PRODES, Programa Queimadas); registros de desastres no S2iD; inventário de barragens no SNISB; indicadores do VIGITEL para a capital; matrículas e indicadores docentes do Censo Escolar por escola; execução orçamentária por função (SIOPS e portal de transparência); e inventário comunitário de organizações, rádios, grupos de mensagens, hortas e pontos de risco, a ser produzido pela cartografia social.</w:t>
-      </w:r>
     </w:p>
     <w:p>
       <w:pPr>
@@ -31377,7 +31373,6 @@
                 <w:sz w:val="19"/>
                 <w:szCs w:val="19"/>
               </w:rPr>
-              <w:lastRenderedPageBreak/>
               <w:t>Eixo 6</w:t>
             </w:r>
           </w:p>

</xml_diff>